<commit_message>
fix(ecud,docs): limpiar nombres de servidores, metadatos y sincronizar rutas de variantes en documentacion
</commit_message>
<xml_diff>
--- a/TI.1.1. PAO202651_SOAP_JAVA_SINBDD_NRC36884_GR09/01. UML/02. ECUD/ECUD_SOAP_JAVA_SINBDD_GR09.docx
+++ b/TI.1.1. PAO202651_SOAP_JAVA_SINBDD_NRC36884_GR09/01. UML/02. ECUD/ECUD_SOAP_JAVA_SINBDD_GR09.docx
@@ -58,12 +58,7 @@
         <w:jc w:val="center"/>
       </w:pPr>
       <w:r>
-        <w:rPr>
-          <w:rFonts w:ascii="Arial" w:eastAsia="Arial" w:hAnsi="Arial" w:cs="Arial"/>
-          <w:b/>
-          <w:sz w:val="28"/>
-        </w:rPr>
-        <w:t>Autores</w:t>
+        <w:t>Autor:</w:t>
       </w:r>
     </w:p>
     <w:p>
@@ -169,13 +164,7 @@
         <w:ind w:left="-5" w:hanging="10"/>
       </w:pPr>
       <w:r>
-        <w:rPr>
-          <w:rFonts w:ascii="Arial" w:eastAsia="Arial" w:hAnsi="Arial" w:cs="Arial"/>
-          <w:b/>
-          <w:sz w:val="36"/>
-        </w:rPr>
-        <w:lastRenderedPageBreak/>
-        <w:t xml:space="preserve">ESPECIFICACIÓN DE CASOS DE USO DETALLADA SISTEMA DE CONVERSIO DE UNIDADES </w:t>
+        <w:t xml:space="preserve">ESPECIFICACIÓN DE CASOS DE USO DETALLADA SISTEMA DE CONVERSIÓN DE UNIDADES </w:t>
       </w:r>
     </w:p>
     <w:p>
@@ -948,6 +937,48 @@
             </w:tcBorders>
           </w:tcPr>
           <w:p>
+            <w:r>
+              <w:t>Permite al usuario autenticarse en el sistema enviando sus credenciales fijas al servicio SOAP ServicioAutenticacion (login(usuario, contrasenia)). Si son correctas, el sistema genera un token UUID, lo almacena en memoria RAM volátil (SINBDD) y lo retorna en la respuesta SOAP para ser usado en las solicitudes de conversión.</w:t>
+            </w:r>
+          </w:p>
+        </w:tc>
+      </w:tr>
+      <w:tr>
+        <w:trPr>
+          <w:trHeight w:val="878"/>
+        </w:trPr>
+        <w:tc>
+          <w:tcPr>
+            <w:tcW w:w="3386" w:type="dxa"/>
+            <w:tcBorders>
+              <w:top w:val="single" w:sz="5" w:space="0" w:color="000000"/>
+              <w:left w:val="single" w:sz="5" w:space="0" w:color="000000"/>
+              <w:bottom w:val="single" w:sz="5" w:space="0" w:color="000000"/>
+              <w:right w:val="single" w:sz="5" w:space="0" w:color="000000"/>
+            </w:tcBorders>
+            <w:shd w:val="clear" w:color="auto" w:fill="BDD7EE"/>
+          </w:tcPr>
+          <w:p>
+            <w:r>
+              <w:rPr>
+                <w:rFonts w:ascii="Arial" w:eastAsia="Arial" w:hAnsi="Arial" w:cs="Arial"/>
+                <w:b/>
+              </w:rPr>
+              <w:t xml:space="preserve">Meta: </w:t>
+            </w:r>
+          </w:p>
+        </w:tc>
+        <w:tc>
+          <w:tcPr>
+            <w:tcW w:w="5636" w:type="dxa"/>
+            <w:tcBorders>
+              <w:top w:val="single" w:sz="5" w:space="0" w:color="000000"/>
+              <w:left w:val="single" w:sz="5" w:space="0" w:color="000000"/>
+              <w:bottom w:val="single" w:sz="5" w:space="0" w:color="000000"/>
+              <w:right w:val="single" w:sz="5" w:space="0" w:color="000000"/>
+            </w:tcBorders>
+          </w:tcPr>
+          <w:p>
             <w:pPr>
               <w:ind w:left="3"/>
             </w:pPr>
@@ -955,14 +986,14 @@
               <w:rPr>
                 <w:rFonts w:ascii="Arial" w:eastAsia="Arial" w:hAnsi="Arial" w:cs="Arial"/>
               </w:rPr>
-              <w:t xml:space="preserve">Permite al usuario autenticarse en el sistema enviando sus credenciales al servicio SOAP ServicioAutenticacion (login(usuario, contrasenia)). Si son correctas, el sistema genera un token UUID, lo almacena en memoria y lo retorna al cliente para ser usado en las solicitudes de conversión. </w:t>
-            </w:r>
-          </w:p>
-        </w:tc>
-      </w:tr>
-      <w:tr>
-        <w:trPr>
-          <w:trHeight w:val="878"/>
+              <w:t xml:space="preserve">El usuario obtiene un token UUID válido que deberá incluir en el campo 'token' de cada solicitud de conversión posterior. </w:t>
+            </w:r>
+          </w:p>
+        </w:tc>
+      </w:tr>
+      <w:tr>
+        <w:trPr>
+          <w:trHeight w:val="480"/>
         </w:trPr>
         <w:tc>
           <w:tcPr>
@@ -981,7 +1012,7 @@
                 <w:rFonts w:ascii="Arial" w:eastAsia="Arial" w:hAnsi="Arial" w:cs="Arial"/>
                 <w:b/>
               </w:rPr>
-              <w:t xml:space="preserve">Meta: </w:t>
+              <w:t xml:space="preserve">Estado: </w:t>
             </w:r>
           </w:p>
         </w:tc>
@@ -1003,7 +1034,7 @@
               <w:rPr>
                 <w:rFonts w:ascii="Arial" w:eastAsia="Arial" w:hAnsi="Arial" w:cs="Arial"/>
               </w:rPr>
-              <w:t xml:space="preserve">El usuario obtiene un token UUID válido que deberá incluir en el campo 'token' de cada solicitud de conversión posterior. </w:t>
+              <w:t xml:space="preserve">Activo </w:t>
             </w:r>
           </w:p>
         </w:tc>
@@ -1029,7 +1060,7 @@
                 <w:rFonts w:ascii="Arial" w:eastAsia="Arial" w:hAnsi="Arial" w:cs="Arial"/>
                 <w:b/>
               </w:rPr>
-              <w:t xml:space="preserve">Estado: </w:t>
+              <w:t xml:space="preserve">Versión: </w:t>
             </w:r>
           </w:p>
         </w:tc>
@@ -1051,7 +1082,7 @@
               <w:rPr>
                 <w:rFonts w:ascii="Arial" w:eastAsia="Arial" w:hAnsi="Arial" w:cs="Arial"/>
               </w:rPr>
-              <w:t xml:space="preserve">Activo </w:t>
+              <w:t xml:space="preserve">1.0 </w:t>
             </w:r>
           </w:p>
         </w:tc>
@@ -1077,7 +1108,7 @@
                 <w:rFonts w:ascii="Arial" w:eastAsia="Arial" w:hAnsi="Arial" w:cs="Arial"/>
                 <w:b/>
               </w:rPr>
-              <w:t xml:space="preserve">Versión: </w:t>
+              <w:t xml:space="preserve">Autor(es): </w:t>
             </w:r>
           </w:p>
         </w:tc>
@@ -1092,14 +1123,8 @@
             </w:tcBorders>
           </w:tcPr>
           <w:p>
-            <w:pPr>
-              <w:ind w:left="3"/>
-            </w:pPr>
-            <w:r>
-              <w:rPr>
-                <w:rFonts w:ascii="Arial" w:eastAsia="Arial" w:hAnsi="Arial" w:cs="Arial"/>
-              </w:rPr>
-              <w:t xml:space="preserve">1.0 </w:t>
+            <w:r>
+              <w:t>Julio Enrique Viche Castillo (GR09)</w:t>
             </w:r>
           </w:p>
         </w:tc>
@@ -1125,7 +1150,7 @@
                 <w:rFonts w:ascii="Arial" w:eastAsia="Arial" w:hAnsi="Arial" w:cs="Arial"/>
                 <w:b/>
               </w:rPr>
-              <w:t xml:space="preserve">Autor(es): </w:t>
+              <w:t xml:space="preserve">Fecha creación: </w:t>
             </w:r>
           </w:p>
         </w:tc>
@@ -1140,14 +1165,8 @@
             </w:tcBorders>
           </w:tcPr>
           <w:p>
-            <w:pPr>
-              <w:ind w:left="3"/>
-            </w:pPr>
-            <w:r>
-              <w:rPr>
-                <w:rFonts w:ascii="Arial" w:eastAsia="Arial" w:hAnsi="Arial" w:cs="Arial"/>
-              </w:rPr>
-              <w:t xml:space="preserve">Julio Enrique Viche Castillo (GR09) </w:t>
+            <w:r>
+              <w:t>28/10/2026</w:t>
             </w:r>
           </w:p>
         </w:tc>
@@ -1173,7 +1192,7 @@
                 <w:rFonts w:ascii="Arial" w:eastAsia="Arial" w:hAnsi="Arial" w:cs="Arial"/>
                 <w:b/>
               </w:rPr>
-              <w:t xml:space="preserve">Fecha creación: </w:t>
+              <w:t xml:space="preserve">Fecha modificación: </w:t>
             </w:r>
           </w:p>
         </w:tc>
@@ -1188,21 +1207,15 @@
             </w:tcBorders>
           </w:tcPr>
           <w:p>
-            <w:pPr>
-              <w:ind w:left="3"/>
-            </w:pPr>
-            <w:r>
-              <w:rPr>
-                <w:rFonts w:ascii="Arial" w:eastAsia="Arial" w:hAnsi="Arial" w:cs="Arial"/>
-              </w:rPr>
-              <w:t xml:space="preserve">28/10/2026 </w:t>
-            </w:r>
-          </w:p>
-        </w:tc>
-      </w:tr>
-      <w:tr>
-        <w:trPr>
-          <w:trHeight w:val="480"/>
+            <w:r>
+              <w:t>28/10/2026</w:t>
+            </w:r>
+          </w:p>
+        </w:tc>
+      </w:tr>
+      <w:tr>
+        <w:trPr>
+          <w:trHeight w:val="1140"/>
         </w:trPr>
         <w:tc>
           <w:tcPr>
@@ -1221,7 +1234,7 @@
                 <w:rFonts w:ascii="Arial" w:eastAsia="Arial" w:hAnsi="Arial" w:cs="Arial"/>
                 <w:b/>
               </w:rPr>
-              <w:t xml:space="preserve">Fecha modificación: </w:t>
+              <w:t xml:space="preserve">Datos de entrada: </w:t>
             </w:r>
           </w:p>
         </w:tc>
@@ -1236,21 +1249,19 @@
             </w:tcBorders>
           </w:tcPr>
           <w:p>
-            <w:pPr>
-              <w:ind w:left="3"/>
-            </w:pPr>
-            <w:r>
-              <w:rPr>
-                <w:rFonts w:ascii="Arial" w:eastAsia="Arial" w:hAnsi="Arial" w:cs="Arial"/>
-              </w:rPr>
-              <w:t xml:space="preserve">28/10/2026 </w:t>
-            </w:r>
-          </w:p>
-        </w:tc>
-      </w:tr>
-      <w:tr>
-        <w:trPr>
-          <w:trHeight w:val="1140"/>
+            <w:r>
+              <w:t>usuario: nombre de usuario ("MONSTER")</w:t>
+              <w:br/>
+              <w:t>contrasenia: clave de acceso ("MONSTER9")</w:t>
+              <w:br/>
+              <w:t>Credenciales maestras fijas: usuario = MONSTER, contrasenia = MONSTER9</w:t>
+            </w:r>
+          </w:p>
+        </w:tc>
+      </w:tr>
+      <w:tr>
+        <w:trPr>
+          <w:trHeight w:val="914"/>
         </w:trPr>
         <w:tc>
           <w:tcPr>
@@ -1269,7 +1280,7 @@
                 <w:rFonts w:ascii="Arial" w:eastAsia="Arial" w:hAnsi="Arial" w:cs="Arial"/>
                 <w:b/>
               </w:rPr>
-              <w:t xml:space="preserve">Datos de entrada: </w:t>
+              <w:t xml:space="preserve">Precondiciones: </w:t>
             </w:r>
           </w:p>
         </w:tc>
@@ -1284,44 +1295,17 @@
             </w:tcBorders>
           </w:tcPr>
           <w:p>
-            <w:pPr>
-              <w:ind w:left="3"/>
-            </w:pPr>
-            <w:r>
-              <w:rPr>
-                <w:rFonts w:ascii="Arial" w:eastAsia="Arial" w:hAnsi="Arial" w:cs="Arial"/>
-              </w:rPr>
-              <w:t xml:space="preserve">from: nombre de usuario (credencial) </w:t>
-            </w:r>
-          </w:p>
-          <w:p>
-            <w:pPr>
-              <w:ind w:left="3"/>
-            </w:pPr>
-            <w:r>
-              <w:rPr>
-                <w:rFonts w:ascii="Arial" w:eastAsia="Arial" w:hAnsi="Arial" w:cs="Arial"/>
-              </w:rPr>
-              <w:t xml:space="preserve">to: contraseña (credencial) </w:t>
-            </w:r>
-          </w:p>
-          <w:p>
-            <w:pPr>
-              <w:ind w:left="3"/>
-              <w:jc w:val="both"/>
-            </w:pPr>
-            <w:r>
-              <w:rPr>
-                <w:rFonts w:ascii="Arial" w:eastAsia="Arial" w:hAnsi="Arial" w:cs="Arial"/>
-              </w:rPr>
-              <w:t xml:space="preserve">Credenciales válidas del sistema: usuario = MONSTER, contraseña = MONSTER9 </w:t>
-            </w:r>
-          </w:p>
-        </w:tc>
-      </w:tr>
-      <w:tr>
-        <w:trPr>
-          <w:trHeight w:val="914"/>
+            <w:r>
+              <w:t>El servidor SOAP (ServidorSOAP en Payara Server) debe estar desplegado y accesible en http://localhost:8080/ServidorSOAP.</w:t>
+              <w:br/>
+              <w:t>El usuario debe conocer sus credenciales de acceso.</w:t>
+            </w:r>
+          </w:p>
+        </w:tc>
+      </w:tr>
+      <w:tr>
+        <w:trPr>
+          <w:trHeight w:val="1640"/>
         </w:trPr>
         <w:tc>
           <w:tcPr>
@@ -1340,7 +1324,7 @@
                 <w:rFonts w:ascii="Arial" w:eastAsia="Arial" w:hAnsi="Arial" w:cs="Arial"/>
                 <w:b/>
               </w:rPr>
-              <w:t xml:space="preserve">Precondiciones: </w:t>
+              <w:t xml:space="preserve">Postcondiciones: </w:t>
             </w:r>
           </w:p>
         </w:tc>
@@ -1355,97 +1339,10 @@
             </w:tcBorders>
           </w:tcPr>
           <w:p>
-            <w:pPr>
-              <w:numPr>
-                <w:ilvl w:val="0"/>
-                <w:numId w:val="1"/>
-              </w:numPr>
-              <w:spacing w:after="41" w:line="238" w:lineRule="auto"/>
-            </w:pPr>
-            <w:r>
-              <w:rPr>
-                <w:rFonts w:ascii="Arial" w:eastAsia="Arial" w:hAnsi="Arial" w:cs="Arial"/>
-              </w:rPr>
-              <w:t xml:space="preserve">El servidor WS_CONV_UNI_RESTFULL_JAVA debe estar desplegado y accesible. </w:t>
-            </w:r>
-          </w:p>
-          <w:p>
-            <w:pPr>
-              <w:numPr>
-                <w:ilvl w:val="0"/>
-                <w:numId w:val="1"/>
-              </w:numPr>
-            </w:pPr>
-            <w:r>
-              <w:rPr>
-                <w:rFonts w:ascii="Arial" w:eastAsia="Arial" w:hAnsi="Arial" w:cs="Arial"/>
-              </w:rPr>
-              <w:t xml:space="preserve">El usuario debe conocer sus credenciales de acceso. </w:t>
-            </w:r>
-          </w:p>
-        </w:tc>
-      </w:tr>
-      <w:tr>
-        <w:trPr>
-          <w:trHeight w:val="1640"/>
-        </w:trPr>
-        <w:tc>
-          <w:tcPr>
-            <w:tcW w:w="3386" w:type="dxa"/>
-            <w:tcBorders>
-              <w:top w:val="single" w:sz="5" w:space="0" w:color="000000"/>
-              <w:left w:val="single" w:sz="5" w:space="0" w:color="000000"/>
-              <w:bottom w:val="single" w:sz="5" w:space="0" w:color="000000"/>
-              <w:right w:val="single" w:sz="5" w:space="0" w:color="000000"/>
-            </w:tcBorders>
-            <w:shd w:val="clear" w:color="auto" w:fill="BDD7EE"/>
-          </w:tcPr>
-          <w:p>
-            <w:r>
-              <w:rPr>
-                <w:rFonts w:ascii="Arial" w:eastAsia="Arial" w:hAnsi="Arial" w:cs="Arial"/>
-                <w:b/>
-              </w:rPr>
-              <w:t xml:space="preserve">Postcondiciones: </w:t>
-            </w:r>
-          </w:p>
-        </w:tc>
-        <w:tc>
-          <w:tcPr>
-            <w:tcW w:w="5636" w:type="dxa"/>
-            <w:tcBorders>
-              <w:top w:val="single" w:sz="5" w:space="0" w:color="000000"/>
-              <w:left w:val="single" w:sz="5" w:space="0" w:color="000000"/>
-              <w:bottom w:val="single" w:sz="5" w:space="0" w:color="000000"/>
-              <w:right w:val="single" w:sz="5" w:space="0" w:color="000000"/>
-            </w:tcBorders>
-          </w:tcPr>
-          <w:p>
-            <w:pPr>
-              <w:numPr>
-                <w:ilvl w:val="0"/>
-                <w:numId w:val="2"/>
-              </w:numPr>
-              <w:spacing w:after="1"/>
-              <w:ind w:right="16"/>
-            </w:pPr>
-            <w:r>
-              <w:rPr>
-                <w:rFonts w:ascii="Arial" w:eastAsia="Arial" w:hAnsi="Arial" w:cs="Arial"/>
-              </w:rPr>
-              <w:t xml:space="preserve">Éxito: el sistema genera un token UUID, lo almacena en memoria y responde con success = true y message: "Bienvenido al sistema." </w:t>
-            </w:r>
-          </w:p>
-          <w:p>
-            <w:pPr>
-              <w:numPr>
-                <w:ilvl w:val="0"/>
-                <w:numId w:val="2"/>
-              </w:numPr>
-              <w:ind w:right="16"/>
-            </w:pPr>
-            <w:r>
-              <w:t xml:space="preserve">Fallo: el sistema NO genera token, responde con SOAP Fault / SOAP Fault / HTTP 401 y message: "Usuario o clave fallidos, intenta de nuevo." </w:t>
+            <w:r>
+              <w:t>Éxito: el sistema genera un token UUID, lo almacena en memoria y responde con success = true y message: "Bienvenido al sistema."</w:t>
+              <w:br/>
+              <w:t>Fallo: el sistema NO genera token, responde con SOAP Fault (código 401) y message: "Usuario o clave fallidos, intenta de nuevo."</w:t>
             </w:r>
           </w:p>
         </w:tc>
@@ -1693,14 +1590,8 @@
             </w:tcBorders>
           </w:tcPr>
           <w:p>
-            <w:pPr>
-              <w:ind w:left="120" w:right="16"/>
-            </w:pPr>
-            <w:r>
-              <w:rPr>
-                <w:rFonts w:ascii="Arial" w:eastAsia="Arial" w:hAnsi="Arial" w:cs="Arial"/>
-              </w:rPr>
-              <w:t xml:space="preserve">El usuario envía una solicitud SOAP login(usuario, contrasenia) al ServicioAutenticacion con sus credenciales en los campos usuario ('MONSTER') y contrasenia ('MONSTER9'). </w:t>
+            <w:r>
+              <w:t>El usuario envía una solicitud SOAP login(usuario, contrasenia) al ServicioAutenticacion con sus credenciales (usuario: "MONSTER", contrasenia: "MONSTER9").</w:t>
             </w:r>
           </w:p>
         </w:tc>
@@ -1764,15 +1655,8 @@
             </w:tcBorders>
           </w:tcPr>
           <w:p>
-            <w:pPr>
-              <w:ind w:left="123" w:right="24"/>
-              <w:jc w:val="both"/>
-            </w:pPr>
-            <w:r>
-              <w:rPr>
-                <w:rFonts w:ascii="Arial" w:eastAsia="Arial" w:hAnsi="Arial" w:cs="Arial"/>
-              </w:rPr>
-              <w:t xml:space="preserve">El sistema recibe la solicitud y extrae las credenciales usuario y contrasenia. </w:t>
+            <w:r>
+              <w:t>El servidor SOAP recibe la solicitud y extrae los parámetros usuario y contrasenia.</w:t>
             </w:r>
           </w:p>
         </w:tc>
@@ -1814,14 +1698,8 @@
             </w:tcBorders>
           </w:tcPr>
           <w:p>
-            <w:pPr>
-              <w:ind w:left="123" w:right="10"/>
-            </w:pPr>
-            <w:r>
-              <w:rPr>
-                <w:rFonts w:ascii="Arial" w:eastAsia="Arial" w:hAnsi="Arial" w:cs="Arial"/>
-              </w:rPr>
-              <w:t xml:space="preserve">El sistema valida las credenciales comparándolas con los valores almacenados (usuario: MONSTER, contraseña: MONSTER9). </w:t>
+            <w:r>
+              <w:t>El servidor valida las credenciales comparándolas con las constantes maestras (usuario: "MONSTER", contrasenia: "MONSTER9").</w:t>
             </w:r>
           </w:p>
         </w:tc>
@@ -1912,14 +1790,8 @@
             </w:tcBorders>
           </w:tcPr>
           <w:p>
-            <w:pPr>
-              <w:ind w:left="123"/>
-            </w:pPr>
-            <w:r>
-              <w:rPr>
-                <w:rFonts w:ascii="Arial" w:eastAsia="Arial" w:hAnsi="Arial" w:cs="Arial"/>
-              </w:rPr>
-              <w:t xml:space="preserve">El sistema almacena el token UUID en memoria (colección interna). </w:t>
+            <w:r>
+              <w:t>El servidor almacena el token UUID en memoria RAM volátil (ConcurrentHashMap en ServicioAuth).</w:t>
             </w:r>
           </w:p>
         </w:tc>
@@ -1961,14 +1833,8 @@
             </w:tcBorders>
           </w:tcPr>
           <w:p>
-            <w:pPr>
-              <w:ind w:left="123"/>
-            </w:pPr>
-            <w:r>
-              <w:rPr>
-                <w:rFonts w:ascii="Arial" w:eastAsia="Arial" w:hAnsi="Arial" w:cs="Arial"/>
-              </w:rPr>
-              <w:t xml:space="preserve">El sistema responde con success = true, el token generado y message: "Bienvenido al sistema." </w:t>
+            <w:r>
+              <w:t>El servidor responde con el sobre SOAP con success = true, el token generado y mensaje de bienvenida.</w:t>
             </w:r>
           </w:p>
         </w:tc>
@@ -2065,19 +1931,8 @@
             </w:tcBorders>
           </w:tcPr>
           <w:p>
-            <w:pPr>
-              <w:ind w:left="120"/>
-            </w:pPr>
-            <w:r>
-              <w:t>• Credenciales inválidas: el sistema responde con SOAP Fault / SOAP Fault / SOAP Fault / SOAP Fault / HTTP 401 Unauthorized y message: "Usuario o clave fallidos, intenta de nuevo." No se genera ningún token.</w:t>
-            </w:r>
-          </w:p>
-          <w:p>
-            <w:pPr>
-              <w:ind w:left="120"/>
-            </w:pPr>
-            <w:r>
-              <w:t>• Campos vacíos o nulos: el sistema responde con SOAP Fault / SOAP Fault / SOAP Fault / SOAP Fault / HTTP 400 Bad Request.</w:t>
+            <w:r>
+              <w:t>• Credenciales inválidas: el servidor responde con SOAP Fault (código 401) y message: "Usuario o clave fallidos, intenta de nuevo." No se genera ningún token. • Campos vacíos o nulos: el servidor responde con SOAP Fault (código 400).</w:t>
             </w:r>
           </w:p>
         </w:tc>
@@ -2351,6 +2206,48 @@
             </w:tcBorders>
           </w:tcPr>
           <w:p>
+            <w:r>
+              <w:t>Permite al usuario autenticado convertir una medida de longitud entre las 5 unidades autorizadas del catálogo estricto: metro, centimetro, pie, yarda y milla. La solicitud se realiza mediante la operación SOAP convertirLongitud(token, valor, origen, destino) en ServicioConversion.</w:t>
+            </w:r>
+          </w:p>
+        </w:tc>
+      </w:tr>
+      <w:tr>
+        <w:trPr>
+          <w:trHeight w:val="914"/>
+        </w:trPr>
+        <w:tc>
+          <w:tcPr>
+            <w:tcW w:w="3386" w:type="dxa"/>
+            <w:tcBorders>
+              <w:top w:val="single" w:sz="5" w:space="0" w:color="000000"/>
+              <w:left w:val="single" w:sz="5" w:space="0" w:color="000000"/>
+              <w:bottom w:val="single" w:sz="5" w:space="0" w:color="000000"/>
+              <w:right w:val="single" w:sz="5" w:space="0" w:color="000000"/>
+            </w:tcBorders>
+            <w:shd w:val="clear" w:color="auto" w:fill="BDD7EE"/>
+          </w:tcPr>
+          <w:p>
+            <w:r>
+              <w:rPr>
+                <w:rFonts w:ascii="Arial" w:eastAsia="Arial" w:hAnsi="Arial" w:cs="Arial"/>
+                <w:b/>
+              </w:rPr>
+              <w:t xml:space="preserve">Meta: </w:t>
+            </w:r>
+          </w:p>
+        </w:tc>
+        <w:tc>
+          <w:tcPr>
+            <w:tcW w:w="5636" w:type="dxa"/>
+            <w:tcBorders>
+              <w:top w:val="single" w:sz="5" w:space="0" w:color="000000"/>
+              <w:left w:val="single" w:sz="5" w:space="0" w:color="000000"/>
+              <w:bottom w:val="single" w:sz="5" w:space="0" w:color="000000"/>
+              <w:right w:val="single" w:sz="5" w:space="0" w:color="000000"/>
+            </w:tcBorders>
+          </w:tcPr>
+          <w:p>
             <w:pPr>
               <w:ind w:left="3"/>
             </w:pPr>
@@ -2358,14 +2255,14 @@
               <w:rPr>
                 <w:rFonts w:ascii="Arial" w:eastAsia="Arial" w:hAnsi="Arial" w:cs="Arial"/>
               </w:rPr>
-              <w:t xml:space="preserve">Permite al usuario autenticado convertir una medida de longitud entre las unidades soportadas por el sistema: centímetros, metros, pies, yardas y millas. La solicitud se realiza mediante convertirLongitud(token, valor, origen, destino) en ServicioConversion. </w:t>
-            </w:r>
-          </w:p>
-        </w:tc>
-      </w:tr>
-      <w:tr>
-        <w:trPr>
-          <w:trHeight w:val="914"/>
+              <w:t xml:space="preserve">El usuario obtiene el valor numérico equivalente en la unidad de longitud de destino solicitada, confirmado con success = true y message: "Conversión exitosa." </w:t>
+            </w:r>
+          </w:p>
+        </w:tc>
+      </w:tr>
+      <w:tr>
+        <w:trPr>
+          <w:trHeight w:val="480"/>
         </w:trPr>
         <w:tc>
           <w:tcPr>
@@ -2384,7 +2281,7 @@
                 <w:rFonts w:ascii="Arial" w:eastAsia="Arial" w:hAnsi="Arial" w:cs="Arial"/>
                 <w:b/>
               </w:rPr>
-              <w:t xml:space="preserve">Meta: </w:t>
+              <w:t xml:space="preserve">Estado: </w:t>
             </w:r>
           </w:p>
         </w:tc>
@@ -2406,7 +2303,7 @@
               <w:rPr>
                 <w:rFonts w:ascii="Arial" w:eastAsia="Arial" w:hAnsi="Arial" w:cs="Arial"/>
               </w:rPr>
-              <w:t xml:space="preserve">El usuario obtiene el valor numérico equivalente en la unidad de longitud de destino solicitada, confirmado con success = true y message: "Conversión exitosa." </w:t>
+              <w:t xml:space="preserve">Activo </w:t>
             </w:r>
           </w:p>
         </w:tc>
@@ -2432,7 +2329,7 @@
                 <w:rFonts w:ascii="Arial" w:eastAsia="Arial" w:hAnsi="Arial" w:cs="Arial"/>
                 <w:b/>
               </w:rPr>
-              <w:t xml:space="preserve">Estado: </w:t>
+              <w:t xml:space="preserve">Versión: </w:t>
             </w:r>
           </w:p>
         </w:tc>
@@ -2454,7 +2351,7 @@
               <w:rPr>
                 <w:rFonts w:ascii="Arial" w:eastAsia="Arial" w:hAnsi="Arial" w:cs="Arial"/>
               </w:rPr>
-              <w:t xml:space="preserve">Activo </w:t>
+              <w:t xml:space="preserve">1.0 </w:t>
             </w:r>
           </w:p>
         </w:tc>
@@ -2480,7 +2377,7 @@
                 <w:rFonts w:ascii="Arial" w:eastAsia="Arial" w:hAnsi="Arial" w:cs="Arial"/>
                 <w:b/>
               </w:rPr>
-              <w:t xml:space="preserve">Versión: </w:t>
+              <w:t xml:space="preserve">Autor(es): </w:t>
             </w:r>
           </w:p>
         </w:tc>
@@ -2495,14 +2392,8 @@
             </w:tcBorders>
           </w:tcPr>
           <w:p>
-            <w:pPr>
-              <w:ind w:left="3"/>
-            </w:pPr>
-            <w:r>
-              <w:rPr>
-                <w:rFonts w:ascii="Arial" w:eastAsia="Arial" w:hAnsi="Arial" w:cs="Arial"/>
-              </w:rPr>
-              <w:t xml:space="preserve">1.0 </w:t>
+            <w:r>
+              <w:t>Julio Enrique Viche Castillo (GR09)</w:t>
             </w:r>
           </w:p>
         </w:tc>
@@ -2528,7 +2419,7 @@
                 <w:rFonts w:ascii="Arial" w:eastAsia="Arial" w:hAnsi="Arial" w:cs="Arial"/>
                 <w:b/>
               </w:rPr>
-              <w:t xml:space="preserve">Autor(es): </w:t>
+              <w:t xml:space="preserve">Fecha creación: </w:t>
             </w:r>
           </w:p>
         </w:tc>
@@ -2543,14 +2434,8 @@
             </w:tcBorders>
           </w:tcPr>
           <w:p>
-            <w:pPr>
-              <w:ind w:left="3"/>
-            </w:pPr>
-            <w:r>
-              <w:rPr>
-                <w:rFonts w:ascii="Arial" w:eastAsia="Arial" w:hAnsi="Arial" w:cs="Arial"/>
-              </w:rPr>
-              <w:t xml:space="preserve">Julio Enrique Viche Castillo (GR09) </w:t>
+            <w:r>
+              <w:t>28/10/2026</w:t>
             </w:r>
           </w:p>
         </w:tc>
@@ -2576,7 +2461,7 @@
                 <w:rFonts w:ascii="Arial" w:eastAsia="Arial" w:hAnsi="Arial" w:cs="Arial"/>
                 <w:b/>
               </w:rPr>
-              <w:t xml:space="preserve">Fecha creación: </w:t>
+              <w:t xml:space="preserve">Fecha modificación: </w:t>
             </w:r>
           </w:p>
         </w:tc>
@@ -2591,21 +2476,15 @@
             </w:tcBorders>
           </w:tcPr>
           <w:p>
-            <w:pPr>
-              <w:ind w:left="3"/>
-            </w:pPr>
-            <w:r>
-              <w:rPr>
-                <w:rFonts w:ascii="Arial" w:eastAsia="Arial" w:hAnsi="Arial" w:cs="Arial"/>
-              </w:rPr>
-              <w:t xml:space="preserve">28/10/2026 </w:t>
-            </w:r>
-          </w:p>
-        </w:tc>
-      </w:tr>
-      <w:tr>
-        <w:trPr>
-          <w:trHeight w:val="480"/>
+            <w:r>
+              <w:t>28/10/2026</w:t>
+            </w:r>
+          </w:p>
+        </w:tc>
+      </w:tr>
+      <w:tr>
+        <w:trPr>
+          <w:trHeight w:val="1639"/>
         </w:trPr>
         <w:tc>
           <w:tcPr>
@@ -2624,7 +2503,7 @@
                 <w:rFonts w:ascii="Arial" w:eastAsia="Arial" w:hAnsi="Arial" w:cs="Arial"/>
                 <w:b/>
               </w:rPr>
-              <w:t xml:space="preserve">Fecha modificación: </w:t>
+              <w:t xml:space="preserve">Datos de entrada: </w:t>
             </w:r>
           </w:p>
         </w:tc>
@@ -2639,21 +2518,21 @@
             </w:tcBorders>
           </w:tcPr>
           <w:p>
-            <w:pPr>
-              <w:ind w:left="3"/>
-            </w:pPr>
-            <w:r>
-              <w:rPr>
-                <w:rFonts w:ascii="Arial" w:eastAsia="Arial" w:hAnsi="Arial" w:cs="Arial"/>
-              </w:rPr>
-              <w:t xml:space="preserve">28/10/2026 </w:t>
-            </w:r>
-          </w:p>
-        </w:tc>
-      </w:tr>
-      <w:tr>
-        <w:trPr>
-          <w:trHeight w:val="1639"/>
+            <w:r>
+              <w:t>from: unidad de origen (metro | centimetro | pie | yarda | milla)</w:t>
+              <w:br/>
+              <w:t>to: unidad de destino (metro | centimetro | pie | yarda | milla)</w:t>
+              <w:br/>
+              <w:t>value: valor numérico a convertir (double, máx 16 caracteres)</w:t>
+              <w:br/>
+              <w:t>token: token UUID obtenido en CU-01</w:t>
+            </w:r>
+          </w:p>
+        </w:tc>
+      </w:tr>
+      <w:tr>
+        <w:trPr>
+          <w:trHeight w:val="1140"/>
         </w:trPr>
         <w:tc>
           <w:tcPr>
@@ -2672,7 +2551,7 @@
                 <w:rFonts w:ascii="Arial" w:eastAsia="Arial" w:hAnsi="Arial" w:cs="Arial"/>
                 <w:b/>
               </w:rPr>
-              <w:t xml:space="preserve">Datos de entrada: </w:t>
+              <w:t xml:space="preserve">Precondiciones: </w:t>
             </w:r>
           </w:p>
         </w:tc>
@@ -2688,44 +2567,20 @@
           </w:tcPr>
           <w:p>
             <w:pPr>
-              <w:spacing w:after="2" w:line="238" w:lineRule="auto"/>
-              <w:ind w:left="3"/>
-            </w:pPr>
-            <w:r>
-              <w:rPr>
-                <w:rFonts w:ascii="Arial" w:eastAsia="Arial" w:hAnsi="Arial" w:cs="Arial"/>
-              </w:rPr>
-              <w:t xml:space="preserve">from: unidad de origen (centimetros | metros | pies | yardas | millas) </w:t>
-            </w:r>
-          </w:p>
-          <w:p>
-            <w:pPr>
-              <w:spacing w:after="2" w:line="238" w:lineRule="auto"/>
-              <w:ind w:left="3"/>
-            </w:pPr>
-            <w:r>
-              <w:rPr>
-                <w:rFonts w:ascii="Arial" w:eastAsia="Arial" w:hAnsi="Arial" w:cs="Arial"/>
-              </w:rPr>
-              <w:t xml:space="preserve">to: unidad de destino (centimetros | metros | pies | yardas | millas) </w:t>
-            </w:r>
-          </w:p>
-          <w:p>
-            <w:pPr>
-              <w:ind w:left="3" w:right="742"/>
-            </w:pPr>
-            <w:r>
-              <w:rPr>
-                <w:rFonts w:ascii="Arial" w:eastAsia="Arial" w:hAnsi="Arial" w:cs="Arial"/>
-              </w:rPr>
-              <w:t xml:space="preserve">value: valor numérico a convertir (double) token: token UUID obtenido en CU-01 </w:t>
-            </w:r>
-          </w:p>
-        </w:tc>
-      </w:tr>
-      <w:tr>
-        <w:trPr>
-          <w:trHeight w:val="1140"/>
+              <w:ind w:left="3" w:right="289"/>
+            </w:pPr>
+            <w:r>
+              <w:rPr>
+                <w:rFonts w:ascii="Arial" w:eastAsia="Arial" w:hAnsi="Arial" w:cs="Arial"/>
+              </w:rPr>
+              <w:t xml:space="preserve">• El usuario debe haber iniciado sesión exitosamente (CU-01) y poseer un token UUID válido y vigente. • Los campos from, to, value y token deben estar presentes en la solicitud. </w:t>
+            </w:r>
+          </w:p>
+        </w:tc>
+      </w:tr>
+      <w:tr>
+        <w:trPr>
+          <w:trHeight w:val="1889"/>
         </w:trPr>
         <w:tc>
           <w:tcPr>
@@ -2744,7 +2599,7 @@
                 <w:rFonts w:ascii="Arial" w:eastAsia="Arial" w:hAnsi="Arial" w:cs="Arial"/>
                 <w:b/>
               </w:rPr>
-              <w:t xml:space="preserve">Precondiciones: </w:t>
+              <w:t xml:space="preserve">Postcondiciones: </w:t>
             </w:r>
           </w:p>
         </w:tc>
@@ -2759,92 +2614,12 @@
             </w:tcBorders>
           </w:tcPr>
           <w:p>
-            <w:pPr>
-              <w:ind w:left="3" w:right="289"/>
-            </w:pPr>
-            <w:r>
-              <w:rPr>
-                <w:rFonts w:ascii="Arial" w:eastAsia="Arial" w:hAnsi="Arial" w:cs="Arial"/>
-              </w:rPr>
-              <w:t xml:space="preserve">• El usuario debe haber iniciado sesión exitosamente (CU-01) y poseer un token UUID válido y vigente. • Los campos from, to, value y token deben estar presentes en la solicitud. </w:t>
-            </w:r>
-          </w:p>
-        </w:tc>
-      </w:tr>
-      <w:tr>
-        <w:trPr>
-          <w:trHeight w:val="1889"/>
-        </w:trPr>
-        <w:tc>
-          <w:tcPr>
-            <w:tcW w:w="3386" w:type="dxa"/>
-            <w:tcBorders>
-              <w:top w:val="single" w:sz="5" w:space="0" w:color="000000"/>
-              <w:left w:val="single" w:sz="5" w:space="0" w:color="000000"/>
-              <w:bottom w:val="single" w:sz="5" w:space="0" w:color="000000"/>
-              <w:right w:val="single" w:sz="5" w:space="0" w:color="000000"/>
-            </w:tcBorders>
-            <w:shd w:val="clear" w:color="auto" w:fill="BDD7EE"/>
-          </w:tcPr>
-          <w:p>
-            <w:r>
-              <w:rPr>
-                <w:rFonts w:ascii="Arial" w:eastAsia="Arial" w:hAnsi="Arial" w:cs="Arial"/>
-                <w:b/>
-              </w:rPr>
-              <w:t xml:space="preserve">Postcondiciones: </w:t>
-            </w:r>
-          </w:p>
-        </w:tc>
-        <w:tc>
-          <w:tcPr>
-            <w:tcW w:w="5636" w:type="dxa"/>
-            <w:tcBorders>
-              <w:top w:val="single" w:sz="5" w:space="0" w:color="000000"/>
-              <w:left w:val="single" w:sz="5" w:space="0" w:color="000000"/>
-              <w:bottom w:val="single" w:sz="5" w:space="0" w:color="000000"/>
-              <w:right w:val="single" w:sz="5" w:space="0" w:color="000000"/>
-            </w:tcBorders>
-          </w:tcPr>
-          <w:p>
-            <w:pPr>
-              <w:numPr>
-                <w:ilvl w:val="0"/>
-                <w:numId w:val="3"/>
-              </w:numPr>
-              <w:spacing w:after="2" w:line="238" w:lineRule="auto"/>
-              <w:ind w:right="35"/>
-            </w:pPr>
-            <w:r>
-              <w:rPr>
-                <w:rFonts w:ascii="Arial" w:eastAsia="Arial" w:hAnsi="Arial" w:cs="Arial"/>
-              </w:rPr>
-              <w:t xml:space="preserve">Éxito: el sistema retorna result con el valor convertido, success = true y message: "Conversión exitosa." </w:t>
-            </w:r>
-          </w:p>
-          <w:p>
-            <w:pPr>
-              <w:numPr>
-                <w:ilvl w:val="0"/>
-                <w:numId w:val="3"/>
-              </w:numPr>
-              <w:spacing w:after="2" w:line="238" w:lineRule="auto"/>
-              <w:ind w:right="35"/>
-            </w:pPr>
-            <w:r>
-              <w:t xml:space="preserve">Fallo por token: SOAP Fault / SOAP Fault / HTTP 401 con message: "Tu sesión expiró o el token no vale." </w:t>
-            </w:r>
-          </w:p>
-          <w:p>
-            <w:pPr>
-              <w:numPr>
-                <w:ilvl w:val="0"/>
-                <w:numId w:val="3"/>
-              </w:numPr>
-              <w:ind w:right="35"/>
-            </w:pPr>
-            <w:r>
-              <w:t xml:space="preserve">Fallo por unidad: SOAP Fault / SOAP Fault / HTTP 400 con message: "Unidad de origen/destino no reconocida." </w:t>
+            <w:r>
+              <w:t>Éxito: el sistema retorna result con el valor convertido (a 2 decimales), success = true y message: "Conversión exitosa."</w:t>
+              <w:br/>
+              <w:t>Fallo por token: SOAP Fault (código 401) con message: "Tu sesión expiró o el token no vale."</w:t>
+              <w:br/>
+              <w:t>Fallo por unidad: SOAP Fault (código 400) con message: "Unidad de origen/destino no reconocida."</w:t>
             </w:r>
           </w:p>
         </w:tc>
@@ -3024,6 +2799,49 @@
             </w:tcBorders>
           </w:tcPr>
           <w:p>
+            <w:r>
+              <w:t>El usuario invoca la operación SOAP convertirLongitud con los parámetros token, valor, origen y destino.</w:t>
+            </w:r>
+          </w:p>
+        </w:tc>
+        <w:tc>
+          <w:tcPr>
+            <w:tcW w:w="5636" w:type="dxa"/>
+            <w:tcBorders>
+              <w:top w:val="single" w:sz="5" w:space="0" w:color="000000"/>
+              <w:left w:val="single" w:sz="5" w:space="0" w:color="000000"/>
+              <w:bottom w:val="single" w:sz="5" w:space="0" w:color="000000"/>
+              <w:right w:val="single" w:sz="5" w:space="0" w:color="000000"/>
+            </w:tcBorders>
+          </w:tcPr>
+          <w:p>
+            <w:pPr>
+              <w:ind w:left="123"/>
+            </w:pPr>
+            <w:r>
+              <w:rPr>
+                <w:rFonts w:ascii="Arial" w:eastAsia="Arial" w:hAnsi="Arial" w:cs="Arial"/>
+              </w:rPr>
+              <w:t xml:space="preserve">  </w:t>
+            </w:r>
+          </w:p>
+        </w:tc>
+      </w:tr>
+      <w:tr>
+        <w:trPr>
+          <w:trHeight w:val="879"/>
+        </w:trPr>
+        <w:tc>
+          <w:tcPr>
+            <w:tcW w:w="3386" w:type="dxa"/>
+            <w:tcBorders>
+              <w:top w:val="single" w:sz="5" w:space="0" w:color="000000"/>
+              <w:left w:val="single" w:sz="5" w:space="0" w:color="000000"/>
+              <w:bottom w:val="single" w:sz="5" w:space="0" w:color="000000"/>
+              <w:right w:val="single" w:sz="5" w:space="0" w:color="000000"/>
+            </w:tcBorders>
+          </w:tcPr>
+          <w:p>
             <w:pPr>
               <w:ind w:left="120"/>
             </w:pPr>
@@ -3031,7 +2849,7 @@
               <w:rPr>
                 <w:rFonts w:ascii="Arial" w:eastAsia="Arial" w:hAnsi="Arial" w:cs="Arial"/>
               </w:rPr>
-              <w:t xml:space="preserve">El usuario envía convertirLongitud(token, valor, origen, destino) en ServicioConversion con los campos from, to, value y token. </w:t>
+              <w:t xml:space="preserve">  </w:t>
             </w:r>
           </w:p>
         </w:tc>
@@ -3053,14 +2871,63 @@
               <w:rPr>
                 <w:rFonts w:ascii="Arial" w:eastAsia="Arial" w:hAnsi="Arial" w:cs="Arial"/>
               </w:rPr>
+              <w:t xml:space="preserve">El sistema invoca CU-05 (Validar Token): extrae el campo token y verifica que exista en la colección en memoria. </w:t>
+            </w:r>
+          </w:p>
+        </w:tc>
+      </w:tr>
+      <w:tr>
+        <w:trPr>
+          <w:trHeight w:val="878"/>
+        </w:trPr>
+        <w:tc>
+          <w:tcPr>
+            <w:tcW w:w="3386" w:type="dxa"/>
+            <w:tcBorders>
+              <w:top w:val="single" w:sz="5" w:space="0" w:color="000000"/>
+              <w:left w:val="single" w:sz="5" w:space="0" w:color="000000"/>
+              <w:bottom w:val="single" w:sz="5" w:space="0" w:color="000000"/>
+              <w:right w:val="single" w:sz="5" w:space="0" w:color="000000"/>
+            </w:tcBorders>
+          </w:tcPr>
+          <w:p>
+            <w:pPr>
+              <w:ind w:left="120"/>
+            </w:pPr>
+            <w:r>
+              <w:rPr>
+                <w:rFonts w:ascii="Arial" w:eastAsia="Arial" w:hAnsi="Arial" w:cs="Arial"/>
+              </w:rPr>
               <w:t xml:space="preserve">  </w:t>
             </w:r>
           </w:p>
         </w:tc>
-      </w:tr>
-      <w:tr>
-        <w:trPr>
-          <w:trHeight w:val="879"/>
+        <w:tc>
+          <w:tcPr>
+            <w:tcW w:w="5636" w:type="dxa"/>
+            <w:tcBorders>
+              <w:top w:val="single" w:sz="5" w:space="0" w:color="000000"/>
+              <w:left w:val="single" w:sz="5" w:space="0" w:color="000000"/>
+              <w:bottom w:val="single" w:sz="5" w:space="0" w:color="000000"/>
+              <w:right w:val="single" w:sz="5" w:space="0" w:color="000000"/>
+            </w:tcBorders>
+          </w:tcPr>
+          <w:p>
+            <w:pPr>
+              <w:ind w:left="123"/>
+            </w:pPr>
+            <w:r>
+              <w:rPr>
+                <w:rFonts w:ascii="Arial" w:eastAsia="Arial" w:hAnsi="Arial" w:cs="Arial"/>
+              </w:rPr>
+              <w:t xml:space="preserve">Token válido. El sistema invoca CU-06 (Validar Unidades): verifica que from y to sean unidades de longitud reconocidas. </w:t>
+            </w:r>
+          </w:p>
+        </w:tc>
+      </w:tr>
+      <w:tr>
+        <w:trPr>
+          <w:trHeight w:val="706"/>
         </w:trPr>
         <w:tc>
           <w:tcPr>
@@ -3102,14 +2969,25 @@
               <w:rPr>
                 <w:rFonts w:ascii="Arial" w:eastAsia="Arial" w:hAnsi="Arial" w:cs="Arial"/>
               </w:rPr>
-              <w:t xml:space="preserve">El sistema invoca CU-05 (Validar Token): extrae el campo token y verifica que exista en la memoria RAM volátil (ConcurrentHashMap). </w:t>
-            </w:r>
-          </w:p>
-        </w:tc>
-      </w:tr>
-      <w:tr>
-        <w:trPr>
-          <w:trHeight w:val="878"/>
+              <w:t xml:space="preserve">Unidades válidas. El sistema invoca </w:t>
+            </w:r>
+          </w:p>
+          <w:p>
+            <w:pPr>
+              <w:ind w:left="123"/>
+            </w:pPr>
+            <w:r>
+              <w:rPr>
+                <w:rFonts w:ascii="Arial" w:eastAsia="Arial" w:hAnsi="Arial" w:cs="Arial"/>
+              </w:rPr>
+              <w:t xml:space="preserve">ConversorLongitud para calcular la conversión. </w:t>
+            </w:r>
+          </w:p>
+        </w:tc>
+      </w:tr>
+      <w:tr>
+        <w:trPr>
+          <w:trHeight w:val="706"/>
         </w:trPr>
         <w:tc>
           <w:tcPr>
@@ -3144,123 +3022,8 @@
             </w:tcBorders>
           </w:tcPr>
           <w:p>
-            <w:pPr>
-              <w:ind w:left="123"/>
-            </w:pPr>
-            <w:r>
-              <w:rPr>
-                <w:rFonts w:ascii="Arial" w:eastAsia="Arial" w:hAnsi="Arial" w:cs="Arial"/>
-              </w:rPr>
-              <w:t xml:space="preserve">Token válido. El sistema invoca CU-06 (Validar Unidades): verifica que from y to sean unidades de longitud reconocidas. </w:t>
-            </w:r>
-          </w:p>
-        </w:tc>
-      </w:tr>
-      <w:tr>
-        <w:trPr>
-          <w:trHeight w:val="706"/>
-        </w:trPr>
-        <w:tc>
-          <w:tcPr>
-            <w:tcW w:w="3386" w:type="dxa"/>
-            <w:tcBorders>
-              <w:top w:val="single" w:sz="5" w:space="0" w:color="000000"/>
-              <w:left w:val="single" w:sz="5" w:space="0" w:color="000000"/>
-              <w:bottom w:val="single" w:sz="5" w:space="0" w:color="000000"/>
-              <w:right w:val="single" w:sz="5" w:space="0" w:color="000000"/>
-            </w:tcBorders>
-          </w:tcPr>
-          <w:p>
-            <w:pPr>
-              <w:ind w:left="120"/>
-            </w:pPr>
-            <w:r>
-              <w:rPr>
-                <w:rFonts w:ascii="Arial" w:eastAsia="Arial" w:hAnsi="Arial" w:cs="Arial"/>
-              </w:rPr>
-              <w:t xml:space="preserve">  </w:t>
-            </w:r>
-          </w:p>
-        </w:tc>
-        <w:tc>
-          <w:tcPr>
-            <w:tcW w:w="5636" w:type="dxa"/>
-            <w:tcBorders>
-              <w:top w:val="single" w:sz="5" w:space="0" w:color="000000"/>
-              <w:left w:val="single" w:sz="5" w:space="0" w:color="000000"/>
-              <w:bottom w:val="single" w:sz="5" w:space="0" w:color="000000"/>
-              <w:right w:val="single" w:sz="5" w:space="0" w:color="000000"/>
-            </w:tcBorders>
-          </w:tcPr>
-          <w:p>
-            <w:pPr>
-              <w:ind w:left="123"/>
-            </w:pPr>
-            <w:r>
-              <w:rPr>
-                <w:rFonts w:ascii="Arial" w:eastAsia="Arial" w:hAnsi="Arial" w:cs="Arial"/>
-              </w:rPr>
-              <w:t xml:space="preserve">Unidades válidas. El sistema invoca </w:t>
-            </w:r>
-          </w:p>
-          <w:p>
-            <w:pPr>
-              <w:ind w:left="123"/>
-            </w:pPr>
-            <w:r>
-              <w:rPr>
-                <w:rFonts w:ascii="Arial" w:eastAsia="Arial" w:hAnsi="Arial" w:cs="Arial"/>
-              </w:rPr>
-              <w:t xml:space="preserve">ConversorLongitud para calcular la conversión. </w:t>
-            </w:r>
-          </w:p>
-        </w:tc>
-      </w:tr>
-      <w:tr>
-        <w:trPr>
-          <w:trHeight w:val="706"/>
-        </w:trPr>
-        <w:tc>
-          <w:tcPr>
-            <w:tcW w:w="3386" w:type="dxa"/>
-            <w:tcBorders>
-              <w:top w:val="single" w:sz="5" w:space="0" w:color="000000"/>
-              <w:left w:val="single" w:sz="5" w:space="0" w:color="000000"/>
-              <w:bottom w:val="single" w:sz="5" w:space="0" w:color="000000"/>
-              <w:right w:val="single" w:sz="5" w:space="0" w:color="000000"/>
-            </w:tcBorders>
-          </w:tcPr>
-          <w:p>
-            <w:pPr>
-              <w:ind w:left="120"/>
-            </w:pPr>
-            <w:r>
-              <w:rPr>
-                <w:rFonts w:ascii="Arial" w:eastAsia="Arial" w:hAnsi="Arial" w:cs="Arial"/>
-              </w:rPr>
-              <w:t xml:space="preserve">  </w:t>
-            </w:r>
-          </w:p>
-        </w:tc>
-        <w:tc>
-          <w:tcPr>
-            <w:tcW w:w="5636" w:type="dxa"/>
-            <w:tcBorders>
-              <w:top w:val="single" w:sz="5" w:space="0" w:color="000000"/>
-              <w:left w:val="single" w:sz="5" w:space="0" w:color="000000"/>
-              <w:bottom w:val="single" w:sz="5" w:space="0" w:color="000000"/>
-              <w:right w:val="single" w:sz="5" w:space="0" w:color="000000"/>
-            </w:tcBorders>
-          </w:tcPr>
-          <w:p>
-            <w:pPr>
-              <w:ind w:left="123"/>
-            </w:pPr>
-            <w:r>
-              <w:rPr>
-                <w:rFonts w:ascii="Arial" w:eastAsia="Arial" w:hAnsi="Arial" w:cs="Arial"/>
-              </w:rPr>
-              <w:t xml:space="preserve">El sistema retorna result con el valor convertido, success = true y message: "Conversión exitosa." </w:t>
+            <w:r>
+              <w:t>El servidor retorna la respuesta SOAP estructurada con el valor convertido (formateado a 2 decimales), success = true y message: "Conversión exitosa."</w:t>
             </w:r>
           </w:p>
         </w:tc>
@@ -3357,35 +3120,8 @@
             </w:tcBorders>
           </w:tcPr>
           <w:p>
-            <w:pPr>
-              <w:ind w:left="120"/>
-            </w:pPr>
-            <w:r>
-              <w:t>• Token inválido o expirado (CU-05): SOAP Fault / SOAP Fault / SOAP Fault / SOAP Fault / HTTP 401, message: "Tu sesión expiró o el token no vale." Se sugiere volver a CU-01.</w:t>
-            </w:r>
-          </w:p>
-          <w:p>
-            <w:pPr>
-              <w:ind w:left="120"/>
-            </w:pPr>
-            <w:r>
-              <w:t>• Unidad de origen no reconocida (CU-06): SOAP Fault / SOAP Fault / SOAP Fault / SOAP Fault / HTTP 400, message: "Unidad de origen no reconocida."</w:t>
-            </w:r>
-          </w:p>
-          <w:p>
-            <w:pPr>
-              <w:ind w:left="120"/>
-            </w:pPr>
-            <w:r>
-              <w:t>• Unidad de destino no reconocida (CU-06): SOAP Fault / SOAP Fault / SOAP Fault / SOAP Fault / HTTP 400, message: "Unidad de destino no reconocida."</w:t>
-            </w:r>
-          </w:p>
-          <w:p>
-            <w:pPr>
-              <w:ind w:left="120"/>
-            </w:pPr>
-            <w:r>
-              <w:t>• Valor no numérico: SOAP Fault / SOAP Fault / SOAP Fault / SOAP Fault / HTTP 400 con error de formato.</w:t>
+            <w:r>
+              <w:t>• Token inválido o expirado (CU-05): SOAP Fault (código 401), message: "Tu sesión expiró o el token no vale." Se sugiere volver a CU-01. • Unidad de origen no reconocida (CU-06): SOAP Fault (código 400), message: "Unidad de origen no reconocida." • Unidad de destino no reconocida (CU-06): SOAP Fault (código 400), message: "Unidad de destino no reconocida." • Valor no numérico: SOAP Fault (código 400).</w:t>
             </w:r>
           </w:p>
         </w:tc>
@@ -3716,6 +3452,64 @@
             </w:tcBorders>
           </w:tcPr>
           <w:p>
+            <w:r>
+              <w:t>Permite al usuario autenticado convertir una medida de masa entre las 5 unidades autorizadas del catálogo estricto: kilogramo, gramo, libra, onza y quintal. La solicitud se realiza mediante la operación SOAP convertirMasa(token, valor, origen, destino) en ServicioConversion.</w:t>
+            </w:r>
+          </w:p>
+        </w:tc>
+      </w:tr>
+      <w:tr>
+        <w:trPr>
+          <w:trHeight w:val="706"/>
+        </w:trPr>
+        <w:tc>
+          <w:tcPr>
+            <w:tcW w:w="2643" w:type="dxa"/>
+            <w:tcBorders>
+              <w:top w:val="single" w:sz="5" w:space="0" w:color="000000"/>
+              <w:left w:val="single" w:sz="5" w:space="0" w:color="000000"/>
+              <w:bottom w:val="single" w:sz="5" w:space="0" w:color="000000"/>
+              <w:right w:val="nil"/>
+            </w:tcBorders>
+            <w:shd w:val="clear" w:color="auto" w:fill="BDD7EE"/>
+          </w:tcPr>
+          <w:p>
+            <w:pPr>
+              <w:ind w:left="120"/>
+            </w:pPr>
+            <w:r>
+              <w:rPr>
+                <w:rFonts w:ascii="Arial" w:eastAsia="Arial" w:hAnsi="Arial" w:cs="Arial"/>
+                <w:b/>
+              </w:rPr>
+              <w:t xml:space="preserve">Meta: </w:t>
+            </w:r>
+          </w:p>
+        </w:tc>
+        <w:tc>
+          <w:tcPr>
+            <w:tcW w:w="744" w:type="dxa"/>
+            <w:tcBorders>
+              <w:top w:val="single" w:sz="5" w:space="0" w:color="000000"/>
+              <w:left w:val="nil"/>
+              <w:bottom w:val="single" w:sz="5" w:space="0" w:color="000000"/>
+              <w:right w:val="single" w:sz="5" w:space="0" w:color="000000"/>
+            </w:tcBorders>
+            <w:shd w:val="clear" w:color="auto" w:fill="BDD7EE"/>
+          </w:tcPr>
+          <w:p/>
+        </w:tc>
+        <w:tc>
+          <w:tcPr>
+            <w:tcW w:w="5636" w:type="dxa"/>
+            <w:tcBorders>
+              <w:top w:val="single" w:sz="5" w:space="0" w:color="000000"/>
+              <w:left w:val="single" w:sz="5" w:space="0" w:color="000000"/>
+              <w:bottom w:val="single" w:sz="5" w:space="0" w:color="000000"/>
+              <w:right w:val="single" w:sz="5" w:space="0" w:color="000000"/>
+            </w:tcBorders>
+          </w:tcPr>
+          <w:p>
             <w:pPr>
               <w:ind w:left="123"/>
             </w:pPr>
@@ -3723,14 +3517,14 @@
               <w:rPr>
                 <w:rFonts w:ascii="Arial" w:eastAsia="Arial" w:hAnsi="Arial" w:cs="Arial"/>
               </w:rPr>
-              <w:t xml:space="preserve">Permite al usuario autenticado convertir una medida de masa entre las unidades soportadas: gramos, kilogramos, onzas, libras y quintales. La solicitud se realiza mediante convertirMasa(token, valor, origen, destino) en ServicioConversion. </w:t>
-            </w:r>
-          </w:p>
-        </w:tc>
-      </w:tr>
-      <w:tr>
-        <w:trPr>
-          <w:trHeight w:val="706"/>
+              <w:t xml:space="preserve">El usuario obtiene el valor numérico equivalente en la unidad de masa de destino solicitada. </w:t>
+            </w:r>
+          </w:p>
+        </w:tc>
+      </w:tr>
+      <w:tr>
+        <w:trPr>
+          <w:trHeight w:val="480"/>
         </w:trPr>
         <w:tc>
           <w:tcPr>
@@ -3752,7 +3546,7 @@
                 <w:rFonts w:ascii="Arial" w:eastAsia="Arial" w:hAnsi="Arial" w:cs="Arial"/>
                 <w:b/>
               </w:rPr>
-              <w:t xml:space="preserve">Meta: </w:t>
+              <w:t xml:space="preserve">Estado: </w:t>
             </w:r>
           </w:p>
         </w:tc>
@@ -3787,7 +3581,7 @@
               <w:rPr>
                 <w:rFonts w:ascii="Arial" w:eastAsia="Arial" w:hAnsi="Arial" w:cs="Arial"/>
               </w:rPr>
-              <w:t xml:space="preserve">El usuario obtiene el valor numérico equivalente en la unidad de masa de destino solicitada. </w:t>
+              <w:t xml:space="preserve">Activo </w:t>
             </w:r>
           </w:p>
         </w:tc>
@@ -3816,7 +3610,7 @@
                 <w:rFonts w:ascii="Arial" w:eastAsia="Arial" w:hAnsi="Arial" w:cs="Arial"/>
                 <w:b/>
               </w:rPr>
-              <w:t xml:space="preserve">Estado: </w:t>
+              <w:t xml:space="preserve">Versión: </w:t>
             </w:r>
           </w:p>
         </w:tc>
@@ -3851,7 +3645,7 @@
               <w:rPr>
                 <w:rFonts w:ascii="Arial" w:eastAsia="Arial" w:hAnsi="Arial" w:cs="Arial"/>
               </w:rPr>
-              <w:t xml:space="preserve">Activo </w:t>
+              <w:t xml:space="preserve">1.0 </w:t>
             </w:r>
           </w:p>
         </w:tc>
@@ -3880,7 +3674,7 @@
                 <w:rFonts w:ascii="Arial" w:eastAsia="Arial" w:hAnsi="Arial" w:cs="Arial"/>
                 <w:b/>
               </w:rPr>
-              <w:t xml:space="preserve">Versión: </w:t>
+              <w:t xml:space="preserve">Autor(es): </w:t>
             </w:r>
           </w:p>
         </w:tc>
@@ -3908,14 +3702,8 @@
             </w:tcBorders>
           </w:tcPr>
           <w:p>
-            <w:pPr>
-              <w:ind w:left="123"/>
-            </w:pPr>
-            <w:r>
-              <w:rPr>
-                <w:rFonts w:ascii="Arial" w:eastAsia="Arial" w:hAnsi="Arial" w:cs="Arial"/>
-              </w:rPr>
-              <w:t xml:space="preserve">1.0 </w:t>
+            <w:r>
+              <w:t>Julio Enrique Viche Castillo (GR09)</w:t>
             </w:r>
           </w:p>
         </w:tc>
@@ -3944,7 +3732,7 @@
                 <w:rFonts w:ascii="Arial" w:eastAsia="Arial" w:hAnsi="Arial" w:cs="Arial"/>
                 <w:b/>
               </w:rPr>
-              <w:t xml:space="preserve">Autor(es): </w:t>
+              <w:t xml:space="preserve">Fecha creación: </w:t>
             </w:r>
           </w:p>
         </w:tc>
@@ -3972,14 +3760,8 @@
             </w:tcBorders>
           </w:tcPr>
           <w:p>
-            <w:pPr>
-              <w:ind w:left="123"/>
-            </w:pPr>
-            <w:r>
-              <w:rPr>
-                <w:rFonts w:ascii="Arial" w:eastAsia="Arial" w:hAnsi="Arial" w:cs="Arial"/>
-              </w:rPr>
-              <w:t xml:space="preserve">Julio Enrique Viche Castillo (GR09) </w:t>
+            <w:r>
+              <w:t>28/10/2026</w:t>
             </w:r>
           </w:p>
         </w:tc>
@@ -4008,7 +3790,7 @@
                 <w:rFonts w:ascii="Arial" w:eastAsia="Arial" w:hAnsi="Arial" w:cs="Arial"/>
                 <w:b/>
               </w:rPr>
-              <w:t xml:space="preserve">Fecha creación: </w:t>
+              <w:t xml:space="preserve">Fecha modificación: </w:t>
             </w:r>
           </w:p>
         </w:tc>
@@ -4036,21 +3818,15 @@
             </w:tcBorders>
           </w:tcPr>
           <w:p>
-            <w:pPr>
-              <w:ind w:left="123"/>
-            </w:pPr>
-            <w:r>
-              <w:rPr>
-                <w:rFonts w:ascii="Arial" w:eastAsia="Arial" w:hAnsi="Arial" w:cs="Arial"/>
-              </w:rPr>
-              <w:t xml:space="preserve">28/10/2026 </w:t>
-            </w:r>
-          </w:p>
-        </w:tc>
-      </w:tr>
-      <w:tr>
-        <w:trPr>
-          <w:trHeight w:val="480"/>
+            <w:r>
+              <w:t>28/10/2026</w:t>
+            </w:r>
+          </w:p>
+        </w:tc>
+      </w:tr>
+      <w:tr>
+        <w:trPr>
+          <w:trHeight w:val="1637"/>
         </w:trPr>
         <w:tc>
           <w:tcPr>
@@ -4072,7 +3848,7 @@
                 <w:rFonts w:ascii="Arial" w:eastAsia="Arial" w:hAnsi="Arial" w:cs="Arial"/>
                 <w:b/>
               </w:rPr>
-              <w:t xml:space="preserve">Fecha modificación: </w:t>
+              <w:t xml:space="preserve">Datos de entrada: </w:t>
             </w:r>
           </w:p>
         </w:tc>
@@ -4100,91 +3876,14 @@
             </w:tcBorders>
           </w:tcPr>
           <w:p>
-            <w:pPr>
-              <w:ind w:left="123"/>
-            </w:pPr>
-            <w:r>
-              <w:rPr>
-                <w:rFonts w:ascii="Arial" w:eastAsia="Arial" w:hAnsi="Arial" w:cs="Arial"/>
-              </w:rPr>
-              <w:t xml:space="preserve">28/10/2026 </w:t>
-            </w:r>
-          </w:p>
-        </w:tc>
-      </w:tr>
-      <w:tr>
-        <w:trPr>
-          <w:trHeight w:val="1637"/>
-        </w:trPr>
-        <w:tc>
-          <w:tcPr>
-            <w:tcW w:w="2643" w:type="dxa"/>
-            <w:tcBorders>
-              <w:top w:val="single" w:sz="5" w:space="0" w:color="000000"/>
-              <w:left w:val="single" w:sz="5" w:space="0" w:color="000000"/>
-              <w:bottom w:val="single" w:sz="5" w:space="0" w:color="000000"/>
-              <w:right w:val="nil"/>
-            </w:tcBorders>
-            <w:shd w:val="clear" w:color="auto" w:fill="BDD7EE"/>
-          </w:tcPr>
-          <w:p>
-            <w:pPr>
-              <w:ind w:left="120"/>
-            </w:pPr>
-            <w:r>
-              <w:rPr>
-                <w:rFonts w:ascii="Arial" w:eastAsia="Arial" w:hAnsi="Arial" w:cs="Arial"/>
-                <w:b/>
-              </w:rPr>
-              <w:t xml:space="preserve">Datos de entrada: </w:t>
-            </w:r>
-          </w:p>
-        </w:tc>
-        <w:tc>
-          <w:tcPr>
-            <w:tcW w:w="744" w:type="dxa"/>
-            <w:tcBorders>
-              <w:top w:val="single" w:sz="5" w:space="0" w:color="000000"/>
-              <w:left w:val="nil"/>
-              <w:bottom w:val="single" w:sz="5" w:space="0" w:color="000000"/>
-              <w:right w:val="single" w:sz="5" w:space="0" w:color="000000"/>
-            </w:tcBorders>
-            <w:shd w:val="clear" w:color="auto" w:fill="BDD7EE"/>
-          </w:tcPr>
-          <w:p/>
-        </w:tc>
-        <w:tc>
-          <w:tcPr>
-            <w:tcW w:w="5636" w:type="dxa"/>
-            <w:tcBorders>
-              <w:top w:val="single" w:sz="5" w:space="0" w:color="000000"/>
-              <w:left w:val="single" w:sz="5" w:space="0" w:color="000000"/>
-              <w:bottom w:val="single" w:sz="5" w:space="0" w:color="000000"/>
-              <w:right w:val="single" w:sz="5" w:space="0" w:color="000000"/>
-            </w:tcBorders>
-          </w:tcPr>
-          <w:p>
-            <w:pPr>
-              <w:spacing w:line="238" w:lineRule="auto"/>
-              <w:ind w:left="123"/>
-              <w:jc w:val="both"/>
-            </w:pPr>
-            <w:r>
-              <w:rPr>
-                <w:rFonts w:ascii="Arial" w:eastAsia="Arial" w:hAnsi="Arial" w:cs="Arial"/>
-              </w:rPr>
-              <w:t xml:space="preserve">from: unidad de origen (gramos | kilogramos | onzas | libras | quintales) </w:t>
-            </w:r>
-          </w:p>
-          <w:p>
-            <w:pPr>
-              <w:ind w:left="123" w:right="415"/>
-            </w:pPr>
-            <w:r>
-              <w:rPr>
-                <w:rFonts w:ascii="Arial" w:eastAsia="Arial" w:hAnsi="Arial" w:cs="Arial"/>
-              </w:rPr>
-              <w:t xml:space="preserve">to: unidad de destino (gramos | kilogramos | onzas | libras | quintales) value: valor numérico a convertir (double) token: token UUID obtenido en CU-01 </w:t>
+            <w:r>
+              <w:t>from: unidad de origen (kilogramo | gramo | libra | onza | quintal)</w:t>
+              <w:br/>
+              <w:t>to: unidad de destino (kilogramo | gramo | libra | onza | quintal)</w:t>
+              <w:br/>
+              <w:t>value: valor numérico a convertir (double, máx 16 caracteres)</w:t>
+              <w:br/>
+              <w:t>token: token UUID obtenido en CU-01</w:t>
             </w:r>
           </w:p>
         </w:tc>
@@ -4323,42 +4022,12 @@
             </w:tcBorders>
           </w:tcPr>
           <w:p>
-            <w:pPr>
-              <w:numPr>
-                <w:ilvl w:val="0"/>
-                <w:numId w:val="5"/>
-              </w:numPr>
-              <w:ind w:right="35"/>
-            </w:pPr>
-            <w:r>
-              <w:rPr>
-                <w:rFonts w:ascii="Arial" w:eastAsia="Arial" w:hAnsi="Arial" w:cs="Arial"/>
-              </w:rPr>
-              <w:t xml:space="preserve">Éxito: el sistema retorna result con el valor convertido, success = true y message: "Conversión exitosa." </w:t>
-            </w:r>
-          </w:p>
-          <w:p>
-            <w:pPr>
-              <w:numPr>
-                <w:ilvl w:val="0"/>
-                <w:numId w:val="5"/>
-              </w:numPr>
-              <w:ind w:right="35"/>
-            </w:pPr>
-            <w:r>
-              <w:t xml:space="preserve">Fallo por token: SOAP Fault / SOAP Fault / HTTP 401 con message: "Tu sesión expiró o el token no vale." </w:t>
-            </w:r>
-          </w:p>
-          <w:p>
-            <w:pPr>
-              <w:numPr>
-                <w:ilvl w:val="0"/>
-                <w:numId w:val="5"/>
-              </w:numPr>
-              <w:ind w:right="35"/>
-            </w:pPr>
-            <w:r>
-              <w:t xml:space="preserve">Fallo por unidad: SOAP Fault / SOAP Fault / HTTP 400 con message: "Unidad de origen/destino no reconocida." </w:t>
+            <w:r>
+              <w:t>Éxito: el sistema retorna result con el valor convertido (a 2 decimales), success = true y message: "Conversión exitosa."</w:t>
+              <w:br/>
+              <w:t>Fallo por token: SOAP Fault (código 401) con message: "Tu sesión expiró o el token no vale."</w:t>
+              <w:br/>
+              <w:t>Fallo por unidad: SOAP Fault (código 400) con message: "Unidad de origen/destino no reconocida."</w:t>
             </w:r>
           </w:p>
         </w:tc>
@@ -4541,15 +4210,8 @@
             </w:tcBorders>
           </w:tcPr>
           <w:p>
-            <w:pPr>
-              <w:spacing w:line="220" w:lineRule="exact"/>
-              <w:ind w:left="120" w:right="37"/>
-            </w:pPr>
-            <w:r>
-              <w:rPr>
-                <w:rFonts w:ascii="Arial" w:eastAsia="Arial" w:hAnsi="Arial" w:cs="Arial"/>
-              </w:rPr>
-              <w:t xml:space="preserve">El usuario envía convertirMasa(token, valor, origen, destino) en ServicioConversion con los campos from, to, value y token. </w:t>
+            <w:r>
+              <w:t>El usuario invoca la operación SOAP convertirMasa con los parámetros token, valor, origen y destino.</w:t>
             </w:r>
           </w:p>
         </w:tc>
@@ -4623,7 +4285,7 @@
               <w:rPr>
                 <w:rFonts w:ascii="Arial" w:eastAsia="Arial" w:hAnsi="Arial" w:cs="Arial"/>
               </w:rPr>
-              <w:t xml:space="preserve">El sistema invoca CU-05 (Validar Token): verifica que el token exista en la memoria RAM volátil (ConcurrentHashMap). </w:t>
+              <w:t xml:space="preserve">El sistema invoca CU-05 (Validar Token): verifica que el token exista en la colección en memoria. </w:t>
             </w:r>
           </w:p>
         </w:tc>
@@ -4768,6 +4430,50 @@
             </w:tcBorders>
           </w:tcPr>
           <w:p>
+            <w:r>
+              <w:t>El servidor retorna la respuesta SOAP estructurada con el valor convertido (formateado a 2 decimales), success = true y message: "Conversión exitosa."</w:t>
+            </w:r>
+          </w:p>
+        </w:tc>
+      </w:tr>
+      <w:tr>
+        <w:trPr>
+          <w:trHeight w:val="704"/>
+        </w:trPr>
+        <w:tc>
+          <w:tcPr>
+            <w:tcW w:w="3386" w:type="dxa"/>
+            <w:tcBorders>
+              <w:top w:val="single" w:sz="5" w:space="0" w:color="000000"/>
+              <w:left w:val="single" w:sz="5" w:space="0" w:color="000000"/>
+              <w:bottom w:val="single" w:sz="5" w:space="0" w:color="000000"/>
+              <w:right w:val="single" w:sz="5" w:space="0" w:color="000000"/>
+            </w:tcBorders>
+          </w:tcPr>
+          <w:p>
+            <w:pPr>
+              <w:spacing w:line="220" w:lineRule="exact"/>
+              <w:ind w:left="120"/>
+            </w:pPr>
+            <w:r>
+              <w:rPr>
+                <w:rFonts w:ascii="Arial" w:eastAsia="Arial" w:hAnsi="Arial" w:cs="Arial"/>
+              </w:rPr>
+              <w:t xml:space="preserve">El usuario recibe y utiliza el resultado. </w:t>
+            </w:r>
+          </w:p>
+        </w:tc>
+        <w:tc>
+          <w:tcPr>
+            <w:tcW w:w="5636" w:type="dxa"/>
+            <w:tcBorders>
+              <w:top w:val="single" w:sz="5" w:space="0" w:color="000000"/>
+              <w:left w:val="single" w:sz="5" w:space="0" w:color="000000"/>
+              <w:bottom w:val="single" w:sz="5" w:space="0" w:color="000000"/>
+              <w:right w:val="single" w:sz="5" w:space="0" w:color="000000"/>
+            </w:tcBorders>
+          </w:tcPr>
+          <w:p>
             <w:pPr>
               <w:spacing w:line="220" w:lineRule="exact"/>
               <w:ind w:left="123"/>
@@ -4776,24 +4482,26 @@
               <w:rPr>
                 <w:rFonts w:ascii="Arial" w:eastAsia="Arial" w:hAnsi="Arial" w:cs="Arial"/>
               </w:rPr>
-              <w:t xml:space="preserve">El sistema retorna result con el valor convertido, success = true y message: "Conversión exitosa." </w:t>
-            </w:r>
-          </w:p>
-        </w:tc>
-      </w:tr>
-      <w:tr>
-        <w:trPr>
-          <w:trHeight w:val="704"/>
-        </w:trPr>
-        <w:tc>
-          <w:tcPr>
-            <w:tcW w:w="3386" w:type="dxa"/>
-            <w:tcBorders>
-              <w:top w:val="single" w:sz="5" w:space="0" w:color="000000"/>
-              <w:left w:val="single" w:sz="5" w:space="0" w:color="000000"/>
-              <w:bottom w:val="single" w:sz="5" w:space="0" w:color="000000"/>
-              <w:right w:val="single" w:sz="5" w:space="0" w:color="000000"/>
-            </w:tcBorders>
+              <w:t xml:space="preserve">  </w:t>
+            </w:r>
+          </w:p>
+        </w:tc>
+      </w:tr>
+      <w:tr>
+        <w:trPr>
+          <w:trHeight w:val="458"/>
+        </w:trPr>
+        <w:tc>
+          <w:tcPr>
+            <w:tcW w:w="9022" w:type="dxa"/>
+            <w:gridSpan w:val="2"/>
+            <w:tcBorders>
+              <w:top w:val="single" w:sz="5" w:space="0" w:color="000000"/>
+              <w:left w:val="single" w:sz="5" w:space="0" w:color="000000"/>
+              <w:bottom w:val="single" w:sz="5" w:space="0" w:color="000000"/>
+              <w:right w:val="single" w:sz="5" w:space="0" w:color="000000"/>
+            </w:tcBorders>
+            <w:shd w:val="clear" w:color="auto" w:fill="BDD7EE"/>
           </w:tcPr>
           <w:p>
             <w:pPr>
@@ -4803,39 +4511,14 @@
             <w:r>
               <w:rPr>
                 <w:rFonts w:ascii="Arial" w:eastAsia="Arial" w:hAnsi="Arial" w:cs="Arial"/>
-              </w:rPr>
-              <w:t xml:space="preserve">El usuario recibe y utiliza el resultado. </w:t>
-            </w:r>
-          </w:p>
-        </w:tc>
-        <w:tc>
-          <w:tcPr>
-            <w:tcW w:w="5636" w:type="dxa"/>
-            <w:tcBorders>
-              <w:top w:val="single" w:sz="5" w:space="0" w:color="000000"/>
-              <w:left w:val="single" w:sz="5" w:space="0" w:color="000000"/>
-              <w:bottom w:val="single" w:sz="5" w:space="0" w:color="000000"/>
-              <w:right w:val="single" w:sz="5" w:space="0" w:color="000000"/>
-            </w:tcBorders>
-          </w:tcPr>
-          <w:p>
-            <w:pPr>
-              <w:spacing w:line="220" w:lineRule="exact"/>
-              <w:ind w:left="123"/>
-            </w:pPr>
-            <w:r>
-              <w:rPr>
-                <w:rFonts w:ascii="Arial" w:eastAsia="Arial" w:hAnsi="Arial" w:cs="Arial"/>
-              </w:rPr>
-              <w:t xml:space="preserve">  </w:t>
-            </w:r>
-          </w:p>
-        </w:tc>
-      </w:tr>
-      <w:tr>
-        <w:trPr>
-          <w:trHeight w:val="458"/>
-        </w:trPr>
+                <w:b/>
+              </w:rPr>
+              <w:t>Flujo alternativo</w:t>
+            </w:r>
+          </w:p>
+        </w:tc>
+      </w:tr>
+      <w:tr>
         <w:tc>
           <w:tcPr>
             <w:tcW w:w="9022" w:type="dxa"/>
@@ -4846,60 +4529,10 @@
               <w:bottom w:val="single" w:sz="5" w:space="0" w:color="000000"/>
               <w:right w:val="single" w:sz="5" w:space="0" w:color="000000"/>
             </w:tcBorders>
-            <w:shd w:val="clear" w:color="auto" w:fill="BDD7EE"/>
-          </w:tcPr>
-          <w:p>
-            <w:pPr>
-              <w:spacing w:line="220" w:lineRule="exact"/>
-              <w:ind w:left="120"/>
-            </w:pPr>
-            <w:r>
-              <w:rPr>
-                <w:rFonts w:ascii="Arial" w:eastAsia="Arial" w:hAnsi="Arial" w:cs="Arial"/>
-                <w:b/>
-              </w:rPr>
-              <w:t>Flujo alternativo</w:t>
-            </w:r>
-          </w:p>
-        </w:tc>
-      </w:tr>
-      <w:tr>
-        <w:tc>
-          <w:tcPr>
-            <w:tcW w:w="9022" w:type="dxa"/>
-            <w:gridSpan w:val="2"/>
-            <w:tcBorders>
-              <w:top w:val="single" w:sz="5" w:space="0" w:color="000000"/>
-              <w:left w:val="single" w:sz="5" w:space="0" w:color="000000"/>
-              <w:bottom w:val="single" w:sz="5" w:space="0" w:color="000000"/>
-              <w:right w:val="single" w:sz="5" w:space="0" w:color="000000"/>
-            </w:tcBorders>
-          </w:tcPr>
-          <w:p>
-            <w:pPr>
-              <w:spacing w:line="220" w:lineRule="exact"/>
-              <w:ind w:left="120"/>
-            </w:pPr>
-            <w:r>
-              <w:t>• Token inválido o expirado (CU-05): SOAP Fault / SOAP Fault / SOAP Fault / SOAP Fault / HTTP 401, message: "Tu sesión expiró o el token no vale." Se sugiere volver a CU-01.</w:t>
-            </w:r>
-          </w:p>
-          <w:p>
-            <w:pPr>
-              <w:spacing w:line="220" w:lineRule="exact"/>
-              <w:ind w:left="120"/>
-            </w:pPr>
-            <w:r>
-              <w:t>• Unidad de origen no reconocida (CU-06): SOAP Fault / SOAP Fault / SOAP Fault / SOAP Fault / HTTP 400, message: "Unidad de origen no reconocida."</w:t>
-            </w:r>
-          </w:p>
-          <w:p>
-            <w:pPr>
-              <w:spacing w:line="220" w:lineRule="exact"/>
-              <w:ind w:left="120"/>
-            </w:pPr>
-            <w:r>
-              <w:t>• Unidad de destino no reconocida (CU-06): SOAP Fault / SOAP Fault / SOAP Fault / SOAP Fault / HTTP 400, message: "Unidad de destino no reconocida."</w:t>
+          </w:tcPr>
+          <w:p>
+            <w:r>
+              <w:t>• Token inválido o expirado (CU-05): SOAP Fault (código 401), message: "Tu sesión expiró o el token no vale." Se sugiere volver a CU-01. • Unidad de origen no reconocida (CU-06): SOAP Fault (código 400), message: "Unidad de origen no reconocida." • Unidad de destino no reconocida (CU-06): SOAP Fault (código 400), message: "Unidad de destino no reconocida."</w:t>
             </w:r>
           </w:p>
         </w:tc>
@@ -5241,6 +4874,48 @@
             </w:tcBorders>
           </w:tcPr>
           <w:p>
+            <w:r>
+              <w:t>Permite al usuario autenticado convertir una medida de temperatura entre las 5 escalas autorizadas: celsius, fahrenheit, kelvin, newton y reaumur. La solicitud se realiza mediante la operación SOAP convertirTemperatura(token, valor, origen, destino) en ServicioConversion.</w:t>
+            </w:r>
+          </w:p>
+        </w:tc>
+      </w:tr>
+      <w:tr>
+        <w:trPr>
+          <w:trHeight w:val="706"/>
+        </w:trPr>
+        <w:tc>
+          <w:tcPr>
+            <w:tcW w:w="3473" w:type="dxa"/>
+            <w:tcBorders>
+              <w:top w:val="single" w:sz="5" w:space="0" w:color="000000"/>
+              <w:left w:val="single" w:sz="5" w:space="0" w:color="000000"/>
+              <w:bottom w:val="single" w:sz="5" w:space="0" w:color="000000"/>
+              <w:right w:val="single" w:sz="5" w:space="0" w:color="000000"/>
+            </w:tcBorders>
+            <w:shd w:val="clear" w:color="auto" w:fill="BDD7EE"/>
+          </w:tcPr>
+          <w:p>
+            <w:r>
+              <w:rPr>
+                <w:rFonts w:ascii="Arial" w:eastAsia="Arial" w:hAnsi="Arial" w:cs="Arial"/>
+                <w:b/>
+              </w:rPr>
+              <w:t xml:space="preserve">Meta: </w:t>
+            </w:r>
+          </w:p>
+        </w:tc>
+        <w:tc>
+          <w:tcPr>
+            <w:tcW w:w="5550" w:type="dxa"/>
+            <w:tcBorders>
+              <w:top w:val="single" w:sz="5" w:space="0" w:color="000000"/>
+              <w:left w:val="single" w:sz="5" w:space="0" w:color="000000"/>
+              <w:bottom w:val="single" w:sz="5" w:space="0" w:color="000000"/>
+              <w:right w:val="single" w:sz="5" w:space="0" w:color="000000"/>
+            </w:tcBorders>
+          </w:tcPr>
+          <w:p>
             <w:pPr>
               <w:ind w:left="3"/>
             </w:pPr>
@@ -5248,14 +4923,14 @@
               <w:rPr>
                 <w:rFonts w:ascii="Arial" w:eastAsia="Arial" w:hAnsi="Arial" w:cs="Arial"/>
               </w:rPr>
-              <w:t xml:space="preserve">Permite al usuario autenticado convertir una medida de temperatura entre las escalas soportadas: celsius, fahrenheit, kelvin, newton y reaumur. La solicitud se realiza mediante convertirTemperatura(token, valor, origen, destino) en ServicioConversion. </w:t>
-            </w:r>
-          </w:p>
-        </w:tc>
-      </w:tr>
-      <w:tr>
-        <w:trPr>
-          <w:trHeight w:val="706"/>
+              <w:t xml:space="preserve">El usuario obtiene el valor numérico equivalente en la escala de temperatura de destino solicitada. </w:t>
+            </w:r>
+          </w:p>
+        </w:tc>
+      </w:tr>
+      <w:tr>
+        <w:trPr>
+          <w:trHeight w:val="480"/>
         </w:trPr>
         <w:tc>
           <w:tcPr>
@@ -5274,7 +4949,7 @@
                 <w:rFonts w:ascii="Arial" w:eastAsia="Arial" w:hAnsi="Arial" w:cs="Arial"/>
                 <w:b/>
               </w:rPr>
-              <w:t xml:space="preserve">Meta: </w:t>
+              <w:t xml:space="preserve">Estado: </w:t>
             </w:r>
           </w:p>
         </w:tc>
@@ -5296,7 +4971,7 @@
               <w:rPr>
                 <w:rFonts w:ascii="Arial" w:eastAsia="Arial" w:hAnsi="Arial" w:cs="Arial"/>
               </w:rPr>
-              <w:t xml:space="preserve">El usuario obtiene el valor numérico equivalente en la escala de temperatura de destino solicitada. </w:t>
+              <w:t xml:space="preserve">Activo </w:t>
             </w:r>
           </w:p>
         </w:tc>
@@ -5322,7 +4997,7 @@
                 <w:rFonts w:ascii="Arial" w:eastAsia="Arial" w:hAnsi="Arial" w:cs="Arial"/>
                 <w:b/>
               </w:rPr>
-              <w:t xml:space="preserve">Estado: </w:t>
+              <w:t xml:space="preserve">Versión: </w:t>
             </w:r>
           </w:p>
         </w:tc>
@@ -5344,7 +5019,7 @@
               <w:rPr>
                 <w:rFonts w:ascii="Arial" w:eastAsia="Arial" w:hAnsi="Arial" w:cs="Arial"/>
               </w:rPr>
-              <w:t xml:space="preserve">Activo </w:t>
+              <w:t xml:space="preserve">1.0 </w:t>
             </w:r>
           </w:p>
         </w:tc>
@@ -5370,7 +5045,7 @@
                 <w:rFonts w:ascii="Arial" w:eastAsia="Arial" w:hAnsi="Arial" w:cs="Arial"/>
                 <w:b/>
               </w:rPr>
-              <w:t xml:space="preserve">Versión: </w:t>
+              <w:t xml:space="preserve">Autor(es): </w:t>
             </w:r>
           </w:p>
         </w:tc>
@@ -5385,14 +5060,8 @@
             </w:tcBorders>
           </w:tcPr>
           <w:p>
-            <w:pPr>
-              <w:ind w:left="3"/>
-            </w:pPr>
-            <w:r>
-              <w:rPr>
-                <w:rFonts w:ascii="Arial" w:eastAsia="Arial" w:hAnsi="Arial" w:cs="Arial"/>
-              </w:rPr>
-              <w:t xml:space="preserve">1.0 </w:t>
+            <w:r>
+              <w:t>Julio Enrique Viche Castillo (GR09)</w:t>
             </w:r>
           </w:p>
         </w:tc>
@@ -5418,7 +5087,7 @@
                 <w:rFonts w:ascii="Arial" w:eastAsia="Arial" w:hAnsi="Arial" w:cs="Arial"/>
                 <w:b/>
               </w:rPr>
-              <w:t xml:space="preserve">Autor(es): </w:t>
+              <w:t xml:space="preserve">Fecha creación: </w:t>
             </w:r>
           </w:p>
         </w:tc>
@@ -5433,14 +5102,8 @@
             </w:tcBorders>
           </w:tcPr>
           <w:p>
-            <w:pPr>
-              <w:ind w:left="3"/>
-            </w:pPr>
-            <w:r>
-              <w:rPr>
-                <w:rFonts w:ascii="Arial" w:eastAsia="Arial" w:hAnsi="Arial" w:cs="Arial"/>
-              </w:rPr>
-              <w:t xml:space="preserve">Julio Enrique Viche Castillo (GR09) </w:t>
+            <w:r>
+              <w:t>28/10/2026</w:t>
             </w:r>
           </w:p>
         </w:tc>
@@ -5466,7 +5129,7 @@
                 <w:rFonts w:ascii="Arial" w:eastAsia="Arial" w:hAnsi="Arial" w:cs="Arial"/>
                 <w:b/>
               </w:rPr>
-              <w:t xml:space="preserve">Fecha creación: </w:t>
+              <w:t xml:space="preserve">Fecha modificación: </w:t>
             </w:r>
           </w:p>
         </w:tc>
@@ -5481,21 +5144,15 @@
             </w:tcBorders>
           </w:tcPr>
           <w:p>
-            <w:pPr>
-              <w:ind w:left="3"/>
-            </w:pPr>
-            <w:r>
-              <w:rPr>
-                <w:rFonts w:ascii="Arial" w:eastAsia="Arial" w:hAnsi="Arial" w:cs="Arial"/>
-              </w:rPr>
-              <w:t xml:space="preserve">28/10/2026 </w:t>
-            </w:r>
-          </w:p>
-        </w:tc>
-      </w:tr>
-      <w:tr>
-        <w:trPr>
-          <w:trHeight w:val="480"/>
+            <w:r>
+              <w:t>28/10/2026</w:t>
+            </w:r>
+          </w:p>
+        </w:tc>
+      </w:tr>
+      <w:tr>
+        <w:trPr>
+          <w:trHeight w:val="1889"/>
         </w:trPr>
         <w:tc>
           <w:tcPr>
@@ -5514,7 +5171,7 @@
                 <w:rFonts w:ascii="Arial" w:eastAsia="Arial" w:hAnsi="Arial" w:cs="Arial"/>
                 <w:b/>
               </w:rPr>
-              <w:t xml:space="preserve">Fecha modificación: </w:t>
+              <w:t xml:space="preserve">Datos de entrada: </w:t>
             </w:r>
           </w:p>
         </w:tc>
@@ -5529,107 +5186,14 @@
             </w:tcBorders>
           </w:tcPr>
           <w:p>
-            <w:pPr>
-              <w:ind w:left="3"/>
-            </w:pPr>
-            <w:r>
-              <w:rPr>
-                <w:rFonts w:ascii="Arial" w:eastAsia="Arial" w:hAnsi="Arial" w:cs="Arial"/>
-              </w:rPr>
-              <w:t xml:space="preserve">28/10/2026 </w:t>
-            </w:r>
-          </w:p>
-        </w:tc>
-      </w:tr>
-      <w:tr>
-        <w:trPr>
-          <w:trHeight w:val="1889"/>
-        </w:trPr>
-        <w:tc>
-          <w:tcPr>
-            <w:tcW w:w="3473" w:type="dxa"/>
-            <w:tcBorders>
-              <w:top w:val="single" w:sz="5" w:space="0" w:color="000000"/>
-              <w:left w:val="single" w:sz="5" w:space="0" w:color="000000"/>
-              <w:bottom w:val="single" w:sz="5" w:space="0" w:color="000000"/>
-              <w:right w:val="single" w:sz="5" w:space="0" w:color="000000"/>
-            </w:tcBorders>
-            <w:shd w:val="clear" w:color="auto" w:fill="BDD7EE"/>
-          </w:tcPr>
-          <w:p>
-            <w:r>
-              <w:rPr>
-                <w:rFonts w:ascii="Arial" w:eastAsia="Arial" w:hAnsi="Arial" w:cs="Arial"/>
-                <w:b/>
-              </w:rPr>
-              <w:t xml:space="preserve">Datos de entrada: </w:t>
-            </w:r>
-          </w:p>
-        </w:tc>
-        <w:tc>
-          <w:tcPr>
-            <w:tcW w:w="5550" w:type="dxa"/>
-            <w:tcBorders>
-              <w:top w:val="single" w:sz="5" w:space="0" w:color="000000"/>
-              <w:left w:val="single" w:sz="5" w:space="0" w:color="000000"/>
-              <w:bottom w:val="single" w:sz="5" w:space="0" w:color="000000"/>
-              <w:right w:val="single" w:sz="5" w:space="0" w:color="000000"/>
-            </w:tcBorders>
-          </w:tcPr>
-          <w:p>
-            <w:pPr>
-              <w:spacing w:line="239" w:lineRule="auto"/>
-              <w:ind w:left="3"/>
-            </w:pPr>
-            <w:r>
-              <w:rPr>
-                <w:rFonts w:ascii="Arial" w:eastAsia="Arial" w:hAnsi="Arial" w:cs="Arial"/>
-              </w:rPr>
-              <w:t xml:space="preserve">from: escala de origen (celsius | fahrenheit | kelvin | newton | reaumur) </w:t>
-            </w:r>
-          </w:p>
-          <w:p>
-            <w:pPr>
-              <w:ind w:left="3"/>
-            </w:pPr>
-            <w:r>
-              <w:rPr>
-                <w:rFonts w:ascii="Arial" w:eastAsia="Arial" w:hAnsi="Arial" w:cs="Arial"/>
-              </w:rPr>
-              <w:t xml:space="preserve">to: escala de destino (celsius | fahrenheit | kelvin | newton | reaumur) </w:t>
-            </w:r>
-          </w:p>
-          <w:p>
-            <w:pPr>
-              <w:ind w:left="3"/>
-            </w:pPr>
-            <w:r>
-              <w:rPr>
-                <w:rFonts w:ascii="Arial" w:eastAsia="Arial" w:hAnsi="Arial" w:cs="Arial"/>
-              </w:rPr>
-              <w:t xml:space="preserve">value: valor numérico de temperatura a convertir </w:t>
-            </w:r>
-          </w:p>
-          <w:p>
-            <w:pPr>
-              <w:ind w:left="3"/>
-            </w:pPr>
-            <w:r>
-              <w:rPr>
-                <w:rFonts w:ascii="Arial" w:eastAsia="Arial" w:hAnsi="Arial" w:cs="Arial"/>
-              </w:rPr>
-              <w:t xml:space="preserve">(double) </w:t>
-            </w:r>
-          </w:p>
-          <w:p>
-            <w:pPr>
-              <w:ind w:left="3"/>
-            </w:pPr>
-            <w:r>
-              <w:rPr>
-                <w:rFonts w:ascii="Arial" w:eastAsia="Arial" w:hAnsi="Arial" w:cs="Arial"/>
-              </w:rPr>
-              <w:t xml:space="preserve">token: token UUID obtenido en CU-01 </w:t>
+            <w:r>
+              <w:t>from: escala de origen (celsius | fahrenheit | kelvin | newton | reaumur)</w:t>
+              <w:br/>
+              <w:t>to: escala de destino (celsius | fahrenheit | kelvin | newton | reaumur)</w:t>
+              <w:br/>
+              <w:t>value: valor numérico de temperatura a convertir (double, máx 16 caracteres)</w:t>
+              <w:br/>
+              <w:t>token: token UUID obtenido en CU-01</w:t>
             </w:r>
           </w:p>
         </w:tc>
@@ -5735,41 +5299,12 @@
             </w:tcBorders>
           </w:tcPr>
           <w:p>
-            <w:pPr>
-              <w:numPr>
-                <w:ilvl w:val="0"/>
-                <w:numId w:val="7"/>
-              </w:numPr>
-              <w:spacing w:after="2" w:line="239" w:lineRule="auto"/>
-            </w:pPr>
-            <w:r>
-              <w:rPr>
-                <w:rFonts w:ascii="Arial" w:eastAsia="Arial" w:hAnsi="Arial" w:cs="Arial"/>
-              </w:rPr>
-              <w:t xml:space="preserve">Éxito: el sistema retorna result con el valor convertido, success = true y message: "Conversión exitosa." </w:t>
-            </w:r>
-          </w:p>
-          <w:p>
-            <w:pPr>
-              <w:numPr>
-                <w:ilvl w:val="0"/>
-                <w:numId w:val="7"/>
-              </w:numPr>
-              <w:spacing w:line="238" w:lineRule="auto"/>
-            </w:pPr>
-            <w:r>
-              <w:t xml:space="preserve">Fallo por token: SOAP Fault / SOAP Fault / HTTP 401 con message: "Tu sesión expiró o el token no vale." </w:t>
-            </w:r>
-          </w:p>
-          <w:p>
-            <w:pPr>
-              <w:numPr>
-                <w:ilvl w:val="0"/>
-                <w:numId w:val="7"/>
-              </w:numPr>
-            </w:pPr>
-            <w:r>
-              <w:t xml:space="preserve">Fallo por escala: SOAP Fault / SOAP Fault / HTTP 400 con message: "Unidad de origen/destino no reconocida." </w:t>
+            <w:r>
+              <w:t>Éxito: el sistema retorna result con el valor convertido (a 2 decimales), success = true y message: "Conversión exitosa."</w:t>
+              <w:br/>
+              <w:t>Fallo por token: SOAP Fault (código 401) con message: "Tu sesión expiró o el token no vale."</w:t>
+              <w:br/>
+              <w:t>Fallo por escala: SOAP Fault (código 400) con message: "Unidad de origen/destino no reconocida."</w:t>
             </w:r>
           </w:p>
         </w:tc>
@@ -5949,6 +5484,49 @@
             </w:tcBorders>
           </w:tcPr>
           <w:p>
+            <w:r>
+              <w:t>El usuario invoca la operación SOAP convertirTemperatura con los parámetros token, valor, origen y destino.</w:t>
+            </w:r>
+          </w:p>
+        </w:tc>
+        <w:tc>
+          <w:tcPr>
+            <w:tcW w:w="5550" w:type="dxa"/>
+            <w:tcBorders>
+              <w:top w:val="single" w:sz="5" w:space="0" w:color="000000"/>
+              <w:left w:val="single" w:sz="5" w:space="0" w:color="000000"/>
+              <w:bottom w:val="single" w:sz="5" w:space="0" w:color="000000"/>
+              <w:right w:val="single" w:sz="5" w:space="0" w:color="000000"/>
+            </w:tcBorders>
+          </w:tcPr>
+          <w:p>
+            <w:pPr>
+              <w:ind w:left="123"/>
+            </w:pPr>
+            <w:r>
+              <w:rPr>
+                <w:rFonts w:ascii="Arial" w:eastAsia="Arial" w:hAnsi="Arial" w:cs="Arial"/>
+              </w:rPr>
+              <w:t xml:space="preserve">  </w:t>
+            </w:r>
+          </w:p>
+        </w:tc>
+      </w:tr>
+      <w:tr>
+        <w:trPr>
+          <w:trHeight w:val="706"/>
+        </w:trPr>
+        <w:tc>
+          <w:tcPr>
+            <w:tcW w:w="3473" w:type="dxa"/>
+            <w:tcBorders>
+              <w:top w:val="single" w:sz="5" w:space="0" w:color="000000"/>
+              <w:left w:val="single" w:sz="5" w:space="0" w:color="000000"/>
+              <w:bottom w:val="single" w:sz="5" w:space="0" w:color="000000"/>
+              <w:right w:val="single" w:sz="5" w:space="0" w:color="000000"/>
+            </w:tcBorders>
+          </w:tcPr>
+          <w:p>
             <w:pPr>
               <w:ind w:left="120"/>
             </w:pPr>
@@ -5956,9 +5534,47 @@
               <w:rPr>
                 <w:rFonts w:ascii="Arial" w:eastAsia="Arial" w:hAnsi="Arial" w:cs="Arial"/>
               </w:rPr>
-              <w:t xml:space="preserve">El usuario envía POST </w:t>
-            </w:r>
-          </w:p>
+              <w:t xml:space="preserve">  </w:t>
+            </w:r>
+          </w:p>
+        </w:tc>
+        <w:tc>
+          <w:tcPr>
+            <w:tcW w:w="5550" w:type="dxa"/>
+            <w:tcBorders>
+              <w:top w:val="single" w:sz="5" w:space="0" w:color="000000"/>
+              <w:left w:val="single" w:sz="5" w:space="0" w:color="000000"/>
+              <w:bottom w:val="single" w:sz="5" w:space="0" w:color="000000"/>
+              <w:right w:val="single" w:sz="5" w:space="0" w:color="000000"/>
+            </w:tcBorders>
+          </w:tcPr>
+          <w:p>
+            <w:pPr>
+              <w:ind w:left="123"/>
+            </w:pPr>
+            <w:r>
+              <w:rPr>
+                <w:rFonts w:ascii="Arial" w:eastAsia="Arial" w:hAnsi="Arial" w:cs="Arial"/>
+              </w:rPr>
+              <w:t xml:space="preserve">El sistema invoca CU-05 (Validar Token): verifica que el token exista en la colección en memoria. </w:t>
+            </w:r>
+          </w:p>
+        </w:tc>
+      </w:tr>
+      <w:tr>
+        <w:trPr>
+          <w:trHeight w:val="914"/>
+        </w:trPr>
+        <w:tc>
+          <w:tcPr>
+            <w:tcW w:w="3473" w:type="dxa"/>
+            <w:tcBorders>
+              <w:top w:val="single" w:sz="5" w:space="0" w:color="000000"/>
+              <w:left w:val="single" w:sz="5" w:space="0" w:color="000000"/>
+              <w:bottom w:val="single" w:sz="5" w:space="0" w:color="000000"/>
+              <w:right w:val="single" w:sz="5" w:space="0" w:color="000000"/>
+            </w:tcBorders>
+          </w:tcPr>
           <w:p>
             <w:pPr>
               <w:ind w:left="120"/>
@@ -5967,7 +5583,7 @@
               <w:rPr>
                 <w:rFonts w:ascii="Arial" w:eastAsia="Arial" w:hAnsi="Arial" w:cs="Arial"/>
               </w:rPr>
-              <w:t xml:space="preserve">/conversor/temperatura con los campos from, to, value y token. </w:t>
+              <w:t xml:space="preserve">  </w:t>
             </w:r>
           </w:p>
         </w:tc>
@@ -5989,10 +5605,70 @@
               <w:rPr>
                 <w:rFonts w:ascii="Arial" w:eastAsia="Arial" w:hAnsi="Arial" w:cs="Arial"/>
               </w:rPr>
+              <w:t xml:space="preserve">Token válido. El sistema invoca CU-06 (Validar Unidades): verifica que from y to sean escalas de temperatura reconocidas. </w:t>
+            </w:r>
+          </w:p>
+        </w:tc>
+      </w:tr>
+      <w:tr>
+        <w:trPr>
+          <w:trHeight w:val="878"/>
+        </w:trPr>
+        <w:tc>
+          <w:tcPr>
+            <w:tcW w:w="3473" w:type="dxa"/>
+            <w:tcBorders>
+              <w:top w:val="single" w:sz="5" w:space="0" w:color="000000"/>
+              <w:left w:val="single" w:sz="5" w:space="0" w:color="000000"/>
+              <w:bottom w:val="single" w:sz="5" w:space="0" w:color="000000"/>
+              <w:right w:val="single" w:sz="5" w:space="0" w:color="000000"/>
+            </w:tcBorders>
+          </w:tcPr>
+          <w:p>
+            <w:pPr>
+              <w:ind w:left="120"/>
+            </w:pPr>
+            <w:r>
+              <w:rPr>
+                <w:rFonts w:ascii="Arial" w:eastAsia="Arial" w:hAnsi="Arial" w:cs="Arial"/>
+              </w:rPr>
               <w:t xml:space="preserve">  </w:t>
             </w:r>
           </w:p>
         </w:tc>
+        <w:tc>
+          <w:tcPr>
+            <w:tcW w:w="5550" w:type="dxa"/>
+            <w:tcBorders>
+              <w:top w:val="single" w:sz="5" w:space="0" w:color="000000"/>
+              <w:left w:val="single" w:sz="5" w:space="0" w:color="000000"/>
+              <w:bottom w:val="single" w:sz="5" w:space="0" w:color="000000"/>
+              <w:right w:val="single" w:sz="5" w:space="0" w:color="000000"/>
+            </w:tcBorders>
+          </w:tcPr>
+          <w:p>
+            <w:pPr>
+              <w:ind w:left="123"/>
+            </w:pPr>
+            <w:r>
+              <w:rPr>
+                <w:rFonts w:ascii="Arial" w:eastAsia="Arial" w:hAnsi="Arial" w:cs="Arial"/>
+              </w:rPr>
+              <w:t xml:space="preserve">Escalas válidas. El sistema invoca </w:t>
+            </w:r>
+          </w:p>
+          <w:p>
+            <w:pPr>
+              <w:ind w:left="123"/>
+            </w:pPr>
+            <w:r>
+              <w:rPr>
+                <w:rFonts w:ascii="Arial" w:eastAsia="Arial" w:hAnsi="Arial" w:cs="Arial"/>
+              </w:rPr>
+              <w:t xml:space="preserve">ConversorTemperatura y aplica la fórmula correspondiente. </w:t>
+            </w:r>
+          </w:p>
+        </w:tc>
       </w:tr>
       <w:tr>
         <w:trPr>
@@ -6031,172 +5707,8 @@
             </w:tcBorders>
           </w:tcPr>
           <w:p>
-            <w:pPr>
-              <w:ind w:left="123"/>
-            </w:pPr>
-            <w:r>
-              <w:rPr>
-                <w:rFonts w:ascii="Arial" w:eastAsia="Arial" w:hAnsi="Arial" w:cs="Arial"/>
-              </w:rPr>
-              <w:t xml:space="preserve">El sistema invoca CU-05 (Validar Token): verifica que el token exista en la memoria RAM volátil (ConcurrentHashMap). </w:t>
-            </w:r>
-          </w:p>
-        </w:tc>
-      </w:tr>
-      <w:tr>
-        <w:trPr>
-          <w:trHeight w:val="914"/>
-        </w:trPr>
-        <w:tc>
-          <w:tcPr>
-            <w:tcW w:w="3473" w:type="dxa"/>
-            <w:tcBorders>
-              <w:top w:val="single" w:sz="5" w:space="0" w:color="000000"/>
-              <w:left w:val="single" w:sz="5" w:space="0" w:color="000000"/>
-              <w:bottom w:val="single" w:sz="5" w:space="0" w:color="000000"/>
-              <w:right w:val="single" w:sz="5" w:space="0" w:color="000000"/>
-            </w:tcBorders>
-          </w:tcPr>
-          <w:p>
-            <w:pPr>
-              <w:ind w:left="120"/>
-            </w:pPr>
-            <w:r>
-              <w:rPr>
-                <w:rFonts w:ascii="Arial" w:eastAsia="Arial" w:hAnsi="Arial" w:cs="Arial"/>
-              </w:rPr>
-              <w:t xml:space="preserve">  </w:t>
-            </w:r>
-          </w:p>
-        </w:tc>
-        <w:tc>
-          <w:tcPr>
-            <w:tcW w:w="5550" w:type="dxa"/>
-            <w:tcBorders>
-              <w:top w:val="single" w:sz="5" w:space="0" w:color="000000"/>
-              <w:left w:val="single" w:sz="5" w:space="0" w:color="000000"/>
-              <w:bottom w:val="single" w:sz="5" w:space="0" w:color="000000"/>
-              <w:right w:val="single" w:sz="5" w:space="0" w:color="000000"/>
-            </w:tcBorders>
-          </w:tcPr>
-          <w:p>
-            <w:pPr>
-              <w:ind w:left="123"/>
-            </w:pPr>
-            <w:r>
-              <w:rPr>
-                <w:rFonts w:ascii="Arial" w:eastAsia="Arial" w:hAnsi="Arial" w:cs="Arial"/>
-              </w:rPr>
-              <w:t xml:space="preserve">Token válido. El sistema invoca CU-06 (Validar Unidades): verifica que from y to sean escalas de temperatura reconocidas. </w:t>
-            </w:r>
-          </w:p>
-        </w:tc>
-      </w:tr>
-      <w:tr>
-        <w:trPr>
-          <w:trHeight w:val="878"/>
-        </w:trPr>
-        <w:tc>
-          <w:tcPr>
-            <w:tcW w:w="3473" w:type="dxa"/>
-            <w:tcBorders>
-              <w:top w:val="single" w:sz="5" w:space="0" w:color="000000"/>
-              <w:left w:val="single" w:sz="5" w:space="0" w:color="000000"/>
-              <w:bottom w:val="single" w:sz="5" w:space="0" w:color="000000"/>
-              <w:right w:val="single" w:sz="5" w:space="0" w:color="000000"/>
-            </w:tcBorders>
-          </w:tcPr>
-          <w:p>
-            <w:pPr>
-              <w:ind w:left="120"/>
-            </w:pPr>
-            <w:r>
-              <w:rPr>
-                <w:rFonts w:ascii="Arial" w:eastAsia="Arial" w:hAnsi="Arial" w:cs="Arial"/>
-              </w:rPr>
-              <w:t xml:space="preserve">  </w:t>
-            </w:r>
-          </w:p>
-        </w:tc>
-        <w:tc>
-          <w:tcPr>
-            <w:tcW w:w="5550" w:type="dxa"/>
-            <w:tcBorders>
-              <w:top w:val="single" w:sz="5" w:space="0" w:color="000000"/>
-              <w:left w:val="single" w:sz="5" w:space="0" w:color="000000"/>
-              <w:bottom w:val="single" w:sz="5" w:space="0" w:color="000000"/>
-              <w:right w:val="single" w:sz="5" w:space="0" w:color="000000"/>
-            </w:tcBorders>
-          </w:tcPr>
-          <w:p>
-            <w:pPr>
-              <w:ind w:left="123"/>
-            </w:pPr>
-            <w:r>
-              <w:rPr>
-                <w:rFonts w:ascii="Arial" w:eastAsia="Arial" w:hAnsi="Arial" w:cs="Arial"/>
-              </w:rPr>
-              <w:t xml:space="preserve">Escalas válidas. El sistema invoca </w:t>
-            </w:r>
-          </w:p>
-          <w:p>
-            <w:pPr>
-              <w:ind w:left="123"/>
-            </w:pPr>
-            <w:r>
-              <w:rPr>
-                <w:rFonts w:ascii="Arial" w:eastAsia="Arial" w:hAnsi="Arial" w:cs="Arial"/>
-              </w:rPr>
-              <w:t xml:space="preserve">ConversorTemperatura y aplica la fórmula correspondiente. </w:t>
-            </w:r>
-          </w:p>
-        </w:tc>
-      </w:tr>
-      <w:tr>
-        <w:trPr>
-          <w:trHeight w:val="706"/>
-        </w:trPr>
-        <w:tc>
-          <w:tcPr>
-            <w:tcW w:w="3473" w:type="dxa"/>
-            <w:tcBorders>
-              <w:top w:val="single" w:sz="5" w:space="0" w:color="000000"/>
-              <w:left w:val="single" w:sz="5" w:space="0" w:color="000000"/>
-              <w:bottom w:val="single" w:sz="5" w:space="0" w:color="000000"/>
-              <w:right w:val="single" w:sz="5" w:space="0" w:color="000000"/>
-            </w:tcBorders>
-          </w:tcPr>
-          <w:p>
-            <w:pPr>
-              <w:ind w:left="120"/>
-            </w:pPr>
-            <w:r>
-              <w:rPr>
-                <w:rFonts w:ascii="Arial" w:eastAsia="Arial" w:hAnsi="Arial" w:cs="Arial"/>
-              </w:rPr>
-              <w:t xml:space="preserve">  </w:t>
-            </w:r>
-          </w:p>
-        </w:tc>
-        <w:tc>
-          <w:tcPr>
-            <w:tcW w:w="5550" w:type="dxa"/>
-            <w:tcBorders>
-              <w:top w:val="single" w:sz="5" w:space="0" w:color="000000"/>
-              <w:left w:val="single" w:sz="5" w:space="0" w:color="000000"/>
-              <w:bottom w:val="single" w:sz="5" w:space="0" w:color="000000"/>
-              <w:right w:val="single" w:sz="5" w:space="0" w:color="000000"/>
-            </w:tcBorders>
-          </w:tcPr>
-          <w:p>
-            <w:pPr>
-              <w:ind w:left="123"/>
-            </w:pPr>
-            <w:r>
-              <w:rPr>
-                <w:rFonts w:ascii="Arial" w:eastAsia="Arial" w:hAnsi="Arial" w:cs="Arial"/>
-              </w:rPr>
-              <w:t xml:space="preserve">El sistema retorna result con el valor convertido, success = true y message: "Conversión exitosa." </w:t>
+            <w:r>
+              <w:t>El servidor retorna la respuesta SOAP estructurada con el valor convertido (formateado a 2 decimales), success = true y message: "Conversión exitosa."</w:t>
             </w:r>
           </w:p>
         </w:tc>
@@ -6293,27 +5805,8 @@
             </w:tcBorders>
           </w:tcPr>
           <w:p>
-            <w:pPr>
-              <w:ind w:left="120"/>
-            </w:pPr>
-            <w:r>
-              <w:t>• Token inválido o expirado (CU-05): SOAP Fault / SOAP Fault / SOAP Fault / SOAP Fault / HTTP 401, message: "Tu sesión expiró o el token no vale." Se sugiere volver a CU-01.</w:t>
-            </w:r>
-          </w:p>
-          <w:p>
-            <w:pPr>
-              <w:ind w:left="120"/>
-            </w:pPr>
-            <w:r>
-              <w:t>• Escala de origen no reconocida (CU-06): SOAP Fault / SOAP Fault / SOAP Fault / SOAP Fault / HTTP 400, message: "Unidad de origen no reconocida."</w:t>
-            </w:r>
-          </w:p>
-          <w:p>
-            <w:pPr>
-              <w:ind w:left="120"/>
-            </w:pPr>
-            <w:r>
-              <w:t>• Escala de destino no reconocida (CU-06): SOAP Fault / SOAP Fault / SOAP Fault / SOAP Fault / HTTP 400, message: "Unidad de destino no reconocida."</w:t>
+            <w:r>
+              <w:t>• Token inválido o expirado (CU-05): SOAP Fault (código 401), message: "Tu sesión expiró o el token no vale." Se sugiere volver a CU-01. • Escala de origen no reconocida (CU-06): SOAP Fault (código 400), message: "Unidad de origen no reconocida." • Escala de destino no reconocida (CU-06): SOAP Fault (código 400), message: "Unidad de destino no reconocida."</w:t>
             </w:r>
           </w:p>
         </w:tc>
@@ -6924,14 +6417,8 @@
             </w:tcBorders>
           </w:tcPr>
           <w:p>
-            <w:pPr>
-              <w:ind w:left="123"/>
-            </w:pPr>
-            <w:r>
-              <w:rPr>
-                <w:rFonts w:ascii="Arial" w:eastAsia="Arial" w:hAnsi="Arial" w:cs="Arial"/>
-              </w:rPr>
-              <w:t xml:space="preserve">Julio Enrique Viche Castillo (GR09) </w:t>
+            <w:r>
+              <w:t>Julio Enrique Viche Castillo (GR09)</w:t>
             </w:r>
           </w:p>
         </w:tc>
@@ -6988,14 +6475,8 @@
             </w:tcBorders>
           </w:tcPr>
           <w:p>
-            <w:pPr>
-              <w:ind w:left="123"/>
-            </w:pPr>
-            <w:r>
-              <w:rPr>
-                <w:rFonts w:ascii="Arial" w:eastAsia="Arial" w:hAnsi="Arial" w:cs="Arial"/>
-              </w:rPr>
-              <w:t xml:space="preserve">28/10/2026 </w:t>
+            <w:r>
+              <w:t>28/10/2026</w:t>
             </w:r>
           </w:p>
         </w:tc>
@@ -7052,14 +6533,8 @@
             </w:tcBorders>
           </w:tcPr>
           <w:p>
-            <w:pPr>
-              <w:ind w:left="123"/>
-            </w:pPr>
-            <w:r>
-              <w:rPr>
-                <w:rFonts w:ascii="Arial" w:eastAsia="Arial" w:hAnsi="Arial" w:cs="Arial"/>
-              </w:rPr>
-              <w:t xml:space="preserve">28/10/2026 </w:t>
+            <w:r>
+              <w:t>28/10/2026</w:t>
             </w:r>
           </w:p>
         </w:tc>
@@ -7116,14 +6591,8 @@
             </w:tcBorders>
           </w:tcPr>
           <w:p>
-            <w:pPr>
-              <w:ind w:left="123"/>
-            </w:pPr>
-            <w:r>
-              <w:rPr>
-                <w:rFonts w:ascii="Arial" w:eastAsia="Arial" w:hAnsi="Arial" w:cs="Arial"/>
-              </w:rPr>
-              <w:t xml:space="preserve">token: valor UUID recibido en el cuerpo de la solicitud (campo token en la cabecera/cuerpo SOAP) </w:t>
+            <w:r>
+              <w:t>token: valor UUID recibido en la cabecera/cuerpo del sobre SOAP de la petición.</w:t>
             </w:r>
           </w:p>
         </w:tc>
@@ -7261,41 +6730,10 @@
             </w:tcBorders>
           </w:tcPr>
           <w:p>
-            <w:pPr>
-              <w:numPr>
-                <w:ilvl w:val="0"/>
-                <w:numId w:val="9"/>
-              </w:numPr>
-              <w:ind w:right="22"/>
-            </w:pPr>
-            <w:r>
-              <w:rPr>
-                <w:rFonts w:ascii="Arial" w:eastAsia="Arial" w:hAnsi="Arial" w:cs="Arial"/>
-              </w:rPr>
-              <w:t xml:space="preserve">Éxito: el token existe en la memoria RAM volátil (ConcurrentHashMap) → el flujo continúa hacia CU-06 o la conversión. </w:t>
-            </w:r>
-          </w:p>
-          <w:p>
-            <w:pPr>
-              <w:numPr>
-                <w:ilvl w:val="0"/>
-                <w:numId w:val="9"/>
-              </w:numPr>
-              <w:ind w:right="22"/>
-            </w:pPr>
-            <w:r>
-              <w:rPr>
-                <w:rFonts w:ascii="Arial" w:eastAsia="Arial" w:hAnsi="Arial" w:cs="Arial"/>
-              </w:rPr>
-              <w:t xml:space="preserve">Fallo: el token es nulo, vacío o no existe en memoria </w:t>
-            </w:r>
-          </w:p>
-          <w:p>
-            <w:pPr>
-              <w:ind w:left="123"/>
-            </w:pPr>
-            <w:r>
-              <w:t xml:space="preserve">→ SOAP Fault / SOAP Fault / HTTP 401 con message: "Tu sesión expiró o el token no vale." </w:t>
+            <w:r>
+              <w:t>Éxito: el token existe en la colección en memoria → el flujo continúa hacia CU-06 o la conversión.</w:t>
+              <w:br/>
+              <w:t>Fallo: el token es nulo, vacío o no existe en memoria → SOAP Fault (código 401) con message: "Tu sesión expiró o el token no vale."</w:t>
             </w:r>
           </w:p>
         </w:tc>
@@ -7516,7 +6954,7 @@
               <w:rPr>
                 <w:rFonts w:ascii="Arial" w:eastAsia="Arial" w:hAnsi="Arial" w:cs="Arial"/>
               </w:rPr>
-              <w:t xml:space="preserve">El sistema extrae el campo token del solicitud SOAP de conversión recibido. </w:t>
+              <w:t xml:space="preserve">El sistema extrae el campo token del objeto Conversion recibido. </w:t>
             </w:r>
           </w:p>
         </w:tc>
@@ -7607,14 +7045,8 @@
             </w:tcBorders>
           </w:tcPr>
           <w:p>
-            <w:pPr>
-              <w:ind w:left="123"/>
-            </w:pPr>
-            <w:r>
-              <w:rPr>
-                <w:rFonts w:ascii="Arial" w:eastAsia="Arial" w:hAnsi="Arial" w:cs="Arial"/>
-              </w:rPr>
-              <w:t xml:space="preserve">El sistema busca el token en la colección de tokens activos almacenada en memoria (ServicioAuth). </w:t>
+            <w:r>
+              <w:t>El sistema busca el token en la colección de tokens activos almacenada en memoria RAM volátil (ConcurrentHashMap en ServicioAuth).</w:t>
             </w:r>
           </w:p>
         </w:tc>
@@ -7711,30 +7143,8 @@
             </w:tcBorders>
           </w:tcPr>
           <w:p>
-            <w:pPr>
-              <w:ind w:left="120"/>
-            </w:pPr>
-            <w:r>
-              <w:t>• Token nulo o vacío: el sistema retorna SOAP Fault / SOAP Fault / SOAP Fault / SOAP Fault / HTTP 401 con message: "Tu sesión expiró o el token no vale."</w:t>
-            </w:r>
-          </w:p>
-          <w:p>
-            <w:pPr>
-              <w:ind w:left="120"/>
-            </w:pPr>
-            <w:r>
-              <w:t>• Token no encontrado en memoria (sesión expirada o servidor reiniciado): SOAP Fault / SOAP Fault / SOAP Fault / SOAP Fault / HTTP 401 con message: "Tu sesión expiró o el token no vale."</w:t>
-            </w:r>
-          </w:p>
-          <w:p>
-            <w:pPr>
-              <w:ind w:left="120"/>
-            </w:pPr>
-            <w:r>
-              <w:rPr>
-                <w:rFonts w:ascii="Arial" w:eastAsia="Arial" w:hAnsi="Arial" w:cs="Arial"/>
-              </w:rPr>
-              <w:t>→ En este caso el extend hacia CU-01 indica que el usuario debe volver a iniciar sesión para obtener un nuevo token.</w:t>
+            <w:r>
+              <w:t>• Token nulo o vacío: el sistema retorna SOAP Fault (código 401) con message: "Tu sesión expiró o el token no vale." • Token no encontrado en memoria: SOAP Fault (código 401). El extend hacia CU-01 indica que el usuario debe volver a autenticarse.</w:t>
             </w:r>
           </w:p>
         </w:tc>
@@ -8241,14 +7651,8 @@
             </w:tcBorders>
           </w:tcPr>
           <w:p>
-            <w:pPr>
-              <w:ind w:left="3"/>
-            </w:pPr>
-            <w:r>
-              <w:rPr>
-                <w:rFonts w:ascii="Arial" w:eastAsia="Arial" w:hAnsi="Arial" w:cs="Arial"/>
-              </w:rPr>
-              <w:t xml:space="preserve">Julio Enrique Viche Castillo (GR09) </w:t>
+            <w:r>
+              <w:t>Julio Enrique Viche Castillo (GR09)</w:t>
             </w:r>
           </w:p>
         </w:tc>
@@ -8289,14 +7693,8 @@
             </w:tcBorders>
           </w:tcPr>
           <w:p>
-            <w:pPr>
-              <w:ind w:left="3"/>
-            </w:pPr>
-            <w:r>
-              <w:rPr>
-                <w:rFonts w:ascii="Arial" w:eastAsia="Arial" w:hAnsi="Arial" w:cs="Arial"/>
-              </w:rPr>
-              <w:t xml:space="preserve">28/10/2026 </w:t>
+            <w:r>
+              <w:t>28/10/2026</w:t>
             </w:r>
           </w:p>
         </w:tc>
@@ -8337,14 +7735,8 @@
             </w:tcBorders>
           </w:tcPr>
           <w:p>
-            <w:pPr>
-              <w:ind w:left="3"/>
-            </w:pPr>
-            <w:r>
-              <w:rPr>
-                <w:rFonts w:ascii="Arial" w:eastAsia="Arial" w:hAnsi="Arial" w:cs="Arial"/>
-              </w:rPr>
-              <w:t xml:space="preserve">28/10/2026 </w:t>
+            <w:r>
+              <w:t>28/10/2026</w:t>
             </w:r>
           </w:p>
         </w:tc>
@@ -8385,26 +7777,19 @@
             </w:tcBorders>
           </w:tcPr>
           <w:p>
-            <w:pPr>
-              <w:spacing w:after="2" w:line="238" w:lineRule="auto"/>
-              <w:ind w:left="3" w:right="809"/>
-            </w:pPr>
-            <w:r>
-              <w:rPr>
-                <w:rFonts w:ascii="Arial" w:eastAsia="Arial" w:hAnsi="Arial" w:cs="Arial"/>
-              </w:rPr>
-              <w:t xml:space="preserve">from: nombre de la unidad de origen (string) to: nombre de la unidad de destino (string) </w:t>
-            </w:r>
-          </w:p>
-          <w:p>
-            <w:pPr>
-              <w:ind w:left="3"/>
-            </w:pPr>
-            <w:r>
-              <w:rPr>
-                <w:rFonts w:ascii="Arial" w:eastAsia="Arial" w:hAnsi="Arial" w:cs="Arial"/>
-              </w:rPr>
-              <w:t xml:space="preserve">El catálogo de unidades válidas por tipo: Longitud: centimetros, metros, pies, yardas, millas | Masa: gramos, kilogramos, onzas, libras, quintales | Temperatura: celsius, fahrenheit, kelvin, newton, reaumur </w:t>
+            <w:r>
+              <w:t>from: nombre de la unidad de origen (string)</w:t>
+              <w:br/>
+              <w:t>to: nombre de la unidad de destino (string)</w:t>
+              <w:br/>
+              <w:br/>
+              <w:t>El catálogo estricto de exactamente 5 unidades por magnitud:</w:t>
+              <w:br/>
+              <w:t>• Longitud: metro, centimetro, pie, yarda, milla</w:t>
+              <w:br/>
+              <w:t>• Masa: kilogramo, gramo, libra, onza, quintal</w:t>
+              <w:br/>
+              <w:t>• Temperatura: celsius, fahrenheit, kelvin, newton, reaumur</w:t>
             </w:r>
           </w:p>
         </w:tc>
@@ -8511,23 +7896,8 @@
             </w:tcBorders>
           </w:tcPr>
           <w:p>
-            <w:pPr>
-              <w:spacing w:after="2" w:line="239" w:lineRule="auto"/>
-              <w:ind w:left="3" w:right="61"/>
-            </w:pPr>
-            <w:r>
-              <w:t xml:space="preserve">• Éxito: ambas unidades son reconocidas → el flujo continúa hacia el cálculo de conversión. • Fallo por unidad de origen: SOAP Fault / SOAP Fault / HTTP 400 con message: "Unidad de origen no reconocida." • Fallo por unidad de destino: SOAP Fault / SOAP Fault / HTTP 400 con message: </w:t>
-            </w:r>
-          </w:p>
-          <w:p>
-            <w:pPr>
-              <w:ind w:left="3"/>
-            </w:pPr>
-            <w:r>
-              <w:rPr>
-                <w:rFonts w:ascii="Arial" w:eastAsia="Arial" w:hAnsi="Arial" w:cs="Arial"/>
-              </w:rPr>
-              <w:t xml:space="preserve">"Unidad de destino no reconocida." </w:t>
+            <w:r>
+              <w:t>• Éxito: ambas unidades son reconocidas → el flujo continúa hacia el cálculo de conversión. • Fallo por unidad de origen: SOAP Fault (código 400) con message: "Unidad de origen no reconocida." • Fallo por unidad de destino: SOAP Fault (código 400) con message: "Unidad de destino no reconocida."</w:t>
             </w:r>
           </w:p>
         </w:tc>
@@ -8734,7 +8104,7 @@
               <w:rPr>
                 <w:rFonts w:ascii="Arial" w:eastAsia="Arial" w:hAnsi="Arial" w:cs="Arial"/>
               </w:rPr>
-              <w:t xml:space="preserve">El sistema recibe los campos from y to del solicitud SOAP de conversión. </w:t>
+              <w:t xml:space="preserve">El sistema recibe los campos from y to del objeto Conversion. </w:t>
             </w:r>
           </w:p>
         </w:tc>
@@ -8978,27 +8348,8 @@
             </w:tcBorders>
           </w:tcPr>
           <w:p>
-            <w:pPr>
-              <w:ind w:left="120"/>
-            </w:pPr>
-            <w:r>
-              <w:t>• Unidad de origen no reconocida: SOAP Fault / SOAP Fault / SOAP Fault / SOAP Fault / HTTP 400 con message: "Unidad de origen no reconocida."</w:t>
-            </w:r>
-          </w:p>
-          <w:p>
-            <w:pPr>
-              <w:ind w:left="120"/>
-            </w:pPr>
-            <w:r>
-              <w:t>• Unidad de destino no reconocida: SOAP Fault / SOAP Fault / SOAP Fault / SOAP Fault / HTTP 400 con message: "Unidad de destino no reconocida."</w:t>
-            </w:r>
-          </w:p>
-          <w:p>
-            <w:pPr>
-              <w:ind w:left="120"/>
-            </w:pPr>
-            <w:r>
-              <w:t>• Ambas unidades inválidas: el sistema retorna el primer error detectado (from) con SOAP Fault / SOAP Fault / SOAP Fault / SOAP Fault / HTTP 400.</w:t>
+            <w:r>
+              <w:t>• Unidad de origen no reconocida: SOAP Fault (código 400) con message: "Unidad de origen no reconocida." • Unidad de destino no reconocida: SOAP Fault (código 400) con message: "Unidad de destino no reconocida." • Ambas unidades inválidas: SOAP Fault (código 400).</w:t>
             </w:r>
           </w:p>
         </w:tc>

</xml_diff>

<commit_message>
docs: ajustar autores de CU a primer nombre y apellido y parchear imagenes PowerDesigner para .NET
</commit_message>
<xml_diff>
--- a/TI.1.1. PAO202651_SOAP_JAVA_SINBDD_NRC36884_GR09/01. UML/02. ECUD/ECUD_SOAP_JAVA_SINBDD_GR09.docx
+++ b/TI.1.1. PAO202651_SOAP_JAVA_SINBDD_NRC36884_GR09/01. UML/02. ECUD/ECUD_SOAP_JAVA_SINBDD_GR09.docx
@@ -4332,7 +4332,7 @@
                 <w:szCs w:val="22"/>
                 <w:lang w:val="es-US" w:eastAsia="en-US" w:bidi="ar-SA"/>
               </w:rPr>
-              <w:t>Viche Castillo, Julio Enrique; Murillo Medina, Gabriel Omar.</w:t>
+              <w:t>Julio Viche, Gabriel Murillo</w:t>
             </w:r>
           </w:p>
         </w:tc>
@@ -6413,7 +6413,7 @@
                 <w:szCs w:val="22"/>
                 <w:lang w:val="es-US" w:eastAsia="en-US" w:bidi="ar-SA"/>
               </w:rPr>
-              <w:t>Viche Castillo, Julio Enrique; Murillo Medina, Gabriel Omar.</w:t>
+              <w:t>Julio Viche, Gabriel Murillo</w:t>
             </w:r>
           </w:p>
         </w:tc>
@@ -8532,7 +8532,7 @@
                 <w:szCs w:val="22"/>
                 <w:lang w:val="es-US" w:eastAsia="en-US" w:bidi="ar-SA"/>
               </w:rPr>
-              <w:t>Viche Castillo, Julio Enrique; Murillo Medina, Gabriel Omar.</w:t>
+              <w:t>Julio Viche, Gabriel Murillo</w:t>
             </w:r>
           </w:p>
         </w:tc>
@@ -10688,7 +10688,7 @@
                 <w:szCs w:val="22"/>
                 <w:lang w:val="es-US" w:eastAsia="en-US" w:bidi="ar-SA"/>
               </w:rPr>
-              <w:t>Viche Castillo, Julio Enrique; Murillo Medina, Gabriel Omar.</w:t>
+              <w:t>Julio Viche, Gabriel Murillo</w:t>
             </w:r>
           </w:p>
         </w:tc>

</xml_diff>

<commit_message>
fix(ecud): estructurar diagramas inline, remover saltos y sincronizar los 4 proyectos
</commit_message>
<xml_diff>
--- a/TI.1.1. PAO202651_SOAP_JAVA_SINBDD_NRC36884_GR09/01. UML/02. ECUD/ECUD_SOAP_JAVA_SINBDD_GR09.docx
+++ b/TI.1.1. PAO202651_SOAP_JAVA_SINBDD_NRC36884_GR09/01. UML/02. ECUD/ECUD_SOAP_JAVA_SINBDD_GR09.docx
@@ -2877,6 +2877,7 @@
         </w:p>
         <w:p>
           <w:pPr>
+            <w:keepWithNext/>
             <w:pStyle w:val="TOC2"/>
             <w:tabs>
               <w:tab w:val="clear" w:pos="708"/>
@@ -2897,6 +2898,7 @@
         </w:p>
         <w:p>
           <w:pPr>
+            <w:keepWithNext/>
             <w:pStyle w:val="TOC2"/>
             <w:tabs>
               <w:tab w:val="clear" w:pos="708"/>
@@ -2917,6 +2919,7 @@
         </w:p>
         <w:p>
           <w:pPr>
+            <w:keepWithNext/>
             <w:pStyle w:val="TOC2"/>
             <w:tabs>
               <w:tab w:val="clear" w:pos="708"/>
@@ -2937,6 +2940,7 @@
         </w:p>
         <w:p>
           <w:pPr>
+            <w:keepWithNext/>
             <w:pStyle w:val="TOC2"/>
             <w:tabs>
               <w:tab w:val="clear" w:pos="708"/>
@@ -3625,6 +3629,7 @@
     </w:p>
     <w:p>
       <w:pPr>
+        <w:keepWithNext/>
         <w:pStyle w:val="Heading2"/>
         <w:rPr/>
       </w:pPr>
@@ -3643,6 +3648,7 @@
     </w:p>
     <w:p>
       <w:pPr>
+        <w:keepWithNext/>
         <w:pStyle w:val="BodyText"/>
         <w:rPr/>
       </w:pPr>
@@ -3728,6 +3734,7 @@
       </w:tblGrid>
       <w:tr>
         <w:trPr>
+          <w:cantSplit/>
           <w:trHeight w:val="257" w:hRule="atLeast"/>
           <w:cnfStyle w:val="000000100000" w:firstRow="0" w:lastRow="0" w:firstColumn="0" w:lastColumn="0" w:oddVBand="0" w:evenVBand="0" w:oddHBand="1" w:evenHBand="0" w:firstRowFirstColumn="0" w:firstRowLastColumn="0" w:lastRowFirstColumn="0" w:lastRowLastColumn="0"/>
         </w:trPr>
@@ -3812,6 +3819,7 @@
       </w:tr>
       <w:tr>
         <w:trPr>
+          <w:cantSplit/>
           <w:trHeight w:val="119" w:hRule="atLeast"/>
         </w:trPr>
         <w:tc>
@@ -3896,6 +3904,7 @@
       </w:tr>
       <w:tr>
         <w:trPr>
+          <w:cantSplit/>
           <w:trHeight w:val="510" w:hRule="atLeast"/>
           <w:cnfStyle w:val="000000100000" w:firstRow="0" w:lastRow="0" w:firstColumn="0" w:lastColumn="0" w:oddVBand="0" w:evenVBand="0" w:oddHBand="1" w:evenHBand="0" w:firstRowFirstColumn="0" w:firstRowLastColumn="0" w:lastRowFirstColumn="0" w:lastRowLastColumn="0"/>
         </w:trPr>
@@ -3966,13 +3975,14 @@
             </w:r>
             <w:r>
               <w:rPr/>
-              <w:t>seguro a los operaciones del servicio web SOAP.</w:t>
+              <w:t>seguro a los operaciones del servicio web SOAP (JAX-WS).</w:t>
             </w:r>
           </w:p>
         </w:tc>
       </w:tr>
       <w:tr>
         <w:trPr>
+          <w:cantSplit/>
           <w:trHeight w:val="510" w:hRule="atLeast"/>
         </w:trPr>
         <w:tc>
@@ -4073,7 +4083,7 @@
                 <w:szCs w:val="22"/>
                 <w:lang w:eastAsia="en-US" w:bidi="ar-SA"/>
               </w:rPr>
-              <w:t>operaciones del servicio web SOAP</w:t>
+              <w:t>operaciones del servicio web SOAP (JAX-WS)</w:t>
             </w:r>
             <w:r>
               <w:rPr>
@@ -4094,6 +4104,7 @@
       </w:tr>
       <w:tr>
         <w:trPr>
+          <w:cantSplit/>
           <w:trHeight w:val="347" w:hRule="atLeast"/>
           <w:cnfStyle w:val="000000100000" w:firstRow="0" w:lastRow="0" w:firstColumn="0" w:lastColumn="0" w:oddVBand="0" w:evenVBand="0" w:oddHBand="1" w:evenHBand="0" w:firstRowFirstColumn="0" w:firstRowLastColumn="0" w:lastRowFirstColumn="0" w:lastRowLastColumn="0"/>
         </w:trPr>
@@ -4259,6 +4270,7 @@
       </w:tr>
       <w:tr>
         <w:trPr>
+          <w:cantSplit/>
           <w:trHeight w:val="241" w:hRule="atLeast"/>
         </w:trPr>
         <w:tc>
@@ -4339,6 +4351,7 @@
       </w:tr>
       <w:tr>
         <w:trPr>
+          <w:cantSplit/>
           <w:trHeight w:val="291" w:hRule="atLeast"/>
           <w:cnfStyle w:val="000000100000" w:firstRow="0" w:lastRow="0" w:firstColumn="0" w:lastColumn="0" w:oddVBand="0" w:evenVBand="0" w:oddHBand="1" w:evenHBand="0" w:firstRowFirstColumn="0" w:firstRowLastColumn="0" w:lastRowFirstColumn="0" w:lastRowLastColumn="0"/>
         </w:trPr>
@@ -4542,6 +4555,7 @@
       </w:tr>
       <w:tr>
         <w:trPr>
+          <w:cantSplit/>
           <w:trHeight w:val="391" w:hRule="atLeast"/>
         </w:trPr>
         <w:tc>
@@ -4613,13 +4627,14 @@
             </w:pPr>
             <w:r>
               <w:rPr/>
-              <w:t>1. El servidor Payara 7 debe estar activo y el cliente debe tener conexión a la red local.</w:t>
+              <w:t>1. El servidor Payara debe estar activo y el cliente debe tener conexión a la red local.</w:t>
             </w:r>
           </w:p>
         </w:tc>
       </w:tr>
       <w:tr>
         <w:trPr>
+          <w:cantSplit/>
           <w:trHeight w:val="510" w:hRule="atLeast"/>
           <w:cnfStyle w:val="000000100000" w:firstRow="0" w:lastRow="0" w:firstColumn="0" w:lastColumn="0" w:oddVBand="0" w:evenVBand="0" w:oddHBand="1" w:evenHBand="0" w:firstRowFirstColumn="0" w:firstRowLastColumn="0" w:lastRowFirstColumn="0" w:lastRowLastColumn="0"/>
         </w:trPr>
@@ -4690,6 +4705,7 @@
       </w:tr>
       <w:tr>
         <w:trPr>
+          <w:cantSplit/>
           <w:trHeight w:val="510" w:hRule="atLeast"/>
         </w:trPr>
         <w:tc>
@@ -4749,7 +4765,7 @@
               <w:widowControl/>
               <w:suppressAutoHyphens w:val="true"/>
               <w:spacing w:before="80" w:after="100"/>
-              <w:jc w:val="left"/>
+              <w:jc w:val="center"/>
               <w:cnfStyle w:val="000000000000" w:firstRow="0" w:lastRow="0" w:firstColumn="0" w:lastColumn="0" w:oddVBand="0" w:evenVBand="0" w:oddHBand="0" w:evenHBand="0" w:firstRowFirstColumn="0" w:firstRowLastColumn="0" w:lastRowFirstColumn="0" w:lastRowLastColumn="0"/>
               <w:rPr>
                 <w:kern w:val="0"/>
@@ -4762,18 +4778,10 @@
                 <w:lang w:bidi="ar-SA"/>
               </w:rPr>
               <w:drawing>
-                <wp:anchor behindDoc="0" distT="0" distB="0" distL="0" distR="0" simplePos="0" locked="0" layoutInCell="0" allowOverlap="1" relativeHeight="7">
-                  <wp:simplePos x="0" y="0"/>
-                  <wp:positionH relativeFrom="column">
-                    <wp:posOffset>88265</wp:posOffset>
-                  </wp:positionH>
-                  <wp:positionV relativeFrom="paragraph">
-                    <wp:posOffset>85725</wp:posOffset>
-                  </wp:positionV>
-                  <wp:extent cx="3305175" cy="2466340"/>
+                <wp:inline distT="0" distB="0" distL="0" distR="0">
+                  <wp:extent cx="2710243" cy="2022398"/>
                   <wp:effectExtent l="0" t="0" r="0" b="0"/>
-                  <wp:wrapSquare wrapText="largest"/>
-                  <wp:docPr id="29" name="Image1" descr=""/>
+                  <wp:docPr id="100" name="Picture"/>
                   <wp:cNvGraphicFramePr>
                     <a:graphicFrameLocks xmlns:a="http://schemas.openxmlformats.org/drawingml/2006/main" noChangeAspect="1"/>
                   </wp:cNvGraphicFramePr>
@@ -4804,239 +4812,11 @@
                       </pic:pic>
                     </a:graphicData>
                   </a:graphic>
-                </wp:anchor>
+                </wp:inline>
               </w:drawing>
             </w:r>
             <w:bookmarkStart w:id="16" w:name="_Toc82708267"/>
             <w:bookmarkStart w:id="17" w:name="_Toc82708267"/>
-          </w:p>
-          <w:p>
-            <w:pPr>
-              <w:pStyle w:val="Caption"/>
-              <w:widowControl/>
-              <w:suppressAutoHyphens w:val="true"/>
-              <w:jc w:val="left"/>
-              <w:cnfStyle w:val="000000000000" w:firstRow="0" w:lastRow="0" w:firstColumn="0" w:lastColumn="0" w:oddVBand="0" w:evenVBand="0" w:oddHBand="0" w:evenHBand="0" w:firstRowFirstColumn="0" w:firstRowLastColumn="0" w:lastRowFirstColumn="0" w:lastRowLastColumn="0"/>
-              <w:rPr>
-                <w:kern w:val="0"/>
-                <w:lang w:bidi="ar-SA"/>
-              </w:rPr>
-            </w:pPr>
-            <w:r>
-              <w:rPr>
-                <w:kern w:val="0"/>
-                <w:lang w:bidi="ar-SA"/>
-              </w:rPr>
-            </w:r>
-          </w:p>
-          <w:p>
-            <w:pPr>
-              <w:pStyle w:val="Caption"/>
-              <w:widowControl/>
-              <w:suppressAutoHyphens w:val="true"/>
-              <w:jc w:val="left"/>
-              <w:cnfStyle w:val="000000000000" w:firstRow="0" w:lastRow="0" w:firstColumn="0" w:lastColumn="0" w:oddVBand="0" w:evenVBand="0" w:oddHBand="0" w:evenHBand="0" w:firstRowFirstColumn="0" w:firstRowLastColumn="0" w:lastRowFirstColumn="0" w:lastRowLastColumn="0"/>
-              <w:rPr>
-                <w:kern w:val="0"/>
-                <w:lang w:bidi="ar-SA"/>
-              </w:rPr>
-            </w:pPr>
-            <w:r>
-              <w:rPr>
-                <w:kern w:val="0"/>
-                <w:lang w:bidi="ar-SA"/>
-              </w:rPr>
-            </w:r>
-          </w:p>
-          <w:p>
-            <w:pPr>
-              <w:pStyle w:val="Caption"/>
-              <w:widowControl/>
-              <w:suppressAutoHyphens w:val="true"/>
-              <w:jc w:val="left"/>
-              <w:cnfStyle w:val="000000000000" w:firstRow="0" w:lastRow="0" w:firstColumn="0" w:lastColumn="0" w:oddVBand="0" w:evenVBand="0" w:oddHBand="0" w:evenHBand="0" w:firstRowFirstColumn="0" w:firstRowLastColumn="0" w:lastRowFirstColumn="0" w:lastRowLastColumn="0"/>
-              <w:rPr>
-                <w:kern w:val="0"/>
-                <w:lang w:bidi="ar-SA"/>
-              </w:rPr>
-            </w:pPr>
-            <w:r>
-              <w:rPr>
-                <w:kern w:val="0"/>
-                <w:lang w:bidi="ar-SA"/>
-              </w:rPr>
-            </w:r>
-          </w:p>
-          <w:p>
-            <w:pPr>
-              <w:pStyle w:val="Caption"/>
-              <w:widowControl/>
-              <w:suppressAutoHyphens w:val="true"/>
-              <w:jc w:val="left"/>
-              <w:cnfStyle w:val="000000000000" w:firstRow="0" w:lastRow="0" w:firstColumn="0" w:lastColumn="0" w:oddVBand="0" w:evenVBand="0" w:oddHBand="0" w:evenHBand="0" w:firstRowFirstColumn="0" w:firstRowLastColumn="0" w:lastRowFirstColumn="0" w:lastRowLastColumn="0"/>
-              <w:rPr>
-                <w:kern w:val="0"/>
-                <w:lang w:bidi="ar-SA"/>
-              </w:rPr>
-            </w:pPr>
-            <w:r>
-              <w:rPr>
-                <w:kern w:val="0"/>
-                <w:lang w:bidi="ar-SA"/>
-              </w:rPr>
-            </w:r>
-          </w:p>
-          <w:p>
-            <w:pPr>
-              <w:pStyle w:val="Caption"/>
-              <w:widowControl/>
-              <w:suppressAutoHyphens w:val="true"/>
-              <w:jc w:val="left"/>
-              <w:cnfStyle w:val="000000000000" w:firstRow="0" w:lastRow="0" w:firstColumn="0" w:lastColumn="0" w:oddVBand="0" w:evenVBand="0" w:oddHBand="0" w:evenHBand="0" w:firstRowFirstColumn="0" w:firstRowLastColumn="0" w:lastRowFirstColumn="0" w:lastRowLastColumn="0"/>
-              <w:rPr>
-                <w:kern w:val="0"/>
-                <w:lang w:bidi="ar-SA"/>
-              </w:rPr>
-            </w:pPr>
-            <w:r>
-              <w:rPr>
-                <w:kern w:val="0"/>
-                <w:lang w:bidi="ar-SA"/>
-              </w:rPr>
-            </w:r>
-          </w:p>
-          <w:p>
-            <w:pPr>
-              <w:pStyle w:val="Caption"/>
-              <w:widowControl/>
-              <w:suppressAutoHyphens w:val="true"/>
-              <w:jc w:val="left"/>
-              <w:cnfStyle w:val="000000000000" w:firstRow="0" w:lastRow="0" w:firstColumn="0" w:lastColumn="0" w:oddVBand="0" w:evenVBand="0" w:oddHBand="0" w:evenHBand="0" w:firstRowFirstColumn="0" w:firstRowLastColumn="0" w:lastRowFirstColumn="0" w:lastRowLastColumn="0"/>
-              <w:rPr>
-                <w:kern w:val="0"/>
-                <w:lang w:bidi="ar-SA"/>
-              </w:rPr>
-            </w:pPr>
-            <w:r>
-              <w:rPr>
-                <w:kern w:val="0"/>
-                <w:lang w:bidi="ar-SA"/>
-              </w:rPr>
-            </w:r>
-          </w:p>
-          <w:p>
-            <w:pPr>
-              <w:pStyle w:val="Caption"/>
-              <w:widowControl/>
-              <w:suppressAutoHyphens w:val="true"/>
-              <w:jc w:val="left"/>
-              <w:cnfStyle w:val="000000000000" w:firstRow="0" w:lastRow="0" w:firstColumn="0" w:lastColumn="0" w:oddVBand="0" w:evenVBand="0" w:oddHBand="0" w:evenHBand="0" w:firstRowFirstColumn="0" w:firstRowLastColumn="0" w:lastRowFirstColumn="0" w:lastRowLastColumn="0"/>
-              <w:rPr>
-                <w:kern w:val="0"/>
-                <w:lang w:bidi="ar-SA"/>
-              </w:rPr>
-            </w:pPr>
-            <w:r>
-              <w:rPr>
-                <w:kern w:val="0"/>
-                <w:lang w:bidi="ar-SA"/>
-              </w:rPr>
-            </w:r>
-          </w:p>
-          <w:p>
-            <w:pPr>
-              <w:pStyle w:val="Caption"/>
-              <w:widowControl/>
-              <w:suppressAutoHyphens w:val="true"/>
-              <w:jc w:val="left"/>
-              <w:cnfStyle w:val="000000000000" w:firstRow="0" w:lastRow="0" w:firstColumn="0" w:lastColumn="0" w:oddVBand="0" w:evenVBand="0" w:oddHBand="0" w:evenHBand="0" w:firstRowFirstColumn="0" w:firstRowLastColumn="0" w:lastRowFirstColumn="0" w:lastRowLastColumn="0"/>
-              <w:rPr>
-                <w:kern w:val="0"/>
-                <w:lang w:bidi="ar-SA"/>
-              </w:rPr>
-            </w:pPr>
-            <w:r>
-              <w:rPr>
-                <w:kern w:val="0"/>
-                <w:lang w:bidi="ar-SA"/>
-              </w:rPr>
-            </w:r>
-          </w:p>
-          <w:p>
-            <w:pPr>
-              <w:pStyle w:val="Caption"/>
-              <w:widowControl/>
-              <w:suppressAutoHyphens w:val="true"/>
-              <w:jc w:val="left"/>
-              <w:cnfStyle w:val="000000000000" w:firstRow="0" w:lastRow="0" w:firstColumn="0" w:lastColumn="0" w:oddVBand="0" w:evenVBand="0" w:oddHBand="0" w:evenHBand="0" w:firstRowFirstColumn="0" w:firstRowLastColumn="0" w:lastRowFirstColumn="0" w:lastRowLastColumn="0"/>
-              <w:rPr>
-                <w:kern w:val="0"/>
-                <w:lang w:bidi="ar-SA"/>
-              </w:rPr>
-            </w:pPr>
-            <w:r>
-              <w:rPr>
-                <w:kern w:val="0"/>
-                <w:lang w:bidi="ar-SA"/>
-              </w:rPr>
-            </w:r>
-          </w:p>
-          <w:p>
-            <w:pPr>
-              <w:pStyle w:val="Caption"/>
-              <w:widowControl/>
-              <w:suppressAutoHyphens w:val="true"/>
-              <w:jc w:val="left"/>
-              <w:cnfStyle w:val="000000000000" w:firstRow="0" w:lastRow="0" w:firstColumn="0" w:lastColumn="0" w:oddVBand="0" w:evenVBand="0" w:oddHBand="0" w:evenHBand="0" w:firstRowFirstColumn="0" w:firstRowLastColumn="0" w:lastRowFirstColumn="0" w:lastRowLastColumn="0"/>
-              <w:rPr>
-                <w:kern w:val="0"/>
-                <w:lang w:bidi="ar-SA"/>
-              </w:rPr>
-            </w:pPr>
-            <w:r>
-              <w:rPr>
-                <w:kern w:val="0"/>
-                <w:lang w:bidi="ar-SA"/>
-              </w:rPr>
-            </w:r>
-          </w:p>
-          <w:p>
-            <w:pPr>
-              <w:pStyle w:val="Caption"/>
-              <w:widowControl/>
-              <w:suppressAutoHyphens w:val="true"/>
-              <w:jc w:val="left"/>
-              <w:cnfStyle w:val="000000000000" w:firstRow="0" w:lastRow="0" w:firstColumn="0" w:lastColumn="0" w:oddVBand="0" w:evenVBand="0" w:oddHBand="0" w:evenHBand="0" w:firstRowFirstColumn="0" w:firstRowLastColumn="0" w:lastRowFirstColumn="0" w:lastRowLastColumn="0"/>
-              <w:rPr>
-                <w:kern w:val="0"/>
-                <w:lang w:bidi="ar-SA"/>
-              </w:rPr>
-            </w:pPr>
-            <w:r>
-              <w:rPr>
-                <w:kern w:val="0"/>
-                <w:lang w:bidi="ar-SA"/>
-              </w:rPr>
-            </w:r>
-          </w:p>
-          <w:p>
-            <w:pPr>
-              <w:pStyle w:val="Caption"/>
-              <w:widowControl/>
-              <w:suppressAutoHyphens w:val="true"/>
-              <w:jc w:val="left"/>
-              <w:cnfStyle w:val="000000000000" w:firstRow="0" w:lastRow="0" w:firstColumn="0" w:lastColumn="0" w:oddVBand="0" w:evenVBand="0" w:oddHBand="0" w:evenHBand="0" w:firstRowFirstColumn="0" w:firstRowLastColumn="0" w:lastRowFirstColumn="0" w:lastRowLastColumn="0"/>
-              <w:rPr>
-                <w:kern w:val="0"/>
-                <w:lang w:bidi="ar-SA"/>
-              </w:rPr>
-            </w:pPr>
-            <w:r>
-              <w:rPr>
-                <w:kern w:val="0"/>
-                <w:lang w:bidi="ar-SA"/>
-              </w:rPr>
-            </w:r>
           </w:p>
           <w:p>
             <w:pPr>
@@ -5044,7 +4824,7 @@
               <w:widowControl/>
               <w:suppressAutoHyphens w:val="true"/>
               <w:spacing w:before="80" w:after="100"/>
-              <w:jc w:val="left"/>
+              <w:jc w:val="center"/>
               <w:cnfStyle w:val="000000000000" w:firstRow="0" w:lastRow="0" w:firstColumn="0" w:lastColumn="0" w:oddVBand="0" w:evenVBand="0" w:oddHBand="0" w:evenHBand="0" w:firstRowFirstColumn="0" w:firstRowLastColumn="0" w:lastRowFirstColumn="0" w:lastRowLastColumn="0"/>
               <w:rPr>
                 <w:kern w:val="0"/>
@@ -5127,6 +4907,7 @@
       </w:tr>
       <w:tr>
         <w:trPr>
+          <w:cantSplit/>
           <w:trHeight w:val="87" w:hRule="atLeast"/>
           <w:cnfStyle w:val="000000100000" w:firstRow="0" w:lastRow="0" w:firstColumn="0" w:lastColumn="0" w:oddVBand="0" w:evenVBand="0" w:oddHBand="1" w:evenHBand="0" w:firstRowFirstColumn="0" w:firstRowLastColumn="0" w:lastRowFirstColumn="0" w:lastRowLastColumn="0"/>
         </w:trPr>
@@ -5177,6 +4958,7 @@
       </w:tr>
       <w:tr>
         <w:trPr>
+          <w:cantSplit/>
           <w:trHeight w:val="248" w:hRule="atLeast"/>
         </w:trPr>
         <w:tc>
@@ -5226,6 +5008,7 @@
       </w:tr>
       <w:tr>
         <w:trPr>
+          <w:cantSplit/>
           <w:trHeight w:val="132" w:hRule="atLeast"/>
           <w:cnfStyle w:val="000000100000" w:firstRow="0" w:lastRow="0" w:firstColumn="0" w:lastColumn="0" w:oddVBand="0" w:evenVBand="0" w:oddHBand="1" w:evenHBand="0" w:firstRowFirstColumn="0" w:firstRowLastColumn="0" w:lastRowFirstColumn="0" w:lastRowLastColumn="0"/>
         </w:trPr>
@@ -5312,6 +5095,7 @@
       </w:tr>
       <w:tr>
         <w:trPr>
+          <w:cantSplit/>
           <w:trHeight w:val="715" w:hRule="atLeast"/>
         </w:trPr>
         <w:tc>
@@ -5385,13 +5169,14 @@
             </w:pPr>
             <w:r>
               <w:rPr/>
-              <w:t>1. El sistema recibe la petición y valida los datos con los valores estáticos definidos en memoria.</w:t>
+              <w:t>1. El sistema recibe la solicitud SOAP login() y valida las credenciales en memoria RAM (SINBDD).</w:t>
             </w:r>
           </w:p>
         </w:tc>
       </w:tr>
       <w:tr>
         <w:trPr>
+          <w:cantSplit/>
           <w:trHeight w:val="510" w:hRule="atLeast"/>
           <w:cnfStyle w:val="000000100000" w:firstRow="0" w:lastRow="0" w:firstColumn="0" w:lastColumn="0" w:oddVBand="0" w:evenVBand="0" w:oddHBand="1" w:evenHBand="0" w:firstRowFirstColumn="0" w:firstRowLastColumn="0" w:lastRowFirstColumn="0" w:lastRowLastColumn="0"/>
         </w:trPr>
@@ -5485,6 +5270,7 @@
       </w:tr>
       <w:tr>
         <w:trPr>
+          <w:cantSplit/>
           <w:trHeight w:val="72" w:hRule="atLeast"/>
           <w:cnfStyle w:val="000000100000" w:firstRow="0" w:lastRow="0" w:firstColumn="0" w:lastColumn="0" w:oddVBand="0" w:evenVBand="0" w:oddHBand="1" w:evenHBand="0" w:firstRowFirstColumn="0" w:firstRowLastColumn="0" w:lastRowFirstColumn="0" w:lastRowLastColumn="0"/>
         </w:trPr>
@@ -5531,6 +5317,7 @@
       </w:tr>
       <w:tr>
         <w:trPr>
+          <w:cantSplit/>
           <w:trHeight w:val="858" w:hRule="atLeast"/>
         </w:trPr>
         <w:tc>
@@ -5596,6 +5383,7 @@
       </w:tr>
       <w:tr>
         <w:trPr>
+          <w:cantSplit/>
           <w:trHeight w:val="52" w:hRule="atLeast"/>
           <w:cnfStyle w:val="000000100000" w:firstRow="0" w:lastRow="0" w:firstColumn="0" w:lastColumn="0" w:oddVBand="0" w:evenVBand="0" w:oddHBand="1" w:evenHBand="0" w:firstRowFirstColumn="0" w:firstRowLastColumn="0" w:lastRowFirstColumn="0" w:lastRowLastColumn="0"/>
         </w:trPr>
@@ -5642,6 +5430,7 @@
       </w:tr>
       <w:tr>
         <w:trPr>
+          <w:cantSplit/>
           <w:trHeight w:val="102" w:hRule="atLeast"/>
         </w:trPr>
         <w:tc>
@@ -5706,6 +5495,7 @@
     </w:p>
     <w:p>
       <w:pPr>
+        <w:keepWithNext/>
         <w:pStyle w:val="Heading2"/>
         <w:rPr/>
       </w:pPr>
@@ -5732,6 +5522,7 @@
     </w:p>
     <w:p>
       <w:pPr>
+        <w:keepWithNext/>
         <w:pStyle w:val="Normal"/>
         <w:jc w:val="both"/>
         <w:rPr>
@@ -5811,6 +5602,7 @@
       </w:tblGrid>
       <w:tr>
         <w:trPr>
+          <w:cantSplit/>
           <w:trHeight w:val="214" w:hRule="atLeast"/>
           <w:cnfStyle w:val="000000100000" w:firstRow="0" w:lastRow="0" w:firstColumn="0" w:lastColumn="0" w:oddVBand="0" w:evenVBand="0" w:oddHBand="1" w:evenHBand="0" w:firstRowFirstColumn="0" w:firstRowLastColumn="0" w:lastRowFirstColumn="0" w:lastRowLastColumn="0"/>
         </w:trPr>
@@ -5898,6 +5690,7 @@
       </w:tr>
       <w:tr>
         <w:trPr>
+          <w:cantSplit/>
           <w:trHeight w:val="214" w:hRule="atLeast"/>
         </w:trPr>
         <w:tc>
@@ -5980,6 +5773,7 @@
       </w:tr>
       <w:tr>
         <w:trPr>
+          <w:cantSplit/>
           <w:trHeight w:val="214" w:hRule="atLeast"/>
           <w:cnfStyle w:val="000000100000" w:firstRow="0" w:lastRow="0" w:firstColumn="0" w:lastColumn="0" w:oddVBand="0" w:evenVBand="0" w:oddHBand="1" w:evenHBand="0" w:firstRowFirstColumn="0" w:firstRowLastColumn="0" w:lastRowFirstColumn="0" w:lastRowLastColumn="0"/>
         </w:trPr>
@@ -6051,6 +5845,7 @@
       </w:tr>
       <w:tr>
         <w:trPr>
+          <w:cantSplit/>
           <w:trHeight w:val="214" w:hRule="atLeast"/>
         </w:trPr>
         <w:tc>
@@ -6133,6 +5928,7 @@
       </w:tr>
       <w:tr>
         <w:trPr>
+          <w:cantSplit/>
           <w:trHeight w:val="214" w:hRule="atLeast"/>
           <w:cnfStyle w:val="000000100000" w:firstRow="0" w:lastRow="0" w:firstColumn="0" w:lastColumn="0" w:oddVBand="0" w:evenVBand="0" w:oddHBand="1" w:evenHBand="0" w:firstRowFirstColumn="0" w:firstRowLastColumn="0" w:lastRowFirstColumn="0" w:lastRowLastColumn="0"/>
         </w:trPr>
@@ -6342,6 +6138,7 @@
       </w:tr>
       <w:tr>
         <w:trPr>
+          <w:cantSplit/>
           <w:trHeight w:val="253" w:hRule="atLeast"/>
         </w:trPr>
         <w:tc>
@@ -6420,6 +6217,7 @@
       </w:tr>
       <w:tr>
         <w:trPr>
+          <w:cantSplit/>
           <w:trHeight w:val="488" w:hRule="atLeast"/>
           <w:cnfStyle w:val="000000100000" w:firstRow="0" w:lastRow="0" w:firstColumn="0" w:lastColumn="0" w:oddVBand="0" w:evenVBand="0" w:oddHBand="1" w:evenHBand="0" w:firstRowFirstColumn="0" w:firstRowLastColumn="0" w:lastRowFirstColumn="0" w:lastRowLastColumn="0"/>
         </w:trPr>
@@ -6615,6 +6413,7 @@
       </w:tr>
       <w:tr>
         <w:trPr>
+          <w:cantSplit/>
           <w:trHeight w:val="214" w:hRule="atLeast"/>
         </w:trPr>
         <w:tc>
@@ -6708,6 +6507,7 @@
       </w:tr>
       <w:tr>
         <w:trPr>
+          <w:cantSplit/>
           <w:trHeight w:val="214" w:hRule="atLeast"/>
           <w:cnfStyle w:val="000000100000" w:firstRow="0" w:lastRow="0" w:firstColumn="0" w:lastColumn="0" w:oddVBand="0" w:evenVBand="0" w:oddHBand="1" w:evenHBand="0" w:firstRowFirstColumn="0" w:firstRowLastColumn="0" w:lastRowFirstColumn="0" w:lastRowLastColumn="0"/>
         </w:trPr>
@@ -6780,6 +6580,7 @@
       </w:tr>
       <w:tr>
         <w:trPr>
+          <w:cantSplit/>
           <w:trHeight w:val="214" w:hRule="atLeast"/>
         </w:trPr>
         <w:tc>
@@ -6838,7 +6639,7 @@
               <w:widowControl/>
               <w:suppressAutoHyphens w:val="true"/>
               <w:spacing w:before="80" w:after="100"/>
-              <w:jc w:val="left"/>
+              <w:jc w:val="center"/>
               <w:cnfStyle w:val="000000000000" w:firstRow="0" w:lastRow="0" w:firstColumn="0" w:lastColumn="0" w:oddVBand="0" w:evenVBand="0" w:oddHBand="0" w:evenHBand="0" w:firstRowFirstColumn="0" w:firstRowLastColumn="0" w:lastRowFirstColumn="0" w:lastRowLastColumn="0"/>
               <w:rPr>
                 <w:rFonts w:ascii="Calibri" w:hAnsi="Calibri" w:eastAsia="Carlito" w:cs="Calibri" w:asciiTheme="minorHAnsi" w:cstheme="minorHAnsi" w:hAnsiTheme="minorHAnsi"/>
@@ -6866,18 +6667,10 @@
                 <w:lang w:val="es-ES" w:eastAsia="en-US"/>
               </w:rPr>
               <w:drawing>
-                <wp:anchor behindDoc="0" distT="0" distB="0" distL="0" distR="0" simplePos="0" locked="0" layoutInCell="0" allowOverlap="1" relativeHeight="8">
-                  <wp:simplePos x="0" y="0"/>
-                  <wp:positionH relativeFrom="column">
-                    <wp:posOffset>137160</wp:posOffset>
-                  </wp:positionH>
-                  <wp:positionV relativeFrom="paragraph">
-                    <wp:posOffset>180975</wp:posOffset>
-                  </wp:positionV>
-                  <wp:extent cx="3505200" cy="2649220"/>
+                <wp:inline distT="0" distB="0" distL="0" distR="0">
+                  <wp:extent cx="2874264" cy="2172360"/>
                   <wp:effectExtent l="0" t="0" r="0" b="0"/>
-                  <wp:wrapSquare wrapText="largest"/>
-                  <wp:docPr id="30" name="Image2" descr=""/>
+                  <wp:docPr id="100" name="Picture"/>
                   <wp:cNvGraphicFramePr>
                     <a:graphicFrameLocks xmlns:a="http://schemas.openxmlformats.org/drawingml/2006/main" noChangeAspect="1"/>
                   </wp:cNvGraphicFramePr>
@@ -6908,7 +6701,7 @@
                       </pic:pic>
                     </a:graphicData>
                   </a:graphic>
-                </wp:anchor>
+                </wp:inline>
               </w:drawing>
             </w:r>
           </w:p>
@@ -6917,7 +6710,7 @@
               <w:pStyle w:val="Caption"/>
               <w:widowControl/>
               <w:suppressAutoHyphens w:val="true"/>
-              <w:jc w:val="left"/>
+              <w:jc w:val="center"/>
               <w:cnfStyle w:val="000000000000" w:firstRow="0" w:lastRow="0" w:firstColumn="0" w:lastColumn="0" w:oddVBand="0" w:evenVBand="0" w:oddHBand="0" w:evenHBand="0" w:firstRowFirstColumn="0" w:firstRowLastColumn="0" w:lastRowFirstColumn="0" w:lastRowLastColumn="0"/>
               <w:rPr>
                 <w:i/>
@@ -7085,30 +6878,11 @@
               <w:t>convertir longitud</w:t>
             </w:r>
           </w:p>
-          <w:p>
-            <w:pPr>
-              <w:pStyle w:val="Caption"/>
-              <w:widowControl/>
-              <w:suppressAutoHyphens w:val="true"/>
-              <w:spacing w:before="80" w:after="100"/>
-              <w:jc w:val="center"/>
-              <w:cnfStyle w:val="000000000000" w:firstRow="0" w:lastRow="0" w:firstColumn="0" w:lastColumn="0" w:oddVBand="0" w:evenVBand="0" w:oddHBand="0" w:evenHBand="0" w:firstRowFirstColumn="0" w:firstRowLastColumn="0" w:lastRowFirstColumn="0" w:lastRowLastColumn="0"/>
-              <w:rPr>
-                <w:kern w:val="0"/>
-                <w:lang w:bidi="ar-SA"/>
-              </w:rPr>
-            </w:pPr>
-            <w:r>
-              <w:rPr>
-                <w:kern w:val="0"/>
-                <w:lang w:bidi="ar-SA"/>
-              </w:rPr>
-            </w:r>
-          </w:p>
         </w:tc>
       </w:tr>
       <w:tr>
         <w:trPr>
+          <w:cantSplit/>
           <w:trHeight w:val="371" w:hRule="atLeast"/>
           <w:cnfStyle w:val="000000100000" w:firstRow="0" w:lastRow="0" w:firstColumn="0" w:lastColumn="0" w:oddVBand="0" w:evenVBand="0" w:oddHBand="1" w:evenHBand="0" w:firstRowFirstColumn="0" w:firstRowLastColumn="0" w:lastRowFirstColumn="0" w:lastRowLastColumn="0"/>
         </w:trPr>
@@ -7167,6 +6941,7 @@
       </w:tr>
       <w:tr>
         <w:trPr>
+          <w:cantSplit/>
           <w:trHeight w:val="97" w:hRule="atLeast"/>
         </w:trPr>
         <w:tc>
@@ -7209,6 +6984,7 @@
       </w:tr>
       <w:tr>
         <w:trPr>
+          <w:cantSplit/>
           <w:trHeight w:val="97" w:hRule="atLeast"/>
           <w:cnfStyle w:val="000000100000" w:firstRow="0" w:lastRow="0" w:firstColumn="0" w:lastColumn="0" w:oddVBand="0" w:evenVBand="0" w:oddHBand="1" w:evenHBand="0" w:firstRowFirstColumn="0" w:firstRowLastColumn="0" w:lastRowFirstColumn="0" w:lastRowLastColumn="0"/>
         </w:trPr>
@@ -7289,6 +7065,7 @@
       </w:tr>
       <w:tr>
         <w:trPr>
+          <w:cantSplit/>
           <w:trHeight w:val="659" w:hRule="atLeast"/>
         </w:trPr>
         <w:tc>
@@ -7326,7 +7103,7 @@
                 <w:b w:val="false"/>
                 <w:bCs w:val="false"/>
               </w:rPr>
-              <w:t>El usuario selecciona la magnitud "Longitud" y las unidades (Metros, Kilómetros, Pulgadas, Pies o Centímetros).</w:t>
+              <w:t>El usuario selecciona la magnitud "Longitud" y las unidades (Metros, Centímetros, Pies, Yardas o Millas).</w:t>
             </w:r>
           </w:p>
         </w:tc>
@@ -7416,6 +7193,7 @@
       </w:tr>
       <w:tr>
         <w:trPr>
+          <w:cantSplit/>
           <w:trHeight w:val="541" w:hRule="atLeast"/>
           <w:cnfStyle w:val="000000100000" w:firstRow="0" w:lastRow="0" w:firstColumn="0" w:lastColumn="0" w:oddVBand="0" w:evenVBand="0" w:oddHBand="1" w:evenHBand="0" w:firstRowFirstColumn="0" w:firstRowLastColumn="0" w:lastRowFirstColumn="0" w:lastRowLastColumn="0"/>
         </w:trPr>
@@ -7452,7 +7230,7 @@
             </w:r>
             <w:r>
               <w:rPr/>
-              <w:t>HTTP a la servicio web SOAP</w:t>
+              <w:t>HTTP a la API REST</w:t>
             </w:r>
             <w:r>
               <w:rPr/>
@@ -7578,6 +7356,7 @@
       </w:tr>
       <w:tr>
         <w:trPr>
+          <w:cantSplit/>
           <w:trHeight w:val="97" w:hRule="atLeast"/>
         </w:trPr>
         <w:tc>
@@ -7635,6 +7414,7 @@
       </w:tr>
       <w:tr>
         <w:trPr>
+          <w:cantSplit/>
           <w:trHeight w:val="97" w:hRule="atLeast"/>
           <w:cnfStyle w:val="000000100000" w:firstRow="0" w:lastRow="0" w:firstColumn="0" w:lastColumn="0" w:oddVBand="0" w:evenVBand="0" w:oddHBand="1" w:evenHBand="0" w:firstRowFirstColumn="0" w:firstRowLastColumn="0" w:lastRowFirstColumn="0" w:lastRowLastColumn="0"/>
         </w:trPr>
@@ -7668,7 +7448,7 @@
                 <w:b w:val="false"/>
                 <w:bCs w:val="false"/>
               </w:rPr>
-              <w:t xml:space="preserve">Si el usuario ingresa datos no numéricos, </w:t>
+              <w:t xml:space="preserve">Si el usuario ingresa datos no numéricos o mayores a 16 caracteres, </w:t>
             </w:r>
             <w:r>
               <w:rPr/>
@@ -7733,6 +7513,7 @@
       </w:tr>
       <w:tr>
         <w:trPr>
+          <w:cantSplit/>
           <w:trHeight w:val="253" w:hRule="atLeast"/>
         </w:trPr>
         <w:tc>
@@ -7785,6 +7566,7 @@
       </w:tr>
       <w:tr>
         <w:trPr>
+          <w:cantSplit/>
           <w:trHeight w:val="253" w:hRule="atLeast"/>
           <w:cnfStyle w:val="000000100000" w:firstRow="0" w:lastRow="0" w:firstColumn="0" w:lastColumn="0" w:oddVBand="0" w:evenVBand="0" w:oddHBand="1" w:evenHBand="0" w:firstRowFirstColumn="0" w:firstRowLastColumn="0" w:lastRowFirstColumn="0" w:lastRowLastColumn="0"/>
         </w:trPr>
@@ -7852,6 +7634,7 @@
     </w:p>
     <w:p>
       <w:pPr>
+        <w:keepWithNext/>
         <w:pStyle w:val="Heading2"/>
         <w:rPr/>
       </w:pPr>
@@ -7878,6 +7661,7 @@
     </w:p>
     <w:p>
       <w:pPr>
+        <w:keepWithNext/>
         <w:pStyle w:val="Normal"/>
         <w:jc w:val="both"/>
         <w:rPr>
@@ -7957,6 +7741,7 @@
       </w:tblGrid>
       <w:tr>
         <w:trPr>
+          <w:cantSplit/>
           <w:trHeight w:val="223" w:hRule="atLeast"/>
           <w:cnfStyle w:val="000000100000" w:firstRow="0" w:lastRow="0" w:firstColumn="0" w:lastColumn="0" w:oddVBand="0" w:evenVBand="0" w:oddHBand="1" w:evenHBand="0" w:firstRowFirstColumn="0" w:firstRowLastColumn="0" w:lastRowFirstColumn="0" w:lastRowLastColumn="0"/>
         </w:trPr>
@@ -8044,6 +7829,7 @@
       </w:tr>
       <w:tr>
         <w:trPr>
+          <w:cantSplit/>
           <w:trHeight w:val="215" w:hRule="atLeast"/>
         </w:trPr>
         <w:tc>
@@ -8126,6 +7912,7 @@
       </w:tr>
       <w:tr>
         <w:trPr>
+          <w:cantSplit/>
           <w:trHeight w:val="220" w:hRule="atLeast"/>
           <w:cnfStyle w:val="000000100000" w:firstRow="0" w:lastRow="0" w:firstColumn="0" w:lastColumn="0" w:oddVBand="0" w:evenVBand="0" w:oddHBand="1" w:evenHBand="0" w:firstRowFirstColumn="0" w:firstRowLastColumn="0" w:lastRowFirstColumn="0" w:lastRowLastColumn="0"/>
         </w:trPr>
@@ -8190,13 +7977,14 @@
             </w:pPr>
             <w:r>
               <w:rPr/>
-              <w:t>Procesar y validar cálculos de equivalencias entre unidades de masa: Kilogramos, Gramos, Libras, Onzas y Toneladas.</w:t>
+              <w:t>Procesar y validar cálculos de equivalencias entre unidades de masa: Gramos, Kilogramos, Libras, Onzas y Quintales.</w:t>
             </w:r>
           </w:p>
         </w:tc>
       </w:tr>
       <w:tr>
         <w:trPr>
+          <w:cantSplit/>
           <w:trHeight w:val="220" w:hRule="atLeast"/>
         </w:trPr>
         <w:tc>
@@ -8282,13 +8070,14 @@
                 <w:szCs w:val="22"/>
                 <w:lang w:eastAsia="en-US" w:bidi="ar-SA"/>
               </w:rPr>
-              <w:t>los operaciones del servicio web SOAP.</w:t>
+              <w:t>los endpoints de la API REST.</w:t>
             </w:r>
           </w:p>
         </w:tc>
       </w:tr>
       <w:tr>
         <w:trPr>
+          <w:cantSplit/>
           <w:trHeight w:val="220" w:hRule="atLeast"/>
           <w:cnfStyle w:val="000000100000" w:firstRow="0" w:lastRow="0" w:firstColumn="0" w:lastColumn="0" w:oddVBand="0" w:evenVBand="0" w:oddHBand="1" w:evenHBand="0" w:firstRowFirstColumn="0" w:firstRowLastColumn="0" w:lastRowFirstColumn="0" w:lastRowLastColumn="0"/>
         </w:trPr>
@@ -8461,6 +8250,7 @@
       </w:tr>
       <w:tr>
         <w:trPr>
+          <w:cantSplit/>
           <w:trHeight w:val="260" w:hRule="atLeast"/>
         </w:trPr>
         <w:tc>
@@ -8539,6 +8329,7 @@
       </w:tr>
       <w:tr>
         <w:trPr>
+          <w:cantSplit/>
           <w:trHeight w:val="500" w:hRule="atLeast"/>
           <w:cnfStyle w:val="000000100000" w:firstRow="0" w:lastRow="0" w:firstColumn="0" w:lastColumn="0" w:oddVBand="0" w:evenVBand="0" w:oddHBand="1" w:evenHBand="0" w:firstRowFirstColumn="0" w:firstRowLastColumn="0" w:lastRowFirstColumn="0" w:lastRowLastColumn="0"/>
         </w:trPr>
@@ -8697,6 +8488,7 @@
       </w:tr>
       <w:tr>
         <w:trPr>
+          <w:cantSplit/>
           <w:trHeight w:val="220" w:hRule="atLeast"/>
         </w:trPr>
         <w:tc>
@@ -8790,6 +8582,7 @@
       </w:tr>
       <w:tr>
         <w:trPr>
+          <w:cantSplit/>
           <w:trHeight w:val="220" w:hRule="atLeast"/>
           <w:cnfStyle w:val="000000100000" w:firstRow="0" w:lastRow="0" w:firstColumn="0" w:lastColumn="0" w:oddVBand="0" w:evenVBand="0" w:oddHBand="1" w:evenHBand="0" w:firstRowFirstColumn="0" w:firstRowLastColumn="0" w:lastRowFirstColumn="0" w:lastRowLastColumn="0"/>
         </w:trPr>
@@ -8868,18 +8661,10 @@
                 <w:lang w:eastAsia="en-US" w:bidi="ar-SA"/>
               </w:rPr>
               <w:drawing>
-                <wp:anchor behindDoc="0" distT="0" distB="0" distL="0" distR="0" simplePos="0" locked="0" layoutInCell="0" allowOverlap="1" relativeHeight="9">
-                  <wp:simplePos x="0" y="0"/>
-                  <wp:positionH relativeFrom="column">
-                    <wp:posOffset>50165</wp:posOffset>
-                  </wp:positionH>
-                  <wp:positionV relativeFrom="paragraph">
-                    <wp:posOffset>161925</wp:posOffset>
-                  </wp:positionV>
-                  <wp:extent cx="3053080" cy="2419985"/>
+                <wp:inline distT="0" distB="0" distL="0" distR="0">
+                  <wp:extent cx="2503525" cy="1984387"/>
                   <wp:effectExtent l="0" t="0" r="0" b="0"/>
-                  <wp:wrapSquare wrapText="largest"/>
-                  <wp:docPr id="31" name="Image3" descr=""/>
+                  <wp:docPr id="100" name="Picture"/>
                   <wp:cNvGraphicFramePr>
                     <a:graphicFrameLocks xmlns:a="http://schemas.openxmlformats.org/drawingml/2006/main" noChangeAspect="1"/>
                   </wp:cNvGraphicFramePr>
@@ -8910,164 +8695,8 @@
                       </pic:pic>
                     </a:graphicData>
                   </a:graphic>
-                </wp:anchor>
+                </wp:inline>
               </w:drawing>
-            </w:r>
-          </w:p>
-          <w:p>
-            <w:pPr>
-              <w:pStyle w:val="Caption"/>
-              <w:keepNext w:val="true"/>
-              <w:widowControl/>
-              <w:suppressAutoHyphens w:val="true"/>
-              <w:jc w:val="center"/>
-              <w:cnfStyle w:val="000000100000" w:firstRow="0" w:lastRow="0" w:firstColumn="0" w:lastColumn="0" w:oddVBand="0" w:evenVBand="0" w:oddHBand="1" w:evenHBand="0" w:firstRowFirstColumn="0" w:firstRowLastColumn="0" w:lastRowFirstColumn="0" w:lastRowLastColumn="0"/>
-              <w:rPr>
-                <w:kern w:val="0"/>
-                <w:lang w:bidi="ar-SA"/>
-              </w:rPr>
-            </w:pPr>
-            <w:r>
-              <w:rPr>
-                <w:kern w:val="0"/>
-                <w:lang w:bidi="ar-SA"/>
-              </w:rPr>
-            </w:r>
-          </w:p>
-          <w:p>
-            <w:pPr>
-              <w:pStyle w:val="Normal"/>
-              <w:widowControl/>
-              <w:suppressAutoHyphens w:val="true"/>
-              <w:jc w:val="left"/>
-              <w:cnfStyle w:val="000000100000" w:firstRow="0" w:lastRow="0" w:firstColumn="0" w:lastColumn="0" w:oddVBand="0" w:evenVBand="0" w:oddHBand="1" w:evenHBand="0" w:firstRowFirstColumn="0" w:firstRowLastColumn="0" w:lastRowFirstColumn="0" w:lastRowLastColumn="0"/>
-              <w:rPr>
-                <w:lang w:val="es-EC" w:eastAsia="es-EC"/>
-              </w:rPr>
-            </w:pPr>
-            <w:r>
-              <w:rPr>
-                <w:lang w:val="es-EC" w:eastAsia="es-EC"/>
-              </w:rPr>
-            </w:r>
-          </w:p>
-          <w:p>
-            <w:pPr>
-              <w:pStyle w:val="Normal"/>
-              <w:widowControl/>
-              <w:suppressAutoHyphens w:val="true"/>
-              <w:jc w:val="left"/>
-              <w:cnfStyle w:val="000000100000" w:firstRow="0" w:lastRow="0" w:firstColumn="0" w:lastColumn="0" w:oddVBand="0" w:evenVBand="0" w:oddHBand="1" w:evenHBand="0" w:firstRowFirstColumn="0" w:firstRowLastColumn="0" w:lastRowFirstColumn="0" w:lastRowLastColumn="0"/>
-              <w:rPr>
-                <w:lang w:val="es-EC" w:eastAsia="es-EC"/>
-              </w:rPr>
-            </w:pPr>
-            <w:r>
-              <w:rPr>
-                <w:lang w:val="es-EC" w:eastAsia="es-EC"/>
-              </w:rPr>
-            </w:r>
-          </w:p>
-          <w:p>
-            <w:pPr>
-              <w:pStyle w:val="Normal"/>
-              <w:widowControl/>
-              <w:suppressAutoHyphens w:val="true"/>
-              <w:jc w:val="left"/>
-              <w:cnfStyle w:val="000000100000" w:firstRow="0" w:lastRow="0" w:firstColumn="0" w:lastColumn="0" w:oddVBand="0" w:evenVBand="0" w:oddHBand="1" w:evenHBand="0" w:firstRowFirstColumn="0" w:firstRowLastColumn="0" w:lastRowFirstColumn="0" w:lastRowLastColumn="0"/>
-              <w:rPr>
-                <w:lang w:val="es-EC" w:eastAsia="es-EC"/>
-              </w:rPr>
-            </w:pPr>
-            <w:r>
-              <w:rPr>
-                <w:lang w:val="es-EC" w:eastAsia="es-EC"/>
-              </w:rPr>
-            </w:r>
-          </w:p>
-          <w:p>
-            <w:pPr>
-              <w:pStyle w:val="Normal"/>
-              <w:widowControl/>
-              <w:suppressAutoHyphens w:val="true"/>
-              <w:jc w:val="left"/>
-              <w:cnfStyle w:val="000000100000" w:firstRow="0" w:lastRow="0" w:firstColumn="0" w:lastColumn="0" w:oddVBand="0" w:evenVBand="0" w:oddHBand="1" w:evenHBand="0" w:firstRowFirstColumn="0" w:firstRowLastColumn="0" w:lastRowFirstColumn="0" w:lastRowLastColumn="0"/>
-              <w:rPr>
-                <w:lang w:val="es-EC" w:eastAsia="es-EC"/>
-              </w:rPr>
-            </w:pPr>
-            <w:r>
-              <w:rPr>
-                <w:lang w:val="es-EC" w:eastAsia="es-EC"/>
-              </w:rPr>
-            </w:r>
-          </w:p>
-          <w:p>
-            <w:pPr>
-              <w:pStyle w:val="Normal"/>
-              <w:widowControl/>
-              <w:suppressAutoHyphens w:val="true"/>
-              <w:jc w:val="left"/>
-              <w:cnfStyle w:val="000000100000" w:firstRow="0" w:lastRow="0" w:firstColumn="0" w:lastColumn="0" w:oddVBand="0" w:evenVBand="0" w:oddHBand="1" w:evenHBand="0" w:firstRowFirstColumn="0" w:firstRowLastColumn="0" w:lastRowFirstColumn="0" w:lastRowLastColumn="0"/>
-              <w:rPr>
-                <w:lang w:val="es-EC" w:eastAsia="es-EC"/>
-              </w:rPr>
-            </w:pPr>
-            <w:r>
-              <w:rPr>
-                <w:lang w:val="es-EC" w:eastAsia="es-EC"/>
-              </w:rPr>
-            </w:r>
-          </w:p>
-          <w:p>
-            <w:pPr>
-              <w:pStyle w:val="Normal"/>
-              <w:widowControl/>
-              <w:suppressAutoHyphens w:val="true"/>
-              <w:jc w:val="left"/>
-              <w:cnfStyle w:val="000000100000" w:firstRow="0" w:lastRow="0" w:firstColumn="0" w:lastColumn="0" w:oddVBand="0" w:evenVBand="0" w:oddHBand="1" w:evenHBand="0" w:firstRowFirstColumn="0" w:firstRowLastColumn="0" w:lastRowFirstColumn="0" w:lastRowLastColumn="0"/>
-              <w:rPr>
-                <w:lang w:val="es-EC" w:eastAsia="es-EC"/>
-              </w:rPr>
-            </w:pPr>
-            <w:r>
-              <w:rPr>
-                <w:lang w:val="es-EC" w:eastAsia="es-EC"/>
-              </w:rPr>
-            </w:r>
-          </w:p>
-          <w:p>
-            <w:pPr>
-              <w:pStyle w:val="Normal"/>
-              <w:widowControl/>
-              <w:suppressAutoHyphens w:val="true"/>
-              <w:jc w:val="left"/>
-              <w:cnfStyle w:val="000000100000" w:firstRow="0" w:lastRow="0" w:firstColumn="0" w:lastColumn="0" w:oddVBand="0" w:evenVBand="0" w:oddHBand="1" w:evenHBand="0" w:firstRowFirstColumn="0" w:firstRowLastColumn="0" w:lastRowFirstColumn="0" w:lastRowLastColumn="0"/>
-              <w:rPr>
-                <w:lang w:val="es-EC" w:eastAsia="es-EC"/>
-              </w:rPr>
-            </w:pPr>
-            <w:r>
-              <w:rPr>
-                <w:lang w:val="es-EC" w:eastAsia="es-EC"/>
-              </w:rPr>
-            </w:r>
-          </w:p>
-          <w:p>
-            <w:pPr>
-              <w:pStyle w:val="Normal"/>
-              <w:widowControl/>
-              <w:suppressAutoHyphens w:val="true"/>
-              <w:jc w:val="left"/>
-              <w:cnfStyle w:val="000000100000" w:firstRow="0" w:lastRow="0" w:firstColumn="0" w:lastColumn="0" w:oddVBand="0" w:evenVBand="0" w:oddHBand="1" w:evenHBand="0" w:firstRowFirstColumn="0" w:firstRowLastColumn="0" w:lastRowFirstColumn="0" w:lastRowLastColumn="0"/>
-              <w:rPr>
-                <w:lang w:val="es-EC" w:eastAsia="es-EC"/>
-              </w:rPr>
-            </w:pPr>
-            <w:r>
-              <w:rPr>
-                <w:lang w:val="es-EC" w:eastAsia="es-EC"/>
-              </w:rPr>
             </w:r>
           </w:p>
           <w:p>
@@ -9075,7 +8704,8 @@
               <w:pStyle w:val="Caption"/>
               <w:widowControl/>
               <w:suppressAutoHyphens w:val="true"/>
-              <w:jc w:val="left"/>
+              <w:spacing w:before="80" w:after="100"/>
+              <w:jc w:val="center"/>
               <w:cnfStyle w:val="000000100000" w:firstRow="0" w:lastRow="0" w:firstColumn="0" w:lastColumn="0" w:oddVBand="0" w:evenVBand="0" w:oddHBand="1" w:evenHBand="0" w:firstRowFirstColumn="0" w:firstRowLastColumn="0" w:lastRowFirstColumn="0" w:lastRowLastColumn="0"/>
               <w:rPr>
                 <w:rFonts w:ascii="Calibri" w:hAnsi="Calibri" w:eastAsia="Carlito" w:cs="Calibri" w:asciiTheme="minorHAnsi" w:cstheme="minorHAnsi" w:hAnsiTheme="minorHAnsi"/>
@@ -9090,127 +8720,58 @@
                 <w:lang w:val="es-ES" w:eastAsia="en-US"/>
               </w:rPr>
             </w:pPr>
-            <w:r>
-              <w:rPr>
-                <w:rFonts w:eastAsia="Carlito" w:cs="Calibri" w:cstheme="minorHAnsi" w:ascii="Calibri" w:hAnsi="Calibri"/>
+            <w:bookmarkStart w:id="27" w:name="_Toc82708269"/>
+            <w:bookmarkStart w:id="28" w:name="_Toc214408085"/>
+            <w:r>
+              <w:rPr>
+                <w:kern w:val="0"/>
+                <w:lang w:bidi="ar-SA"/>
+              </w:rPr>
+              <w:t xml:space="preserve">Ilustración </w:t>
+            </w:r>
+            <w:r>
+              <w:rPr>
+                <w:kern w:val="0"/>
+                <w:lang w:bidi="ar-SA"/>
+              </w:rPr>
+              <w:fldChar w:fldCharType="begin"/>
+            </w:r>
+            <w:r>
+              <w:rPr>
+                <w:kern w:val="0"/>
+                <w:lang w:bidi="ar-SA"/>
+              </w:rPr>
+              <w:instrText xml:space="preserve"> SEQ Ilustración \* ARABIC </w:instrText>
+            </w:r>
+            <w:r>
+              <w:rPr>
+                <w:kern w:val="0"/>
+                <w:lang w:bidi="ar-SA"/>
+              </w:rPr>
+              <w:fldChar w:fldCharType="separate"/>
+            </w:r>
+            <w:r>
+              <w:rPr>
+                <w:kern w:val="0"/>
+                <w:lang w:bidi="ar-SA"/>
+              </w:rPr>
+              <w:t>3</w:t>
+            </w:r>
+            <w:r>
+              <w:rPr>
+                <w:kern w:val="0"/>
+                <w:lang w:bidi="ar-SA"/>
+              </w:rPr>
+              <w:fldChar w:fldCharType="end"/>
+            </w:r>
+            <w:r>
+              <w:rPr>
+                <w:rFonts w:eastAsia="Carlito" w:cs="Calibri" w:ascii="Calibri" w:hAnsi="Calibri" w:asciiTheme="minorHAnsi" w:cstheme="minorHAnsi" w:hAnsiTheme="minorHAnsi"/>
                 <w:b/>
                 <w:bCs/>
                 <w:i w:val="false"/>
                 <w:iCs w:val="false"/>
                 <w:color w:themeColor="accent1" w:val="4472C4"/>
-                <w:sz w:val="20"/>
-                <w:szCs w:val="20"/>
-                <w:lang w:val="es-ES" w:eastAsia="en-US"/>
-              </w:rPr>
-            </w:r>
-          </w:p>
-          <w:p>
-            <w:pPr>
-              <w:pStyle w:val="Caption"/>
-              <w:widowControl/>
-              <w:suppressAutoHyphens w:val="true"/>
-              <w:jc w:val="left"/>
-              <w:cnfStyle w:val="000000100000" w:firstRow="0" w:lastRow="0" w:firstColumn="0" w:lastColumn="0" w:oddVBand="0" w:evenVBand="0" w:oddHBand="1" w:evenHBand="0" w:firstRowFirstColumn="0" w:firstRowLastColumn="0" w:lastRowFirstColumn="0" w:lastRowLastColumn="0"/>
-              <w:rPr>
-                <w:rFonts w:ascii="Calibri" w:hAnsi="Calibri" w:eastAsia="Carlito" w:cs="Calibri" w:asciiTheme="minorHAnsi" w:cstheme="minorHAnsi" w:hAnsiTheme="minorHAnsi"/>
-                <w:b/>
-                <w:bCs/>
-                <w:i w:val="false"/>
-                <w:i w:val="false"/>
-                <w:iCs w:val="false"/>
-                <w:color w:themeColor="accent1" w:val="4472C4"/>
-                <w:sz w:val="20"/>
-                <w:szCs w:val="20"/>
-                <w:lang w:val="es-ES" w:eastAsia="en-US"/>
-              </w:rPr>
-            </w:pPr>
-            <w:r>
-              <w:rPr>
-                <w:rFonts w:eastAsia="Carlito" w:cs="Calibri" w:cstheme="minorHAnsi" w:ascii="Calibri" w:hAnsi="Calibri"/>
-                <w:b/>
-                <w:bCs/>
-                <w:i w:val="false"/>
-                <w:iCs w:val="false"/>
-                <w:color w:themeColor="accent1" w:val="4472C4"/>
-                <w:sz w:val="20"/>
-                <w:szCs w:val="20"/>
-                <w:lang w:val="es-ES" w:eastAsia="en-US"/>
-              </w:rPr>
-            </w:r>
-          </w:p>
-          <w:p>
-            <w:pPr>
-              <w:pStyle w:val="Caption"/>
-              <w:widowControl/>
-              <w:suppressAutoHyphens w:val="true"/>
-              <w:spacing w:before="80" w:after="100"/>
-              <w:jc w:val="left"/>
-              <w:cnfStyle w:val="000000100000" w:firstRow="0" w:lastRow="0" w:firstColumn="0" w:lastColumn="0" w:oddVBand="0" w:evenVBand="0" w:oddHBand="1" w:evenHBand="0" w:firstRowFirstColumn="0" w:firstRowLastColumn="0" w:lastRowFirstColumn="0" w:lastRowLastColumn="0"/>
-              <w:rPr>
-                <w:rFonts w:ascii="Calibri" w:hAnsi="Calibri" w:eastAsia="Carlito" w:cs="Calibri" w:asciiTheme="minorHAnsi" w:cstheme="minorHAnsi" w:hAnsiTheme="minorHAnsi"/>
-                <w:b/>
-                <w:bCs/>
-                <w:i w:val="false"/>
-                <w:i w:val="false"/>
-                <w:iCs w:val="false"/>
-                <w:color w:themeColor="accent1" w:val="4472C4"/>
-                <w:sz w:val="20"/>
-                <w:szCs w:val="20"/>
-                <w:lang w:val="es-ES" w:eastAsia="en-US"/>
-              </w:rPr>
-            </w:pPr>
-            <w:bookmarkStart w:id="27" w:name="_Toc82708269"/>
-            <w:bookmarkStart w:id="28" w:name="_Toc214408085"/>
-            <w:r>
-              <w:rPr>
-                <w:kern w:val="0"/>
-                <w:lang w:bidi="ar-SA"/>
-              </w:rPr>
-              <w:t xml:space="preserve">Ilustración </w:t>
-            </w:r>
-            <w:r>
-              <w:rPr>
-                <w:kern w:val="0"/>
-                <w:lang w:bidi="ar-SA"/>
-              </w:rPr>
-              <w:fldChar w:fldCharType="begin"/>
-            </w:r>
-            <w:r>
-              <w:rPr>
-                <w:kern w:val="0"/>
-                <w:lang w:bidi="ar-SA"/>
-              </w:rPr>
-              <w:instrText xml:space="preserve"> SEQ Ilustración \* ARABIC </w:instrText>
-            </w:r>
-            <w:r>
-              <w:rPr>
-                <w:kern w:val="0"/>
-                <w:lang w:bidi="ar-SA"/>
-              </w:rPr>
-              <w:fldChar w:fldCharType="separate"/>
-            </w:r>
-            <w:r>
-              <w:rPr>
-                <w:kern w:val="0"/>
-                <w:lang w:bidi="ar-SA"/>
-              </w:rPr>
-              <w:t>3</w:t>
-            </w:r>
-            <w:r>
-              <w:rPr>
-                <w:kern w:val="0"/>
-                <w:lang w:bidi="ar-SA"/>
-              </w:rPr>
-              <w:fldChar w:fldCharType="end"/>
-            </w:r>
-            <w:r>
-              <w:rPr>
-                <w:rFonts w:eastAsia="Carlito" w:cs="Calibri" w:ascii="Calibri" w:hAnsi="Calibri" w:asciiTheme="minorHAnsi" w:cstheme="minorHAnsi" w:hAnsiTheme="minorHAnsi"/>
-                <w:b/>
-                <w:bCs/>
-                <w:i w:val="false"/>
-                <w:iCs w:val="false"/>
-                <w:color w:themeColor="accent1" w:val="4472C4"/>
                 <w:kern w:val="0"/>
                 <w:sz w:val="20"/>
                 <w:szCs w:val="20"/>
@@ -9239,6 +8800,7 @@
       </w:tr>
       <w:tr>
         <w:trPr>
+          <w:cantSplit/>
           <w:trHeight w:val="380" w:hRule="atLeast"/>
         </w:trPr>
         <w:tc>
@@ -9296,6 +8858,7 @@
       </w:tr>
       <w:tr>
         <w:trPr>
+          <w:cantSplit/>
           <w:trHeight w:val="100" w:hRule="atLeast"/>
           <w:cnfStyle w:val="000000100000" w:firstRow="0" w:lastRow="0" w:firstColumn="0" w:lastColumn="0" w:oddVBand="0" w:evenVBand="0" w:oddHBand="1" w:evenHBand="0" w:firstRowFirstColumn="0" w:firstRowLastColumn="0" w:lastRowFirstColumn="0" w:lastRowLastColumn="0"/>
         </w:trPr>
@@ -9376,6 +8939,7 @@
       </w:tr>
       <w:tr>
         <w:trPr>
+          <w:cantSplit/>
           <w:trHeight w:val="100" w:hRule="atLeast"/>
         </w:trPr>
         <w:tc>
@@ -9464,13 +9028,14 @@
                 <w:szCs w:val="22"/>
                 <w:lang w:eastAsia="en-US" w:bidi="ar-SA"/>
               </w:rPr>
-              <w:t>1. El sistema carga las constantes de conversión para masa (Kg, g, lb, oz, t).</w:t>
+              <w:t>1. El sistema carga las constantes de conversión para masa (g, kg, lb, oz, q).</w:t>
             </w:r>
           </w:p>
         </w:tc>
       </w:tr>
       <w:tr>
         <w:trPr>
+          <w:cantSplit/>
           <w:trHeight w:val="100" w:hRule="atLeast"/>
           <w:cnfStyle w:val="000000100000" w:firstRow="0" w:lastRow="0" w:firstColumn="0" w:lastColumn="0" w:oddVBand="0" w:evenVBand="0" w:oddHBand="1" w:evenHBand="0" w:firstRowFirstColumn="0" w:firstRowLastColumn="0" w:lastRowFirstColumn="0" w:lastRowLastColumn="0"/>
         </w:trPr>
@@ -9507,7 +9072,7 @@
             </w:r>
             <w:r>
               <w:rPr/>
-              <w:t>HTTP a la servicio web SOAP</w:t>
+              <w:t>HTTP a la API REST</w:t>
             </w:r>
             <w:r>
               <w:rPr/>
@@ -9596,6 +9161,7 @@
       </w:tr>
       <w:tr>
         <w:trPr>
+          <w:cantSplit/>
           <w:trHeight w:val="100" w:hRule="atLeast"/>
         </w:trPr>
         <w:tc>
@@ -9653,6 +9219,7 @@
       </w:tr>
       <w:tr>
         <w:trPr>
+          <w:cantSplit/>
           <w:trHeight w:val="100" w:hRule="atLeast"/>
           <w:cnfStyle w:val="000000100000" w:firstRow="0" w:lastRow="0" w:firstColumn="0" w:lastColumn="0" w:oddVBand="0" w:evenVBand="0" w:oddHBand="1" w:evenHBand="0" w:firstRowFirstColumn="0" w:firstRowLastColumn="0" w:lastRowFirstColumn="0" w:lastRowLastColumn="0"/>
         </w:trPr>
@@ -9686,7 +9253,7 @@
                 <w:b w:val="false"/>
                 <w:bCs w:val="false"/>
               </w:rPr>
-              <w:t xml:space="preserve">1. Si el usuario ingresa datos no numéricos, </w:t>
+              <w:t xml:space="preserve">1. Si el usuario ingresa datos no numéricos o mayores a 16 caracteres, </w:t>
             </w:r>
             <w:r>
               <w:rPr/>
@@ -9774,6 +9341,7 @@
       </w:tr>
       <w:tr>
         <w:trPr>
+          <w:cantSplit/>
           <w:trHeight w:val="260" w:hRule="atLeast"/>
         </w:trPr>
         <w:tc>
@@ -9847,6 +9415,7 @@
       </w:tr>
       <w:tr>
         <w:trPr>
+          <w:cantSplit/>
           <w:trHeight w:val="260" w:hRule="atLeast"/>
           <w:cnfStyle w:val="000000100000" w:firstRow="0" w:lastRow="0" w:firstColumn="0" w:lastColumn="0" w:oddVBand="0" w:evenVBand="0" w:oddHBand="1" w:evenHBand="0" w:firstRowFirstColumn="0" w:firstRowLastColumn="0" w:lastRowFirstColumn="0" w:lastRowLastColumn="0"/>
         </w:trPr>
@@ -9926,6 +9495,7 @@
       </w:tr>
       <w:tr>
         <w:trPr>
+          <w:cantSplit/>
           <w:trHeight w:val="260" w:hRule="atLeast"/>
         </w:trPr>
         <w:tc>
@@ -10027,6 +9597,7 @@
     </w:p>
     <w:p>
       <w:pPr>
+        <w:keepWithNext/>
         <w:pStyle w:val="Heading2"/>
         <w:rPr/>
       </w:pPr>
@@ -10053,6 +9624,7 @@
     </w:p>
     <w:p>
       <w:pPr>
+        <w:keepWithNext/>
         <w:pStyle w:val="Normal"/>
         <w:jc w:val="both"/>
         <w:rPr>
@@ -10074,6 +9646,7 @@
     </w:p>
     <w:p>
       <w:pPr>
+        <w:keepWithNext/>
         <w:pStyle w:val="Caption"/>
         <w:keepNext w:val="true"/>
         <w:rPr/>
@@ -10118,6 +9691,7 @@
       </w:tblGrid>
       <w:tr>
         <w:trPr>
+          <w:cantSplit/>
           <w:trHeight w:val="220" w:hRule="atLeast"/>
           <w:cnfStyle w:val="000000100000" w:firstRow="0" w:lastRow="0" w:firstColumn="0" w:lastColumn="0" w:oddVBand="0" w:evenVBand="0" w:oddHBand="1" w:evenHBand="0" w:firstRowFirstColumn="0" w:firstRowLastColumn="0" w:lastRowFirstColumn="0" w:lastRowLastColumn="0"/>
         </w:trPr>
@@ -10206,6 +9780,7 @@
       </w:tr>
       <w:tr>
         <w:trPr>
+          <w:cantSplit/>
           <w:trHeight w:val="220" w:hRule="atLeast"/>
         </w:trPr>
         <w:tc>
@@ -10289,6 +9864,7 @@
       </w:tr>
       <w:tr>
         <w:trPr>
+          <w:cantSplit/>
           <w:trHeight w:val="220" w:hRule="atLeast"/>
           <w:cnfStyle w:val="000000100000" w:firstRow="0" w:lastRow="0" w:firstColumn="0" w:lastColumn="0" w:oddVBand="0" w:evenVBand="0" w:oddHBand="1" w:evenHBand="0" w:firstRowFirstColumn="0" w:firstRowLastColumn="0" w:lastRowFirstColumn="0" w:lastRowLastColumn="0"/>
         </w:trPr>
@@ -10354,13 +9930,14 @@
             </w:pPr>
             <w:r>
               <w:rPr/>
-              <w:t>Ejecutar fórmulas matemáticas para convertir temperaturas entre escalas Celsius, Fahrenheit, Kelvin, Rankine y Reaumur.</w:t>
+              <w:t>Ejecutar fórmulas matemáticas para convertir temperaturas entre escalas Celsius, Fahrenheit, Kelvin, Newton y Reaumur.</w:t>
             </w:r>
           </w:p>
         </w:tc>
       </w:tr>
       <w:tr>
         <w:trPr>
+          <w:cantSplit/>
           <w:trHeight w:val="220" w:hRule="atLeast"/>
         </w:trPr>
         <w:tc>
@@ -10444,6 +10021,7 @@
       </w:tr>
       <w:tr>
         <w:trPr>
+          <w:cantSplit/>
           <w:trHeight w:val="220" w:hRule="atLeast"/>
           <w:cnfStyle w:val="000000100000" w:firstRow="0" w:lastRow="0" w:firstColumn="0" w:lastColumn="0" w:oddVBand="0" w:evenVBand="0" w:oddHBand="1" w:evenHBand="0" w:firstRowFirstColumn="0" w:firstRowLastColumn="0" w:lastRowFirstColumn="0" w:lastRowLastColumn="0"/>
         </w:trPr>
@@ -10616,6 +10194,7 @@
       </w:tr>
       <w:tr>
         <w:trPr>
+          <w:cantSplit/>
           <w:trHeight w:val="260" w:hRule="atLeast"/>
         </w:trPr>
         <w:tc>
@@ -10695,6 +10274,7 @@
       </w:tr>
       <w:tr>
         <w:trPr>
+          <w:cantSplit/>
           <w:trHeight w:val="500" w:hRule="atLeast"/>
           <w:cnfStyle w:val="000000100000" w:firstRow="0" w:lastRow="0" w:firstColumn="0" w:lastColumn="0" w:oddVBand="0" w:evenVBand="0" w:oddHBand="1" w:evenHBand="0" w:firstRowFirstColumn="0" w:firstRowLastColumn="0" w:lastRowFirstColumn="0" w:lastRowLastColumn="0"/>
         </w:trPr>
@@ -10857,6 +10437,7 @@
       </w:tr>
       <w:tr>
         <w:trPr>
+          <w:cantSplit/>
           <w:trHeight w:val="220" w:hRule="atLeast"/>
         </w:trPr>
         <w:tc>
@@ -10969,6 +10550,7 @@
       </w:tr>
       <w:tr>
         <w:trPr>
+          <w:cantSplit/>
           <w:trHeight w:val="220" w:hRule="atLeast"/>
           <w:cnfStyle w:val="000000100000" w:firstRow="0" w:lastRow="0" w:firstColumn="0" w:lastColumn="0" w:oddVBand="0" w:evenVBand="0" w:oddHBand="1" w:evenHBand="0" w:firstRowFirstColumn="0" w:firstRowLastColumn="0" w:lastRowFirstColumn="0" w:lastRowLastColumn="0"/>
         </w:trPr>
@@ -11040,18 +10622,10 @@
                 <w:lang w:val="es-EC" w:eastAsia="es-EC"/>
               </w:rPr>
               <w:drawing>
-                <wp:anchor behindDoc="0" distT="0" distB="0" distL="0" distR="0" simplePos="0" locked="0" layoutInCell="0" allowOverlap="1" relativeHeight="10">
-                  <wp:simplePos x="0" y="0"/>
-                  <wp:positionH relativeFrom="column">
-                    <wp:posOffset>71755</wp:posOffset>
-                  </wp:positionH>
-                  <wp:positionV relativeFrom="paragraph">
-                    <wp:posOffset>47625</wp:posOffset>
-                  </wp:positionV>
-                  <wp:extent cx="3109595" cy="2299970"/>
+                <wp:inline distT="0" distB="0" distL="0" distR="0">
+                  <wp:extent cx="2549867" cy="1885975"/>
                   <wp:effectExtent l="0" t="0" r="0" b="0"/>
-                  <wp:wrapSquare wrapText="largest"/>
-                  <wp:docPr id="32" name="Image4" descr=""/>
+                  <wp:docPr id="100" name="Picture"/>
                   <wp:cNvGraphicFramePr>
                     <a:graphicFrameLocks xmlns:a="http://schemas.openxmlformats.org/drawingml/2006/main" noChangeAspect="1"/>
                   </wp:cNvGraphicFramePr>
@@ -11082,286 +10656,8 @@
                       </pic:pic>
                     </a:graphicData>
                   </a:graphic>
-                </wp:anchor>
+                </wp:inline>
               </w:drawing>
-            </w:r>
-          </w:p>
-          <w:p>
-            <w:pPr>
-              <w:pStyle w:val="Normal"/>
-              <w:keepNext w:val="true"/>
-              <w:widowControl/>
-              <w:suppressAutoHyphens w:val="true"/>
-              <w:jc w:val="center"/>
-              <w:cnfStyle w:val="000000100000" w:firstRow="0" w:lastRow="0" w:firstColumn="0" w:lastColumn="0" w:oddVBand="0" w:evenVBand="0" w:oddHBand="1" w:evenHBand="0" w:firstRowFirstColumn="0" w:firstRowLastColumn="0" w:lastRowFirstColumn="0" w:lastRowLastColumn="0"/>
-              <w:rPr>
-                <w:rFonts w:eastAsia="Calibri" w:cs=""/>
-                <w:kern w:val="0"/>
-                <w:sz w:val="22"/>
-                <w:szCs w:val="22"/>
-                <w:lang w:eastAsia="en-US" w:bidi="ar-SA"/>
-              </w:rPr>
-            </w:pPr>
-            <w:r>
-              <w:rPr>
-                <w:rFonts w:eastAsia="Calibri" w:cs=""/>
-                <w:kern w:val="0"/>
-                <w:sz w:val="22"/>
-                <w:szCs w:val="22"/>
-                <w:lang w:eastAsia="en-US" w:bidi="ar-SA"/>
-              </w:rPr>
-            </w:r>
-          </w:p>
-          <w:p>
-            <w:pPr>
-              <w:pStyle w:val="Normal"/>
-              <w:keepNext w:val="true"/>
-              <w:widowControl/>
-              <w:suppressAutoHyphens w:val="true"/>
-              <w:jc w:val="center"/>
-              <w:cnfStyle w:val="000000100000" w:firstRow="0" w:lastRow="0" w:firstColumn="0" w:lastColumn="0" w:oddVBand="0" w:evenVBand="0" w:oddHBand="1" w:evenHBand="0" w:firstRowFirstColumn="0" w:firstRowLastColumn="0" w:lastRowFirstColumn="0" w:lastRowLastColumn="0"/>
-              <w:rPr>
-                <w:rFonts w:eastAsia="Calibri" w:cs=""/>
-                <w:kern w:val="0"/>
-                <w:sz w:val="22"/>
-                <w:szCs w:val="22"/>
-                <w:lang w:eastAsia="en-US" w:bidi="ar-SA"/>
-              </w:rPr>
-            </w:pPr>
-            <w:r>
-              <w:rPr>
-                <w:rFonts w:eastAsia="Calibri" w:cs=""/>
-                <w:kern w:val="0"/>
-                <w:sz w:val="22"/>
-                <w:szCs w:val="22"/>
-                <w:lang w:eastAsia="en-US" w:bidi="ar-SA"/>
-              </w:rPr>
-            </w:r>
-          </w:p>
-          <w:p>
-            <w:pPr>
-              <w:pStyle w:val="Normal"/>
-              <w:keepNext w:val="true"/>
-              <w:widowControl/>
-              <w:suppressAutoHyphens w:val="true"/>
-              <w:jc w:val="center"/>
-              <w:cnfStyle w:val="000000100000" w:firstRow="0" w:lastRow="0" w:firstColumn="0" w:lastColumn="0" w:oddVBand="0" w:evenVBand="0" w:oddHBand="1" w:evenHBand="0" w:firstRowFirstColumn="0" w:firstRowLastColumn="0" w:lastRowFirstColumn="0" w:lastRowLastColumn="0"/>
-              <w:rPr>
-                <w:rFonts w:eastAsia="Calibri" w:cs=""/>
-                <w:kern w:val="0"/>
-                <w:sz w:val="22"/>
-                <w:szCs w:val="22"/>
-                <w:lang w:eastAsia="en-US" w:bidi="ar-SA"/>
-              </w:rPr>
-            </w:pPr>
-            <w:r>
-              <w:rPr>
-                <w:rFonts w:eastAsia="Calibri" w:cs=""/>
-                <w:kern w:val="0"/>
-                <w:sz w:val="22"/>
-                <w:szCs w:val="22"/>
-                <w:lang w:eastAsia="en-US" w:bidi="ar-SA"/>
-              </w:rPr>
-            </w:r>
-          </w:p>
-          <w:p>
-            <w:pPr>
-              <w:pStyle w:val="Normal"/>
-              <w:keepNext w:val="true"/>
-              <w:widowControl/>
-              <w:suppressAutoHyphens w:val="true"/>
-              <w:jc w:val="center"/>
-              <w:cnfStyle w:val="000000100000" w:firstRow="0" w:lastRow="0" w:firstColumn="0" w:lastColumn="0" w:oddVBand="0" w:evenVBand="0" w:oddHBand="1" w:evenHBand="0" w:firstRowFirstColumn="0" w:firstRowLastColumn="0" w:lastRowFirstColumn="0" w:lastRowLastColumn="0"/>
-              <w:rPr>
-                <w:rFonts w:eastAsia="Calibri" w:cs=""/>
-                <w:kern w:val="0"/>
-                <w:sz w:val="22"/>
-                <w:szCs w:val="22"/>
-                <w:lang w:eastAsia="en-US" w:bidi="ar-SA"/>
-              </w:rPr>
-            </w:pPr>
-            <w:r>
-              <w:rPr>
-                <w:rFonts w:eastAsia="Calibri" w:cs=""/>
-                <w:kern w:val="0"/>
-                <w:sz w:val="22"/>
-                <w:szCs w:val="22"/>
-                <w:lang w:eastAsia="en-US" w:bidi="ar-SA"/>
-              </w:rPr>
-            </w:r>
-          </w:p>
-          <w:p>
-            <w:pPr>
-              <w:pStyle w:val="Normal"/>
-              <w:keepNext w:val="true"/>
-              <w:widowControl/>
-              <w:suppressAutoHyphens w:val="true"/>
-              <w:jc w:val="center"/>
-              <w:cnfStyle w:val="000000100000" w:firstRow="0" w:lastRow="0" w:firstColumn="0" w:lastColumn="0" w:oddVBand="0" w:evenVBand="0" w:oddHBand="1" w:evenHBand="0" w:firstRowFirstColumn="0" w:firstRowLastColumn="0" w:lastRowFirstColumn="0" w:lastRowLastColumn="0"/>
-              <w:rPr>
-                <w:rFonts w:eastAsia="Calibri" w:cs=""/>
-                <w:kern w:val="0"/>
-                <w:sz w:val="22"/>
-                <w:szCs w:val="22"/>
-                <w:lang w:eastAsia="en-US" w:bidi="ar-SA"/>
-              </w:rPr>
-            </w:pPr>
-            <w:r>
-              <w:rPr>
-                <w:rFonts w:eastAsia="Calibri" w:cs=""/>
-                <w:kern w:val="0"/>
-                <w:sz w:val="22"/>
-                <w:szCs w:val="22"/>
-                <w:lang w:eastAsia="en-US" w:bidi="ar-SA"/>
-              </w:rPr>
-            </w:r>
-          </w:p>
-          <w:p>
-            <w:pPr>
-              <w:pStyle w:val="Normal"/>
-              <w:keepNext w:val="true"/>
-              <w:widowControl/>
-              <w:suppressAutoHyphens w:val="true"/>
-              <w:jc w:val="center"/>
-              <w:cnfStyle w:val="000000100000" w:firstRow="0" w:lastRow="0" w:firstColumn="0" w:lastColumn="0" w:oddVBand="0" w:evenVBand="0" w:oddHBand="1" w:evenHBand="0" w:firstRowFirstColumn="0" w:firstRowLastColumn="0" w:lastRowFirstColumn="0" w:lastRowLastColumn="0"/>
-              <w:rPr>
-                <w:rFonts w:eastAsia="Calibri" w:cs=""/>
-                <w:kern w:val="0"/>
-                <w:sz w:val="22"/>
-                <w:szCs w:val="22"/>
-                <w:lang w:eastAsia="en-US" w:bidi="ar-SA"/>
-              </w:rPr>
-            </w:pPr>
-            <w:r>
-              <w:rPr>
-                <w:rFonts w:eastAsia="Calibri" w:cs=""/>
-                <w:kern w:val="0"/>
-                <w:sz w:val="22"/>
-                <w:szCs w:val="22"/>
-                <w:lang w:eastAsia="en-US" w:bidi="ar-SA"/>
-              </w:rPr>
-            </w:r>
-          </w:p>
-          <w:p>
-            <w:pPr>
-              <w:pStyle w:val="Normal"/>
-              <w:keepNext w:val="true"/>
-              <w:widowControl/>
-              <w:suppressAutoHyphens w:val="true"/>
-              <w:jc w:val="center"/>
-              <w:cnfStyle w:val="000000100000" w:firstRow="0" w:lastRow="0" w:firstColumn="0" w:lastColumn="0" w:oddVBand="0" w:evenVBand="0" w:oddHBand="1" w:evenHBand="0" w:firstRowFirstColumn="0" w:firstRowLastColumn="0" w:lastRowFirstColumn="0" w:lastRowLastColumn="0"/>
-              <w:rPr>
-                <w:rFonts w:eastAsia="Calibri" w:cs=""/>
-                <w:kern w:val="0"/>
-                <w:sz w:val="22"/>
-                <w:szCs w:val="22"/>
-                <w:lang w:eastAsia="en-US" w:bidi="ar-SA"/>
-              </w:rPr>
-            </w:pPr>
-            <w:r>
-              <w:rPr>
-                <w:rFonts w:eastAsia="Calibri" w:cs=""/>
-                <w:kern w:val="0"/>
-                <w:sz w:val="22"/>
-                <w:szCs w:val="22"/>
-                <w:lang w:eastAsia="en-US" w:bidi="ar-SA"/>
-              </w:rPr>
-            </w:r>
-          </w:p>
-          <w:p>
-            <w:pPr>
-              <w:pStyle w:val="Caption"/>
-              <w:widowControl/>
-              <w:suppressAutoHyphens w:val="true"/>
-              <w:jc w:val="left"/>
-              <w:cnfStyle w:val="000000100000" w:firstRow="0" w:lastRow="0" w:firstColumn="0" w:lastColumn="0" w:oddVBand="0" w:evenVBand="0" w:oddHBand="1" w:evenHBand="0" w:firstRowFirstColumn="0" w:firstRowLastColumn="0" w:lastRowFirstColumn="0" w:lastRowLastColumn="0"/>
-              <w:rPr>
-                <w:rFonts w:ascii="Calibri" w:hAnsi="Calibri" w:eastAsia="Carlito" w:cs="Calibri" w:asciiTheme="minorHAnsi" w:cstheme="minorHAnsi" w:hAnsiTheme="minorHAnsi"/>
-                <w:b/>
-                <w:bCs/>
-                <w:i w:val="false"/>
-                <w:i w:val="false"/>
-                <w:iCs w:val="false"/>
-                <w:sz w:val="20"/>
-                <w:szCs w:val="20"/>
-                <w:lang w:val="es-ES" w:eastAsia="en-US"/>
-              </w:rPr>
-            </w:pPr>
-            <w:r>
-              <w:rPr>
-                <w:rFonts w:eastAsia="Carlito" w:cs="Calibri" w:cstheme="minorHAnsi" w:ascii="Calibri" w:hAnsi="Calibri"/>
-                <w:b/>
-                <w:bCs/>
-                <w:i w:val="false"/>
-                <w:iCs w:val="false"/>
-                <w:sz w:val="20"/>
-                <w:szCs w:val="20"/>
-                <w:lang w:val="es-ES" w:eastAsia="en-US"/>
-              </w:rPr>
-            </w:r>
-          </w:p>
-          <w:p>
-            <w:pPr>
-              <w:pStyle w:val="Caption"/>
-              <w:widowControl/>
-              <w:suppressAutoHyphens w:val="true"/>
-              <w:jc w:val="left"/>
-              <w:cnfStyle w:val="000000100000" w:firstRow="0" w:lastRow="0" w:firstColumn="0" w:lastColumn="0" w:oddVBand="0" w:evenVBand="0" w:oddHBand="1" w:evenHBand="0" w:firstRowFirstColumn="0" w:firstRowLastColumn="0" w:lastRowFirstColumn="0" w:lastRowLastColumn="0"/>
-              <w:rPr>
-                <w:rFonts w:ascii="Calibri" w:hAnsi="Calibri" w:eastAsia="Carlito" w:cs="Calibri" w:asciiTheme="minorHAnsi" w:cstheme="minorHAnsi" w:hAnsiTheme="minorHAnsi"/>
-                <w:b/>
-                <w:bCs/>
-                <w:i w:val="false"/>
-                <w:i w:val="false"/>
-                <w:iCs w:val="false"/>
-                <w:sz w:val="20"/>
-                <w:szCs w:val="20"/>
-                <w:lang w:val="es-ES" w:eastAsia="en-US"/>
-              </w:rPr>
-            </w:pPr>
-            <w:r>
-              <w:rPr>
-                <w:rFonts w:eastAsia="Carlito" w:cs="Calibri" w:cstheme="minorHAnsi" w:ascii="Calibri" w:hAnsi="Calibri"/>
-                <w:b/>
-                <w:bCs/>
-                <w:i w:val="false"/>
-                <w:iCs w:val="false"/>
-                <w:sz w:val="20"/>
-                <w:szCs w:val="20"/>
-                <w:lang w:val="es-ES" w:eastAsia="en-US"/>
-              </w:rPr>
-            </w:r>
-          </w:p>
-          <w:p>
-            <w:pPr>
-              <w:pStyle w:val="Caption"/>
-              <w:widowControl/>
-              <w:suppressAutoHyphens w:val="true"/>
-              <w:jc w:val="left"/>
-              <w:cnfStyle w:val="000000100000" w:firstRow="0" w:lastRow="0" w:firstColumn="0" w:lastColumn="0" w:oddVBand="0" w:evenVBand="0" w:oddHBand="1" w:evenHBand="0" w:firstRowFirstColumn="0" w:firstRowLastColumn="0" w:lastRowFirstColumn="0" w:lastRowLastColumn="0"/>
-              <w:rPr>
-                <w:rFonts w:ascii="Calibri" w:hAnsi="Calibri" w:eastAsia="Carlito" w:cs="Calibri" w:asciiTheme="minorHAnsi" w:cstheme="minorHAnsi" w:hAnsiTheme="minorHAnsi"/>
-                <w:b/>
-                <w:bCs/>
-                <w:i w:val="false"/>
-                <w:i w:val="false"/>
-                <w:iCs w:val="false"/>
-                <w:sz w:val="20"/>
-                <w:szCs w:val="20"/>
-                <w:lang w:val="es-ES" w:eastAsia="en-US"/>
-              </w:rPr>
-            </w:pPr>
-            <w:r>
-              <w:rPr>
-                <w:rFonts w:eastAsia="Carlito" w:cs="Calibri" w:cstheme="minorHAnsi" w:ascii="Calibri" w:hAnsi="Calibri"/>
-                <w:b/>
-                <w:bCs/>
-                <w:i w:val="false"/>
-                <w:iCs w:val="false"/>
-                <w:sz w:val="20"/>
-                <w:szCs w:val="20"/>
-                <w:lang w:val="es-ES" w:eastAsia="en-US"/>
-              </w:rPr>
             </w:r>
           </w:p>
           <w:p>
@@ -11370,7 +10666,7 @@
               <w:widowControl/>
               <w:suppressAutoHyphens w:val="true"/>
               <w:spacing w:before="80" w:after="100"/>
-              <w:jc w:val="left"/>
+              <w:jc w:val="center"/>
               <w:cnfStyle w:val="000000100000" w:firstRow="0" w:lastRow="0" w:firstColumn="0" w:lastColumn="0" w:oddVBand="0" w:evenVBand="0" w:oddHBand="1" w:evenHBand="0" w:firstRowFirstColumn="0" w:firstRowLastColumn="0" w:lastRowFirstColumn="0" w:lastRowLastColumn="0"/>
               <w:rPr>
                 <w:color w:val="B2B2B2"/>
@@ -11507,6 +10803,7 @@
       </w:tr>
       <w:tr>
         <w:trPr>
+          <w:cantSplit/>
           <w:trHeight w:val="380" w:hRule="atLeast"/>
         </w:trPr>
         <w:tc>
@@ -11554,6 +10851,7 @@
       </w:tr>
       <w:tr>
         <w:trPr>
+          <w:cantSplit/>
           <w:trHeight w:val="100" w:hRule="atLeast"/>
         </w:trPr>
         <w:tc>
@@ -11637,6 +10935,7 @@
       </w:tr>
       <w:tr>
         <w:trPr>
+          <w:cantSplit/>
           <w:trHeight w:val="100" w:hRule="atLeast"/>
           <w:cnfStyle w:val="000000100000" w:firstRow="0" w:lastRow="0" w:firstColumn="0" w:lastColumn="0" w:oddVBand="0" w:evenVBand="0" w:oddHBand="1" w:evenHBand="0" w:firstRowFirstColumn="0" w:firstRowLastColumn="0" w:lastRowFirstColumn="0" w:lastRowLastColumn="0"/>
         </w:trPr>
@@ -11688,7 +10987,7 @@
                 <w:szCs w:val="22"/>
                 <w:lang w:eastAsia="en-US" w:bidi="ar-SA"/>
               </w:rPr>
-              <w:t>El usuario elige la magnitud "Temperatura" y las escalas (Celsius, Fahrenheit, Kelvin, Rankine o Reaumur).</w:t>
+              <w:t>El usuario elige la magnitud "Temperatura" y las escalas (Celsius, Fahrenheit, Kelvin, Newton o Reaumur).</w:t>
             </w:r>
           </w:p>
         </w:tc>
@@ -11735,6 +11034,7 @@
       </w:tr>
       <w:tr>
         <w:trPr>
+          <w:cantSplit/>
           <w:trHeight w:val="100" w:hRule="atLeast"/>
         </w:trPr>
         <w:tc>
@@ -11783,7 +11083,7 @@
                 <w:szCs w:val="22"/>
                 <w:lang w:eastAsia="en-US" w:bidi="ar-SA"/>
               </w:rPr>
-              <w:t>HTTP a la servicio web SOAP.</w:t>
+              <w:t>SOAP al servicio web (JAX-WS).</w:t>
             </w:r>
           </w:p>
         </w:tc>
@@ -11840,6 +11140,7 @@
       </w:tr>
       <w:tr>
         <w:trPr>
+          <w:cantSplit/>
           <w:trHeight w:val="100" w:hRule="atLeast"/>
         </w:trPr>
         <w:tc>
@@ -11886,6 +11187,7 @@
       </w:tr>
       <w:tr>
         <w:trPr>
+          <w:cantSplit/>
           <w:trHeight w:val="100" w:hRule="atLeast"/>
           <w:cnfStyle w:val="000000100000" w:firstRow="0" w:lastRow="0" w:firstColumn="0" w:lastColumn="0" w:oddVBand="0" w:evenVBand="0" w:oddHBand="1" w:evenHBand="0" w:firstRowFirstColumn="0" w:firstRowLastColumn="0" w:lastRowFirstColumn="0" w:lastRowLastColumn="0"/>
         </w:trPr>
@@ -11919,7 +11221,7 @@
                 <w:b w:val="false"/>
                 <w:bCs w:val="false"/>
               </w:rPr>
-              <w:t xml:space="preserve">Si el usuario ingresa datos no numéricos, </w:t>
+              <w:t xml:space="preserve">Si el usuario ingresa datos no numéricos o mayores a 16 caracteres, </w:t>
             </w:r>
             <w:r>
               <w:rPr/>
@@ -11971,6 +11273,7 @@
       </w:tr>
       <w:tr>
         <w:trPr>
+          <w:cantSplit/>
           <w:trHeight w:val="260" w:hRule="atLeast"/>
         </w:trPr>
         <w:tc>
@@ -12042,13 +11345,14 @@
                 <w:szCs w:val="22"/>
                 <w:lang w:eastAsia="en-US" w:bidi="ar-SA"/>
               </w:rPr>
-              <w:t>El sistema ha actualizado la base de usuarios centralizada, permitiendo o denegando accesos según los cambios realizados.</w:t>
+              <w:t>Visualización del resultado de la conversión térmica en la interfaz del cliente (Móvil, Web, Escritorio o Consola).</w:t>
             </w:r>
           </w:p>
         </w:tc>
       </w:tr>
       <w:tr>
         <w:trPr>
+          <w:cantSplit/>
           <w:trHeight w:val="260" w:hRule="atLeast"/>
           <w:cnfStyle w:val="000000100000" w:firstRow="0" w:lastRow="0" w:firstColumn="0" w:lastColumn="0" w:oddVBand="0" w:evenVBand="0" w:oddHBand="1" w:evenHBand="0" w:firstRowFirstColumn="0" w:firstRowLastColumn="0" w:lastRowFirstColumn="0" w:lastRowLastColumn="0"/>
         </w:trPr>
@@ -12103,6 +11407,7 @@
       </w:tr>
       <w:tr>
         <w:trPr>
+          <w:cantSplit/>
           <w:trHeight w:val="260" w:hRule="atLeast"/>
         </w:trPr>
         <w:tc>

</xml_diff>

<commit_message>
docs(gr09): actualizar casos de uso y diagramas UML
Registra los documentos ECUD de las cuatro variantes SINBDD y los modelos PowerDesigner de casos de uso, incluidas sus copias OOB.

Agrega las exportaciones PNG de los casos de uso y del diagrama general para SOAP Java, SOAP .NET, REST Java y REST .NET.
</commit_message>
<xml_diff>
--- a/TI.1.1. PAO202651_SOAP_JAVA_SINBDD_NRC36884_GR09/01. UML/02. ECUD/ECUD_SOAP_JAVA_SINBDD_GR09.docx
+++ b/TI.1.1. PAO202651_SOAP_JAVA_SINBDD_NRC36884_GR09/01. UML/02. ECUD/ECUD_SOAP_JAVA_SINBDD_GR09.docx
@@ -1,6 +1,6 @@
 
 <file path=word/document.xml><?xml version="1.0" encoding="utf-8"?>
-<w:document xmlns:wpc="http://schemas.microsoft.com/office/word/2010/wordprocessingCanvas" xmlns:cx="http://schemas.microsoft.com/office/drawing/2014/chartex" xmlns:cx1="http://schemas.microsoft.com/office/drawing/2015/9/8/chartex" xmlns:cx2="http://schemas.microsoft.com/office/drawing/2015/10/21/chartex" xmlns:cx3="http://schemas.microsoft.com/office/drawing/2016/5/9/chartex" xmlns:cx4="http://schemas.microsoft.com/office/drawing/2016/5/10/chartex" xmlns:cx5="http://schemas.microsoft.com/office/drawing/2016/5/11/chartex" xmlns:cx6="http://schemas.microsoft.com/office/drawing/2016/5/12/chartex" xmlns:cx7="http://schemas.microsoft.com/office/drawing/2016/5/13/chartex" xmlns:cx8="http://schemas.microsoft.com/office/drawing/2016/5/14/chartex" xmlns:mc="http://schemas.openxmlformats.org/markup-compatibility/2006" xmlns:aink="http://schemas.microsoft.com/office/drawing/2016/ink" xmlns:am3d="http://schemas.microsoft.com/office/drawing/2017/model3d" xmlns:o="urn:schemas-microsoft-com:office:office" xmlns:r="http://schemas.openxmlformats.org/officeDocument/2006/relationships" xmlns:m="http://schemas.openxmlformats.org/officeDocument/2006/math" xmlns:v="urn:schemas-microsoft-com:vml" xmlns:wp14="http://schemas.microsoft.com/office/word/2010/wordprocessingDrawing" xmlns:wp="http://schemas.openxmlformats.org/drawingml/2006/wordprocessingDrawing" xmlns:w10="urn:schemas-microsoft-com:office:word" xmlns:w="http://schemas.openxmlformats.org/wordprocessingml/2006/main" xmlns:w14="http://schemas.microsoft.com/office/word/2010/wordml" xmlns:w15="http://schemas.microsoft.com/office/word/2012/wordml" xmlns:w16cex="http://schemas.microsoft.com/office/word/2018/wordml/cex" xmlns:w16cid="http://schemas.microsoft.com/office/word/2016/wordml/cid" xmlns:w16="http://schemas.microsoft.com/office/word/2018/wordml" xmlns:w16sdtdh="http://schemas.microsoft.com/office/word/2020/wordml/sdtdatahash" xmlns:w16se="http://schemas.microsoft.com/office/word/2015/wordml/symex" xmlns:wpg="http://schemas.microsoft.com/office/word/2010/wordprocessingGroup" xmlns:wpi="http://schemas.microsoft.com/office/word/2010/wordprocessingInk" xmlns:wne="http://schemas.microsoft.com/office/word/2006/wordml" xmlns:wps="http://schemas.microsoft.com/office/word/2010/wordprocessingShape" mc:Ignorable="w14 w15 w16se w16cid w16 w16cex w16sdtdh wp14">
+<w:document xmlns:wpc="http://schemas.microsoft.com/office/word/2010/wordprocessingCanvas" xmlns:mc="http://schemas.openxmlformats.org/markup-compatibility/2006" xmlns:o="urn:schemas-microsoft-com:office:office" xmlns:r="http://schemas.openxmlformats.org/officeDocument/2006/relationships" xmlns:m="http://schemas.openxmlformats.org/officeDocument/2006/math" xmlns:v="urn:schemas-microsoft-com:vml" xmlns:wp14="http://schemas.microsoft.com/office/word/2010/wordprocessingDrawing" xmlns:wp="http://schemas.openxmlformats.org/drawingml/2006/wordprocessingDrawing" xmlns:w10="urn:schemas-microsoft-com:office:word" xmlns:w="http://schemas.openxmlformats.org/wordprocessingml/2006/main" xmlns:w14="http://schemas.microsoft.com/office/word/2010/wordml" xmlns:w15="http://schemas.microsoft.com/office/word/2012/wordml" xmlns:wpg="http://schemas.microsoft.com/office/word/2010/wordprocessingGroup" xmlns:wpi="http://schemas.microsoft.com/office/word/2010/wordprocessingInk" xmlns:wne="http://schemas.microsoft.com/office/word/2006/wordml" xmlns:wps="http://schemas.microsoft.com/office/word/2010/wordprocessingShape" mc:Ignorable="w14 w15 wp14">
   <w:body>
     <w:p>
       <w:pPr>
@@ -58,7 +58,7 @@
         <w:jc w:val="center"/>
       </w:pPr>
       <w:r>
-        <w:t>Autor:</w:t>
+        <w:t>Autores:</w:t>
       </w:r>
     </w:p>
     <w:p>
@@ -67,7 +67,7 @@
         <w:jc w:val="center"/>
       </w:pPr>
       <w:r>
-        <w:t>VICHE CASTILLO JULIO ENRIQUE</w:t>
+        <w:t>Gabriel Murillo y Julio Viche</w:t>
       </w:r>
     </w:p>
     <w:p>
@@ -84,7 +84,6 @@
         <w:spacing w:after="300"/>
         <w:jc w:val="center"/>
       </w:pPr>
-      <w:r/>
     </w:p>
     <w:p>
       <w:pPr>
@@ -241,12 +240,21 @@
         </w:rPr>
         <w:t xml:space="preserve"> </w:t>
       </w:r>
+      <w:proofErr w:type="gramStart"/>
       <w:r>
         <w:rPr>
           <w:b/>
           <w:sz w:val="20"/>
         </w:rPr>
-        <w:t>DETALLADO ............................................................................................... 1</w:t>
+        <w:t>DETALLADO ...............................................................................................</w:t>
+      </w:r>
+      <w:proofErr w:type="gramEnd"/>
+      <w:r>
+        <w:rPr>
+          <w:b/>
+          <w:sz w:val="20"/>
+        </w:rPr>
+        <w:t xml:space="preserve"> 1</w:t>
       </w:r>
       <w:r>
         <w:rPr>
@@ -309,11 +317,19 @@
         </w:rPr>
         <w:t xml:space="preserve"> </w:t>
       </w:r>
+      <w:proofErr w:type="gramStart"/>
       <w:r>
         <w:rPr>
           <w:sz w:val="20"/>
         </w:rPr>
-        <w:t>USO ................................................................................................................. 1</w:t>
+        <w:t>USO .................................................................................................................</w:t>
+      </w:r>
+      <w:proofErr w:type="gramEnd"/>
+      <w:r>
+        <w:rPr>
+          <w:sz w:val="20"/>
+        </w:rPr>
+        <w:t xml:space="preserve"> 1</w:t>
       </w:r>
       <w:r>
         <w:rPr>
@@ -415,7 +431,23 @@
           <w:rFonts w:ascii="Arial" w:eastAsia="Arial" w:hAnsi="Arial" w:cs="Arial"/>
           <w:sz w:val="18"/>
         </w:rPr>
-        <w:t>DIAGRAMA GENERAL DE CASOS DE USO .............................................................. 2</w:t>
+        <w:t xml:space="preserve">DIAGRAMA GENERAL DE CASOS DE </w:t>
+      </w:r>
+      <w:proofErr w:type="gramStart"/>
+      <w:r>
+        <w:rPr>
+          <w:rFonts w:ascii="Arial" w:eastAsia="Arial" w:hAnsi="Arial" w:cs="Arial"/>
+          <w:sz w:val="18"/>
+        </w:rPr>
+        <w:t>USO ..............................................................</w:t>
+      </w:r>
+      <w:proofErr w:type="gramEnd"/>
+      <w:r>
+        <w:rPr>
+          <w:rFonts w:ascii="Arial" w:eastAsia="Arial" w:hAnsi="Arial" w:cs="Arial"/>
+          <w:sz w:val="18"/>
+        </w:rPr>
+        <w:t xml:space="preserve"> 2</w:t>
       </w:r>
     </w:p>
     <w:p>
@@ -452,6 +484,7 @@
         <w:rPr>
           <w:rFonts w:ascii="Arial" w:eastAsia="Arial" w:hAnsi="Arial" w:cs="Arial"/>
         </w:rPr>
+        <w:lastRenderedPageBreak/>
         <w:t xml:space="preserve">ECUD_INGRESAR_AL_SISTEMA </w:t>
       </w:r>
     </w:p>
@@ -464,7 +497,21 @@
         <w:rPr>
           <w:rFonts w:ascii="Arial" w:eastAsia="Arial" w:hAnsi="Arial" w:cs="Arial"/>
         </w:rPr>
-        <w:t xml:space="preserve">A continuación, se muestra ECUD_INGRESAR_SISTEMA ............................................ </w:t>
+        <w:t>A continuación, se muestra ECUD_INGRESAR_</w:t>
+      </w:r>
+      <w:proofErr w:type="gramStart"/>
+      <w:r>
+        <w:rPr>
+          <w:rFonts w:ascii="Arial" w:eastAsia="Arial" w:hAnsi="Arial" w:cs="Arial"/>
+        </w:rPr>
+        <w:t>SISTEMA ............................................</w:t>
+      </w:r>
+      <w:proofErr w:type="gramEnd"/>
+      <w:r>
+        <w:rPr>
+          <w:rFonts w:ascii="Arial" w:eastAsia="Arial" w:hAnsi="Arial" w:cs="Arial"/>
+        </w:rPr>
+        <w:t xml:space="preserve"> </w:t>
       </w:r>
       <w:r>
         <w:rPr>
@@ -537,7 +584,21 @@
         <w:rPr>
           <w:rFonts w:ascii="Arial" w:eastAsia="Arial" w:hAnsi="Arial" w:cs="Arial"/>
         </w:rPr>
-        <w:t xml:space="preserve">A continuación, se muestra ECUD_INGRESAR_SISTEMA ............................................ 1 </w:t>
+        <w:t>A continuación, se muestra ECUD_INGRESAR_</w:t>
+      </w:r>
+      <w:proofErr w:type="gramStart"/>
+      <w:r>
+        <w:rPr>
+          <w:rFonts w:ascii="Arial" w:eastAsia="Arial" w:hAnsi="Arial" w:cs="Arial"/>
+        </w:rPr>
+        <w:t>SISTEMA ............................................</w:t>
+      </w:r>
+      <w:proofErr w:type="gramEnd"/>
+      <w:r>
+        <w:rPr>
+          <w:rFonts w:ascii="Arial" w:eastAsia="Arial" w:hAnsi="Arial" w:cs="Arial"/>
+        </w:rPr>
+        <w:t xml:space="preserve"> 1 </w:t>
       </w:r>
     </w:p>
     <w:p>
@@ -574,7 +635,21 @@
         <w:rPr>
           <w:rFonts w:ascii="Arial" w:eastAsia="Arial" w:hAnsi="Arial" w:cs="Arial"/>
         </w:rPr>
-        <w:t xml:space="preserve">A continuación, se muestra la Especificación de Casos de uso Detallado (ECUD) para el Sistema de Conversión de Unidades. </w:t>
+        <w:t xml:space="preserve">A continuación, se muestra la Especificación de Casos de </w:t>
+      </w:r>
+      <w:proofErr w:type="gramStart"/>
+      <w:r>
+        <w:rPr>
+          <w:rFonts w:ascii="Arial" w:eastAsia="Arial" w:hAnsi="Arial" w:cs="Arial"/>
+        </w:rPr>
+        <w:t>uso</w:t>
+      </w:r>
+      <w:proofErr w:type="gramEnd"/>
+      <w:r>
+        <w:rPr>
+          <w:rFonts w:ascii="Arial" w:eastAsia="Arial" w:hAnsi="Arial" w:cs="Arial"/>
+        </w:rPr>
+        <w:t xml:space="preserve"> Detallado (ECUD) para el Sistema de Conversión de Unidades. </w:t>
       </w:r>
     </w:p>
     <w:p>
@@ -611,6 +686,7 @@
           <w:b/>
           <w:sz w:val="28"/>
         </w:rPr>
+        <w:lastRenderedPageBreak/>
         <w:t>DIAGRAMA GENERAL DE CASOS DE USO</w:t>
       </w:r>
     </w:p>
@@ -631,10 +707,11 @@
           <w:b/>
           <w:noProof/>
           <w:sz w:val="24"/>
+          <w:lang w:val="es-EC" w:eastAsia="es-EC"/>
         </w:rPr>
         <w:drawing>
           <wp:inline distT="0" distB="0" distL="0" distR="0" wp14:anchorId="1B0B6CB8" wp14:editId="0614BAD6">
-            <wp:extent cx="5486400" cy="4996082"/>
+            <wp:extent cx="5485584" cy="5000000"/>
             <wp:effectExtent l="0" t="0" r="0" b="0"/>
             <wp:docPr id="1" name="Imagen 1" descr="Diagrama general de casos de uso: inicio de sesión, conversiones de unidades, validación de token y validación de unidades."/>
             <wp:cNvGraphicFramePr>
@@ -662,7 +739,7 @@
                   <pic:spPr>
                     <a:xfrm>
                       <a:off x="0" y="0"/>
-                      <a:ext cx="5486400" cy="4996082"/>
+                      <a:ext cx="5485584" cy="5000000"/>
                     </a:xfrm>
                     <a:prstGeom prst="rect">
                       <a:avLst/>
@@ -705,6 +782,7 @@
           <w:b/>
           <w:sz w:val="24"/>
         </w:rPr>
+        <w:lastRenderedPageBreak/>
         <w:t>ESPECIFICACIÓN DE CASOS DE USO</w:t>
       </w:r>
       <w:r>
@@ -938,7 +1016,21 @@
           </w:tcPr>
           <w:p>
             <w:r>
-              <w:t>Permite al usuario autenticarse en el sistema enviando sus credenciales fijas al servicio SOAP ServicioAutenticacion (login(usuario, contrasenia)). Si son correctas, el sistema genera un token UUID, lo almacena en memoria RAM volátil (SINBDD) y lo retorna en la respuesta SOAP para ser usado en las solicitudes de conversión.</w:t>
+              <w:t xml:space="preserve">Permite al usuario autenticarse en el </w:t>
+            </w:r>
+            <w:r>
+              <w:t>sistema enviando sus credenciales fijas al servicio SOAP ServicioAutenticacion (</w:t>
+            </w:r>
+            <w:proofErr w:type="gramStart"/>
+            <w:r>
+              <w:t>login(</w:t>
+            </w:r>
+            <w:proofErr w:type="gramEnd"/>
+            <w:r>
+              <w:t>usuario, contrasenia)). Si son correctas, el sistema genera un token UUID, lo almacena en memoria RAM volátil (SINBDD) y lo retorna en la respuesta SOAP para ser usado en</w:t>
+            </w:r>
+            <w:r>
+              <w:t xml:space="preserve"> las solicitudes de conversión.</w:t>
             </w:r>
           </w:p>
         </w:tc>
@@ -1124,7 +1216,10 @@
           </w:tcPr>
           <w:p>
             <w:r>
-              <w:t>Julio Enrique Viche Castillo (GR09)</w:t>
+              <w:t xml:space="preserve">Gabriel Murillo y Julio Viche (Grupo 9, NRC </w:t>
+            </w:r>
+            <w:r>
+              <w:t>36884)</w:t>
             </w:r>
           </w:p>
         </w:tc>
@@ -1251,8 +1346,12 @@
           <w:p>
             <w:r>
               <w:t>usuario: nombre de usuario ("MONSTER")</w:t>
+            </w:r>
+            <w:r>
               <w:br/>
               <w:t>contrasenia: clave de acceso ("MONSTER9")</w:t>
+            </w:r>
+            <w:r>
               <w:br/>
               <w:t>Credenciales maestras fijas: usuario = MONSTER, contrasenia = MONSTER9</w:t>
             </w:r>
@@ -1297,6 +1396,8 @@
           <w:p>
             <w:r>
               <w:t>El servidor SOAP (ServidorSOAP en Payara Server) debe estar desplegado y accesible en http://localhost:8080/ServidorSOAP.</w:t>
+            </w:r>
+            <w:r>
               <w:br/>
               <w:t>El usuario debe conocer sus credenciales de acceso.</w:t>
             </w:r>
@@ -1340,7 +1441,12 @@
           </w:tcPr>
           <w:p>
             <w:r>
-              <w:t>Éxito: el sistema genera un token UUID, lo almacena en memoria y responde con success = true y message: "Bienvenido al sistema."</w:t>
+              <w:t xml:space="preserve">Éxito: el sistema genera un token UUID, lo </w:t>
+            </w:r>
+            <w:r>
+              <w:t>almacena en memoria y responde con success = true y message: "Bienvenido al sistema."</w:t>
+            </w:r>
+            <w:r>
               <w:br/>
               <w:t>Fallo: el sistema NO genera token, responde con SOAP Fault (código 401) y message: "Usuario o clave fallidos, intenta de nuevo."</w:t>
             </w:r>
@@ -1351,12 +1457,8 @@
     <w:p>
       <w:pPr>
         <w:sectPr>
-          <w:headerReference w:type="even" r:id="rId8"/>
-          <w:headerReference w:type="default" r:id="rId9"/>
-          <w:footerReference w:type="even" r:id="rId10"/>
-          <w:footerReference w:type="default" r:id="rId11"/>
-          <w:headerReference w:type="first" r:id="rId12"/>
-          <w:footerReference w:type="first" r:id="rId13"/>
+          <w:footerReference w:type="even" r:id="rId8"/>
+          <w:footerReference w:type="default" r:id="rId9"/>
           <w:pgSz w:w="11906" w:h="16838" w:code="9"/>
           <w:pgMar w:top="1418" w:right="1701" w:bottom="1418" w:left="1701" w:header="709" w:footer="709" w:gutter="0"/>
           <w:pgBorders w:offsetFrom="page">
@@ -1395,7 +1497,7 @@
       </w:tblGrid>
       <w:tr>
         <w:trPr>
-          <w:trHeight w:val="4640"/>
+          <w:cantSplit/>
         </w:trPr>
         <w:tc>
           <w:tcPr>
@@ -1438,14 +1540,14 @@
             </w:pPr>
             <w:r>
               <w:rPr>
-                <w:rFonts w:ascii="Arial" w:eastAsia="Arial" w:hAnsi="Arial" w:cs="Arial"/>
                 <w:noProof/>
+                <w:lang w:val="es-EC" w:eastAsia="es-EC"/>
               </w:rPr>
               <w:drawing>
-                <wp:inline distT="0" distB="0" distL="0" distR="0" wp14:anchorId="65465F18" wp14:editId="52DBE229">
-                  <wp:extent cx="2794000" cy="2657613"/>
-                  <wp:effectExtent l="0" t="0" r="6350" b="9525"/>
-                  <wp:docPr id="2" name="Imagen 2" descr="Diagrama detallado del caso de uso CU-01: Ingresar al sistema, exportado desde PowerDesigner."/>
+                <wp:inline distT="0" distB="0" distL="0" distR="0">
+                  <wp:extent cx="1852083" cy="3047999"/>
+                  <wp:effectExtent l="0" t="0" r="0" b="635"/>
+                  <wp:docPr id="9" name="Imagen 9" descr="Diagrama PowerDesigner CU-01: Iniciar Sesion"/>
                   <wp:cNvGraphicFramePr>
                     <a:graphicFrameLocks xmlns:a="http://schemas.openxmlformats.org/drawingml/2006/main" noChangeAspect="1"/>
                   </wp:cNvGraphicFramePr>
@@ -1453,11 +1555,11 @@
                     <a:graphicData uri="http://schemas.openxmlformats.org/drawingml/2006/picture">
                       <pic:pic xmlns:pic="http://schemas.openxmlformats.org/drawingml/2006/picture">
                         <pic:nvPicPr>
-                          <pic:cNvPr id="2" name="Imagen 2" descr="Diagrama detallado del caso de uso CU-01: Ingresar al sistema, exportado desde PowerDesigner."/>
+                          <pic:cNvPr id="9" name=""/>
                           <pic:cNvPicPr/>
                         </pic:nvPicPr>
                         <pic:blipFill>
-                          <a:blip r:embed="rId14" cstate="print">
+                          <a:blip r:embed="rId10">
                             <a:extLst>
                               <a:ext uri="{28A0092B-C50C-407E-A947-70E740481C1C}">
                                 <a14:useLocalDpi xmlns:a14="http://schemas.microsoft.com/office/drawing/2010/main" val="0"/>
@@ -1471,7 +1573,7 @@
                         <pic:spPr>
                           <a:xfrm>
                             <a:off x="0" y="0"/>
-                            <a:ext cx="2794000" cy="2657613"/>
+                            <a:ext cx="1852083" cy="3047999"/>
                           </a:xfrm>
                           <a:prstGeom prst="rect">
                             <a:avLst/>
@@ -1483,12 +1585,6 @@
                 </wp:inline>
               </w:drawing>
             </w:r>
-            <w:r>
-              <w:rPr>
-                <w:rFonts w:ascii="Arial" w:eastAsia="Arial" w:hAnsi="Arial" w:cs="Arial"/>
-              </w:rPr>
-              <w:t xml:space="preserve"> </w:t>
-            </w:r>
           </w:p>
         </w:tc>
       </w:tr>
@@ -1591,7 +1687,18 @@
           </w:tcPr>
           <w:p>
             <w:r>
-              <w:t>El usuario envía una solicitud SOAP login(usuario, contrasenia) al ServicioAutenticacion con sus credenciales (usuario: "MONSTER", contrasenia: "MONSTER9").</w:t>
+              <w:t xml:space="preserve">El usuario envía una solicitud SOAP </w:t>
+            </w:r>
+            <w:proofErr w:type="gramStart"/>
+            <w:r>
+              <w:t>login(</w:t>
+            </w:r>
+            <w:proofErr w:type="gramEnd"/>
+            <w:r>
+              <w:t xml:space="preserve">usuario, contrasenia) al ServicioAutenticacion con sus credenciales (usuario: </w:t>
+            </w:r>
+            <w:r>
+              <w:t>"MONSTER", contrasenia: "MONSTER9").</w:t>
             </w:r>
           </w:p>
         </w:tc>
@@ -1834,7 +1941,10 @@
           </w:tcPr>
           <w:p>
             <w:r>
-              <w:t>El servidor responde con el sobre SOAP con success = true, el token generado y mensaje de bienvenida.</w:t>
+              <w:t>El servidor responde con el sobre SOAP con success = true, el token generado</w:t>
+            </w:r>
+            <w:r>
+              <w:t xml:space="preserve"> y mensaje de bienvenida.</w:t>
             </w:r>
           </w:p>
         </w:tc>
@@ -1932,7 +2042,18 @@
           </w:tcPr>
           <w:p>
             <w:r>
-              <w:t>• Credenciales inválidas: el servidor responde con SOAP Fault (código 401) y message: "Usuario o clave fallidos, intenta de nuevo." No se genera ningún token. • Campos vacíos o nulos: el servidor responde con SOAP Fault (código 400).</w:t>
+              <w:t xml:space="preserve">• Credenciales inválidas: el servidor responde con SOAP Fault (código 401) y message: "Usuario o clave fallidos, intenta </w:t>
+            </w:r>
+            <w:r>
+              <w:t xml:space="preserve">de nuevo." No se genera ningún token. </w:t>
+            </w:r>
+            <w:proofErr w:type="gramStart"/>
+            <w:r>
+              <w:t>• Campos</w:t>
+            </w:r>
+            <w:proofErr w:type="gramEnd"/>
+            <w:r>
+              <w:t xml:space="preserve"> vacíos o nulos: el servidor responde con SOAP Fault (código 400).</w:t>
             </w:r>
           </w:p>
         </w:tc>
@@ -2207,7 +2328,18 @@
           </w:tcPr>
           <w:p>
             <w:r>
-              <w:t>Permite al usuario autenticado convertir una medida de longitud entre las 5 unidades autorizadas del catálogo estricto: metro, centimetro, pie, yarda y milla. La solicitud se realiza mediante la operación SOAP convertirLongitud(token, valor, origen, destino) en ServicioConversion.</w:t>
+              <w:t>Permite al usuario autenticado convertir una medida de longitud entre las 5 unidades autorizadas del catálogo estricto: metro, centimetro, pie, yarda y milla. La solicitud se realiza mediante la op</w:t>
+            </w:r>
+            <w:r>
+              <w:t xml:space="preserve">eración SOAP </w:t>
+            </w:r>
+            <w:proofErr w:type="gramStart"/>
+            <w:r>
+              <w:t>convertirLongitud(</w:t>
+            </w:r>
+            <w:proofErr w:type="gramEnd"/>
+            <w:r>
+              <w:t>token, valor, origen, destino) en ServicioConversion.</w:t>
             </w:r>
           </w:p>
         </w:tc>
@@ -2393,7 +2525,7 @@
           </w:tcPr>
           <w:p>
             <w:r>
-              <w:t>Julio Enrique Viche Castillo (GR09)</w:t>
+              <w:t>Gabriel Murillo y Julio Viche (Grupo 9, NRC 36884)</w:t>
             </w:r>
           </w:p>
         </w:tc>
@@ -2520,10 +2652,19 @@
           <w:p>
             <w:r>
               <w:t>from: unidad de origen (metro | centimetro | pie | yarda | milla)</w:t>
+            </w:r>
+            <w:r>
               <w:br/>
-              <w:t>to: unidad de destino (metro | centimetro | pie | yarda | milla)</w:t>
+              <w:t xml:space="preserve">to: unidad </w:t>
+            </w:r>
+            <w:r>
+              <w:t>de destino (metro | centimetro | pie | yarda | milla)</w:t>
+            </w:r>
+            <w:r>
               <w:br/>
               <w:t>value: valor numérico a convertir (double, máx 16 caracteres)</w:t>
+            </w:r>
+            <w:r>
               <w:br/>
               <w:t>token: token UUID obtenido en CU-01</w:t>
             </w:r>
@@ -2599,6 +2740,7 @@
                 <w:rFonts w:ascii="Arial" w:eastAsia="Arial" w:hAnsi="Arial" w:cs="Arial"/>
                 <w:b/>
               </w:rPr>
+              <w:lastRenderedPageBreak/>
               <w:t xml:space="preserve">Postcondiciones: </w:t>
             </w:r>
           </w:p>
@@ -2615,9 +2757,16 @@
           </w:tcPr>
           <w:p>
             <w:r>
-              <w:t>Éxito: el sistema retorna result con el valor convertido (a 2 decimales), success = true y message: "Conversión exitosa."</w:t>
+              <w:t>Éxito: el sistema retorna result con el valor convertido (</w:t>
+            </w:r>
+            <w:r>
+              <w:t>a 2 decimales), success = true y message: "Conversión exitosa."</w:t>
+            </w:r>
+            <w:r>
               <w:br/>
               <w:t>Fallo por token: SOAP Fault (código 401) con message: "Tu sesión expiró o el token no vale."</w:t>
+            </w:r>
+            <w:r>
               <w:br/>
               <w:t>Fallo por unidad: SOAP Fault (código 400) con message: "Unidad de origen/destino no reconocida."</w:t>
             </w:r>
@@ -2649,7 +2798,7 @@
       </w:tblGrid>
       <w:tr>
         <w:trPr>
-          <w:trHeight w:val="5162"/>
+          <w:cantSplit/>
         </w:trPr>
         <w:tc>
           <w:tcPr>
@@ -2684,19 +2833,58 @@
               <w:bottom w:val="single" w:sz="5" w:space="0" w:color="000000"/>
               <w:right w:val="single" w:sz="5" w:space="0" w:color="000000"/>
             </w:tcBorders>
-            <w:vAlign w:val="bottom"/>
-          </w:tcPr>
-          <w:p>
-            <w:pPr>
-              <w:spacing w:line="4880" w:lineRule="exact"/>
+          </w:tcPr>
+          <w:p>
+            <w:pPr>
               <w:ind w:right="41"/>
-              <w:jc w:val="right"/>
-            </w:pPr>
-            <w:r>
-              <w:rPr>
-                <w:rFonts w:ascii="Arial" w:eastAsia="Arial" w:hAnsi="Arial" w:cs="Arial"/>
-              </w:rPr>
-              <w:t xml:space="preserve"> </w:t>
+              <w:jc w:val="center"/>
+            </w:pPr>
+            <w:r>
+              <w:rPr>
+                <w:noProof/>
+                <w:lang w:val="es-EC" w:eastAsia="es-EC"/>
+              </w:rPr>
+              <w:drawing>
+                <wp:inline distT="0" distB="0" distL="0" distR="0">
+                  <wp:extent cx="3158837" cy="3048001"/>
+                  <wp:effectExtent l="0" t="0" r="3810" b="0"/>
+                  <wp:docPr id="10" name="Imagen 10" descr="Diagrama PowerDesigner CU-02: Convertir Longitud"/>
+                  <wp:cNvGraphicFramePr>
+                    <a:graphicFrameLocks xmlns:a="http://schemas.openxmlformats.org/drawingml/2006/main" noChangeAspect="1"/>
+                  </wp:cNvGraphicFramePr>
+                  <a:graphic xmlns:a="http://schemas.openxmlformats.org/drawingml/2006/main">
+                    <a:graphicData uri="http://schemas.openxmlformats.org/drawingml/2006/picture">
+                      <pic:pic xmlns:pic="http://schemas.openxmlformats.org/drawingml/2006/picture">
+                        <pic:nvPicPr>
+                          <pic:cNvPr id="10" name=""/>
+                          <pic:cNvPicPr/>
+                        </pic:nvPicPr>
+                        <pic:blipFill>
+                          <a:blip r:embed="rId11">
+                            <a:extLst>
+                              <a:ext uri="{28A0092B-C50C-407E-A947-70E740481C1C}">
+                                <a14:useLocalDpi xmlns:a14="http://schemas.microsoft.com/office/drawing/2010/main" val="0"/>
+                              </a:ext>
+                            </a:extLst>
+                          </a:blip>
+                          <a:stretch>
+                            <a:fillRect/>
+                          </a:stretch>
+                        </pic:blipFill>
+                        <pic:spPr>
+                          <a:xfrm>
+                            <a:off x="0" y="0"/>
+                            <a:ext cx="3158837" cy="3048001"/>
+                          </a:xfrm>
+                          <a:prstGeom prst="rect">
+                            <a:avLst/>
+                          </a:prstGeom>
+                        </pic:spPr>
+                      </pic:pic>
+                    </a:graphicData>
+                  </a:graphic>
+                </wp:inline>
+              </w:drawing>
             </w:r>
           </w:p>
         </w:tc>
@@ -3121,7 +3309,11 @@
           </w:tcPr>
           <w:p>
             <w:r>
-              <w:t>• Token inválido o expirado (CU-05): SOAP Fault (código 401), message: "Tu sesión expiró o el token no vale." Se sugiere volver a CU-01. • Unidad de origen no reconocida (CU-06): SOAP Fault (código 400), message: "Unidad de origen no reconocida." • Unidad de destino no reconocida (CU-06): SOAP Fault (código 400), message: "Unidad de destino no reconocida." • Valor no numérico: SOAP Fault (código 400).</w:t>
+              <w:lastRenderedPageBreak/>
+              <w:t xml:space="preserve">• Token inválido o expirado (CU-05): SOAP Fault (código 401), message: "Tu sesión expiró o el token no vale." Se sugiere volver a CU-01. • Unidad de origen no reconocida (CU-06): SOAP Fault (código 400), </w:t>
+            </w:r>
+            <w:r>
+              <w:t>message: "Unidad de origen no reconocida." • Unidad de destino no reconocida (CU-06): SOAP Fault (código 400), message: "Unidad de destino no reconocida." • Valor no numérico: SOAP Fault (código 400).</w:t>
             </w:r>
           </w:p>
         </w:tc>
@@ -3453,7 +3645,18 @@
           </w:tcPr>
           <w:p>
             <w:r>
-              <w:t>Permite al usuario autenticado convertir una medida de masa entre las 5 unidades autorizadas del catálogo estricto: kilogramo, gramo, libra, onza y quintal. La solicitud se realiza mediante la operación SOAP convertirMasa(token, valor, origen, destino) en ServicioConversion.</w:t>
+              <w:t>Permite al usuario autenticado convertir una medida</w:t>
+            </w:r>
+            <w:r>
+              <w:t xml:space="preserve"> de masa entre las 5 unidades autorizadas del catálogo estricto: kilogramo, gramo, libra, onza y quintal. La solicitud se realiza mediante la operación SOAP </w:t>
+            </w:r>
+            <w:proofErr w:type="gramStart"/>
+            <w:r>
+              <w:t>convertirMasa(</w:t>
+            </w:r>
+            <w:proofErr w:type="gramEnd"/>
+            <w:r>
+              <w:t>token, valor, origen, destino) en ServicioConversion.</w:t>
             </w:r>
           </w:p>
         </w:tc>
@@ -3703,7 +3906,7 @@
           </w:tcPr>
           <w:p>
             <w:r>
-              <w:t>Julio Enrique Viche Castillo (GR09)</w:t>
+              <w:t>Gabriel Murillo y Julio Viche (Grupo 9, NRC 36884)</w:t>
             </w:r>
           </w:p>
         </w:tc>
@@ -3878,12 +4081,21 @@
           <w:p>
             <w:r>
               <w:t>from: unidad de origen (kilogramo | gramo | libra | onza | quintal)</w:t>
+            </w:r>
+            <w:r>
               <w:br/>
               <w:t>to: unidad de destino (kilogramo | gramo | libra | onza | quintal)</w:t>
+            </w:r>
+            <w:r>
               <w:br/>
               <w:t>value: valor numérico a convertir (double, máx 16 caracteres)</w:t>
+            </w:r>
+            <w:r>
               <w:br/>
-              <w:t>token: token UUID obtenido en CU-01</w:t>
+              <w:t xml:space="preserve">token: token UUID obtenido </w:t>
+            </w:r>
+            <w:r>
+              <w:t>en CU-01</w:t>
             </w:r>
           </w:p>
         </w:tc>
@@ -3951,7 +4163,21 @@
               <w:rPr>
                 <w:rFonts w:ascii="Arial" w:eastAsia="Arial" w:hAnsi="Arial" w:cs="Arial"/>
               </w:rPr>
-              <w:t xml:space="preserve">El usuario debe poseer un token UUID válido (CU-01 completado). </w:t>
+              <w:t xml:space="preserve">El usuario debe poseer </w:t>
+            </w:r>
+            <w:proofErr w:type="gramStart"/>
+            <w:r>
+              <w:rPr>
+                <w:rFonts w:ascii="Arial" w:eastAsia="Arial" w:hAnsi="Arial" w:cs="Arial"/>
+              </w:rPr>
+              <w:t>un</w:t>
+            </w:r>
+            <w:proofErr w:type="gramEnd"/>
+            <w:r>
+              <w:rPr>
+                <w:rFonts w:ascii="Arial" w:eastAsia="Arial" w:hAnsi="Arial" w:cs="Arial"/>
+              </w:rPr>
+              <w:t xml:space="preserve"> token UUID válido (CU-01 completado). </w:t>
             </w:r>
           </w:p>
           <w:p>
@@ -3994,6 +4220,7 @@
                 <w:rFonts w:ascii="Arial" w:eastAsia="Arial" w:hAnsi="Arial" w:cs="Arial"/>
                 <w:b/>
               </w:rPr>
+              <w:lastRenderedPageBreak/>
               <w:t xml:space="preserve">Postcondiciones: </w:t>
             </w:r>
           </w:p>
@@ -4023,9 +4250,16 @@
           </w:tcPr>
           <w:p>
             <w:r>
-              <w:t>Éxito: el sistema retorna result con el valor convertido (a 2 decimales), success = true y message: "Conversión exitosa."</w:t>
+              <w:t xml:space="preserve">Éxito: el sistema retorna result con el valor convertido (a 2 </w:t>
+            </w:r>
+            <w:r>
+              <w:t>decimales), success = true y message: "Conversión exitosa."</w:t>
+            </w:r>
+            <w:r>
               <w:br/>
               <w:t>Fallo por token: SOAP Fault (código 401) con message: "Tu sesión expiró o el token no vale."</w:t>
+            </w:r>
+            <w:r>
               <w:br/>
               <w:t>Fallo por unidad: SOAP Fault (código 400) con message: "Unidad de origen/destino no reconocida."</w:t>
             </w:r>
@@ -4052,12 +4286,12 @@
         <w:tblLook w:val="04A0" w:firstRow="1" w:lastRow="0" w:firstColumn="1" w:lastColumn="0" w:noHBand="0" w:noVBand="1"/>
       </w:tblPr>
       <w:tblGrid>
-        <w:gridCol w:w="3386"/>
-        <w:gridCol w:w="5636"/>
+        <w:gridCol w:w="2155"/>
+        <w:gridCol w:w="6867"/>
       </w:tblGrid>
       <w:tr>
         <w:trPr>
-          <w:trHeight w:val="5162"/>
+          <w:cantSplit/>
         </w:trPr>
         <w:tc>
           <w:tcPr>
@@ -4092,19 +4326,58 @@
               <w:bottom w:val="single" w:sz="5" w:space="0" w:color="000000"/>
               <w:right w:val="single" w:sz="5" w:space="0" w:color="000000"/>
             </w:tcBorders>
-            <w:vAlign w:val="bottom"/>
-          </w:tcPr>
-          <w:p>
-            <w:pPr>
-              <w:spacing w:line="4880" w:lineRule="exact"/>
+          </w:tcPr>
+          <w:p>
+            <w:pPr>
               <w:ind w:right="41"/>
-              <w:jc w:val="right"/>
-            </w:pPr>
-            <w:r>
-              <w:rPr>
-                <w:rFonts w:ascii="Arial" w:eastAsia="Arial" w:hAnsi="Arial" w:cs="Arial"/>
-              </w:rPr>
-              <w:t xml:space="preserve"> </w:t>
+              <w:jc w:val="center"/>
+            </w:pPr>
+            <w:r>
+              <w:rPr>
+                <w:noProof/>
+                <w:lang w:val="es-EC" w:eastAsia="es-EC"/>
+              </w:rPr>
+              <w:drawing>
+                <wp:inline distT="0" distB="0" distL="0" distR="0">
+                  <wp:extent cx="4326890" cy="2939463"/>
+                  <wp:effectExtent l="0" t="0" r="0" b="0"/>
+                  <wp:docPr id="11" name="Imagen 11" descr="Diagrama PowerDesigner CU-03: Convertir Masa"/>
+                  <wp:cNvGraphicFramePr>
+                    <a:graphicFrameLocks xmlns:a="http://schemas.openxmlformats.org/drawingml/2006/main" noChangeAspect="1"/>
+                  </wp:cNvGraphicFramePr>
+                  <a:graphic xmlns:a="http://schemas.openxmlformats.org/drawingml/2006/main">
+                    <a:graphicData uri="http://schemas.openxmlformats.org/drawingml/2006/picture">
+                      <pic:pic xmlns:pic="http://schemas.openxmlformats.org/drawingml/2006/picture">
+                        <pic:nvPicPr>
+                          <pic:cNvPr id="11" name=""/>
+                          <pic:cNvPicPr/>
+                        </pic:nvPicPr>
+                        <pic:blipFill>
+                          <a:blip r:embed="rId12">
+                            <a:extLst>
+                              <a:ext uri="{28A0092B-C50C-407E-A947-70E740481C1C}">
+                                <a14:useLocalDpi xmlns:a14="http://schemas.microsoft.com/office/drawing/2010/main" val="0"/>
+                              </a:ext>
+                            </a:extLst>
+                          </a:blip>
+                          <a:stretch>
+                            <a:fillRect/>
+                          </a:stretch>
+                        </pic:blipFill>
+                        <pic:spPr>
+                          <a:xfrm>
+                            <a:off x="0" y="0"/>
+                            <a:ext cx="4326890" cy="2939463"/>
+                          </a:xfrm>
+                          <a:prstGeom prst="rect">
+                            <a:avLst/>
+                          </a:prstGeom>
+                        </pic:spPr>
+                      </pic:pic>
+                    </a:graphicData>
+                  </a:graphic>
+                </wp:inline>
+              </w:drawing>
             </w:r>
           </w:p>
         </w:tc>
@@ -4532,7 +4805,11 @@
           </w:tcPr>
           <w:p>
             <w:r>
-              <w:t>• Token inválido o expirado (CU-05): SOAP Fault (código 401), message: "Tu sesión expiró o el token no vale." Se sugiere volver a CU-01. • Unidad de origen no reconocida (CU-06): SOAP Fault (código 400), message: "Unidad de origen no reconocida." • Unidad de destino no reconocida (CU-06): SOAP Fault (código 400), message: "Unidad de destino no reconocida."</w:t>
+              <w:lastRenderedPageBreak/>
+              <w:t xml:space="preserve">• Token inválido o expirado (CU-05): SOAP Fault (código 401), message: "Tu sesión expiró o el token no vale." Se sugiere volver a CU-01. • Unidad de origen no reconocida (CU-06): SOAP Fault </w:t>
+            </w:r>
+            <w:r>
+              <w:t>(código 400), message: "Unidad de origen no reconocida." • Unidad de destino no reconocida (CU-06): SOAP Fault (código 400), message: "Unidad de destino no reconocida."</w:t>
             </w:r>
           </w:p>
         </w:tc>
@@ -4648,9 +4925,9 @@
     <w:p>
       <w:pPr>
         <w:sectPr>
-          <w:footerReference w:type="even" r:id="rId15"/>
-          <w:footerReference w:type="default" r:id="rId16"/>
-          <w:footerReference w:type="first" r:id="rId17"/>
+          <w:footerReference w:type="even" r:id="rId13"/>
+          <w:footerReference w:type="default" r:id="rId14"/>
+          <w:footerReference w:type="first" r:id="rId15"/>
           <w:pgSz w:w="11910" w:h="16840"/>
           <w:pgMar w:top="1440" w:right="1440" w:bottom="1440" w:left="1440" w:header="0" w:footer="998" w:gutter="0"/>
           <w:pgBorders w:offsetFrom="page">
@@ -4671,6 +4948,7 @@
         <w:rPr>
           <w:rFonts w:ascii="Arial" w:eastAsia="Arial" w:hAnsi="Arial" w:cs="Arial"/>
         </w:rPr>
+        <w:lastRenderedPageBreak/>
         <w:t xml:space="preserve">  </w:t>
       </w:r>
     </w:p>
@@ -4875,7 +5153,18 @@
           </w:tcPr>
           <w:p>
             <w:r>
-              <w:t>Permite al usuario autenticado convertir una medida de temperatura entre las 5 escalas autorizadas: celsius, fahrenheit, kelvin, newton y reaumur. La solicitud se realiza mediante la operación SOAP convertirTemperatura(token, valor, origen, destino) en ServicioConversion.</w:t>
+              <w:t xml:space="preserve">Permite al usuario autenticado convertir una medida de temperatura entre las 5 escalas autorizadas: celsius, fahrenheit, kelvin, newton y reaumur. La solicitud se realiza mediante la operación SOAP </w:t>
+            </w:r>
+            <w:proofErr w:type="gramStart"/>
+            <w:r>
+              <w:t>convertirTemperatura</w:t>
+            </w:r>
+            <w:r>
+              <w:t>(</w:t>
+            </w:r>
+            <w:proofErr w:type="gramEnd"/>
+            <w:r>
+              <w:t>token, valor, origen, destino) en ServicioConversion.</w:t>
             </w:r>
           </w:p>
         </w:tc>
@@ -5061,7 +5350,10 @@
           </w:tcPr>
           <w:p>
             <w:r>
-              <w:t>Julio Enrique Viche Castillo (GR09)</w:t>
+              <w:t xml:space="preserve">Gabriel Murillo y Julio Viche (Grupo 9, NRC </w:t>
+            </w:r>
+            <w:r>
+              <w:t>36884)</w:t>
             </w:r>
           </w:p>
         </w:tc>
@@ -5188,10 +5480,19 @@
           <w:p>
             <w:r>
               <w:t>from: escala de origen (celsius | fahrenheit | kelvin | newton | reaumur)</w:t>
+            </w:r>
+            <w:r>
               <w:br/>
               <w:t>to: escala de destino (celsius | fahrenheit | kelvin | newton | reaumur)</w:t>
+            </w:r>
+            <w:r>
               <w:br/>
-              <w:t>value: valor numérico de temperatura a convertir (double, máx 16 caracteres)</w:t>
+              <w:t>value: valor numéric</w:t>
+            </w:r>
+            <w:r>
+              <w:t>o de temperatura a convertir (double, máx 16 caracteres)</w:t>
+            </w:r>
+            <w:r>
               <w:br/>
               <w:t>token: token UUID obtenido en CU-01</w:t>
             </w:r>
@@ -5244,7 +5545,21 @@
               <w:rPr>
                 <w:rFonts w:ascii="Arial" w:eastAsia="Arial" w:hAnsi="Arial" w:cs="Arial"/>
               </w:rPr>
-              <w:t xml:space="preserve">El usuario debe poseer un token UUID válido (CU01 completado). </w:t>
+              <w:t xml:space="preserve">El usuario debe poseer </w:t>
+            </w:r>
+            <w:proofErr w:type="gramStart"/>
+            <w:r>
+              <w:rPr>
+                <w:rFonts w:ascii="Arial" w:eastAsia="Arial" w:hAnsi="Arial" w:cs="Arial"/>
+              </w:rPr>
+              <w:t>un</w:t>
+            </w:r>
+            <w:proofErr w:type="gramEnd"/>
+            <w:r>
+              <w:rPr>
+                <w:rFonts w:ascii="Arial" w:eastAsia="Arial" w:hAnsi="Arial" w:cs="Arial"/>
+              </w:rPr>
+              <w:t xml:space="preserve"> token UUID válido (CU01 completado). </w:t>
             </w:r>
           </w:p>
           <w:p>
@@ -5301,10 +5616,17 @@
           <w:p>
             <w:r>
               <w:t>Éxito: el sistema retorna result con el valor convertido (a 2 decimales), success = true y message: "Conversión exitosa."</w:t>
+            </w:r>
+            <w:r>
               <w:br/>
               <w:t>Fallo por token: SOAP Fault (código 401) con message: "Tu sesión expiró o el token no vale."</w:t>
+            </w:r>
+            <w:r>
               <w:br/>
-              <w:t>Fallo por escala: SOAP Fault (código 400) con message: "Unidad de origen/destino no reconocida."</w:t>
+              <w:t xml:space="preserve">Fallo por escala: SOAP </w:t>
+            </w:r>
+            <w:r>
+              <w:t>Fault (código 400) con message: "Unidad de origen/destino no reconocida."</w:t>
             </w:r>
           </w:p>
         </w:tc>
@@ -5334,7 +5656,7 @@
       </w:tblGrid>
       <w:tr>
         <w:trPr>
-          <w:trHeight w:val="5064"/>
+          <w:cantSplit/>
         </w:trPr>
         <w:tc>
           <w:tcPr>
@@ -5356,6 +5678,7 @@
                 <w:rFonts w:ascii="Arial" w:eastAsia="Arial" w:hAnsi="Arial" w:cs="Arial"/>
                 <w:b/>
               </w:rPr>
+              <w:lastRenderedPageBreak/>
               <w:t xml:space="preserve">Gráfico: </w:t>
             </w:r>
           </w:p>
@@ -5369,19 +5692,58 @@
               <w:bottom w:val="single" w:sz="5" w:space="0" w:color="000000"/>
               <w:right w:val="single" w:sz="5" w:space="0" w:color="000000"/>
             </w:tcBorders>
-            <w:vAlign w:val="bottom"/>
-          </w:tcPr>
-          <w:p>
-            <w:pPr>
-              <w:spacing w:line="4780" w:lineRule="exact"/>
+          </w:tcPr>
+          <w:p>
+            <w:pPr>
               <w:ind w:right="41"/>
-              <w:jc w:val="right"/>
-            </w:pPr>
-            <w:r>
-              <w:rPr>
-                <w:rFonts w:ascii="Arial" w:eastAsia="Arial" w:hAnsi="Arial" w:cs="Arial"/>
-              </w:rPr>
-              <w:t xml:space="preserve"> </w:t>
+              <w:jc w:val="center"/>
+            </w:pPr>
+            <w:r>
+              <w:rPr>
+                <w:noProof/>
+                <w:lang w:val="es-EC" w:eastAsia="es-EC"/>
+              </w:rPr>
+              <w:drawing>
+                <wp:inline distT="0" distB="0" distL="0" distR="0">
+                  <wp:extent cx="2514344" cy="3048000"/>
+                  <wp:effectExtent l="0" t="0" r="635" b="0"/>
+                  <wp:docPr id="12" name="Imagen 12" descr="Diagrama PowerDesigner CU-04: Convertir Temperatura"/>
+                  <wp:cNvGraphicFramePr>
+                    <a:graphicFrameLocks xmlns:a="http://schemas.openxmlformats.org/drawingml/2006/main" noChangeAspect="1"/>
+                  </wp:cNvGraphicFramePr>
+                  <a:graphic xmlns:a="http://schemas.openxmlformats.org/drawingml/2006/main">
+                    <a:graphicData uri="http://schemas.openxmlformats.org/drawingml/2006/picture">
+                      <pic:pic xmlns:pic="http://schemas.openxmlformats.org/drawingml/2006/picture">
+                        <pic:nvPicPr>
+                          <pic:cNvPr id="12" name=""/>
+                          <pic:cNvPicPr/>
+                        </pic:nvPicPr>
+                        <pic:blipFill>
+                          <a:blip r:embed="rId16">
+                            <a:extLst>
+                              <a:ext uri="{28A0092B-C50C-407E-A947-70E740481C1C}">
+                                <a14:useLocalDpi xmlns:a14="http://schemas.microsoft.com/office/drawing/2010/main" val="0"/>
+                              </a:ext>
+                            </a:extLst>
+                          </a:blip>
+                          <a:stretch>
+                            <a:fillRect/>
+                          </a:stretch>
+                        </pic:blipFill>
+                        <pic:spPr>
+                          <a:xfrm>
+                            <a:off x="0" y="0"/>
+                            <a:ext cx="2514344" cy="3048000"/>
+                          </a:xfrm>
+                          <a:prstGeom prst="rect">
+                            <a:avLst/>
+                          </a:prstGeom>
+                        </pic:spPr>
+                      </pic:pic>
+                    </a:graphicData>
+                  </a:graphic>
+                </wp:inline>
+              </w:drawing>
             </w:r>
           </w:p>
         </w:tc>
@@ -5485,7 +5847,10 @@
           </w:tcPr>
           <w:p>
             <w:r>
-              <w:t>El usuario invoca la operación SOAP convertirTemperatura con los parámetros token, valor, origen y destino.</w:t>
+              <w:t xml:space="preserve">El usuario invoca la operación SOAP convertirTemperatura con los parámetros token, valor, origen </w:t>
+            </w:r>
+            <w:r>
+              <w:t>y destino.</w:t>
             </w:r>
           </w:p>
         </w:tc>
@@ -5806,7 +6171,10 @@
           </w:tcPr>
           <w:p>
             <w:r>
-              <w:t>• Token inválido o expirado (CU-05): SOAP Fault (código 401), message: "Tu sesión expiró o el token no vale." Se sugiere volver a CU-01. • Escala de origen no reconocida (CU-06): SOAP Fault (código 400), message: "Unidad de origen no reconocida." • Escala de destino no reconocida (CU-06): SOAP Fault (código 400), message: "Unidad de destino no reconocida."</w:t>
+              <w:t xml:space="preserve">• Token inválido o expirado (CU-05): SOAP Fault (código 401), message: "Tu sesión expiró o el token no vale." Se sugiere volver a CU-01. • Escala de origen no reconocida (CU-06): SOAP Fault </w:t>
+            </w:r>
+            <w:r>
+              <w:t>(código 400), message: "Unidad de origen no reconocida." • Escala de destino no reconocida (CU-06): SOAP Fault (código 400), message: "Unidad de destino no reconocida."</w:t>
             </w:r>
           </w:p>
         </w:tc>
@@ -5897,6 +6265,7 @@
         <w:ind w:left="-5"/>
       </w:pPr>
       <w:r>
+        <w:lastRenderedPageBreak/>
         <w:t xml:space="preserve">Tabla 5. ECUD — CU-05: Validar Token </w:t>
       </w:r>
     </w:p>
@@ -6157,7 +6526,21 @@
               <w:rPr>
                 <w:rFonts w:ascii="Arial" w:eastAsia="Arial" w:hAnsi="Arial" w:cs="Arial"/>
               </w:rPr>
-              <w:t xml:space="preserve">'token' recibido en la solicitud exista en la colección de tokens activos almacenada en memoria por el servidor. </w:t>
+              <w:t>'</w:t>
+            </w:r>
+            <w:proofErr w:type="gramStart"/>
+            <w:r>
+              <w:rPr>
+                <w:rFonts w:ascii="Arial" w:eastAsia="Arial" w:hAnsi="Arial" w:cs="Arial"/>
+              </w:rPr>
+              <w:t>token</w:t>
+            </w:r>
+            <w:proofErr w:type="gramEnd"/>
+            <w:r>
+              <w:rPr>
+                <w:rFonts w:ascii="Arial" w:eastAsia="Arial" w:hAnsi="Arial" w:cs="Arial"/>
+              </w:rPr>
+              <w:t xml:space="preserve">' recibido en la solicitud exista en la colección de tokens activos almacenada en memoria por el servidor. </w:t>
             </w:r>
           </w:p>
           <w:p>
@@ -6418,7 +6801,7 @@
           </w:tcPr>
           <w:p>
             <w:r>
-              <w:t>Julio Enrique Viche Castillo (GR09)</w:t>
+              <w:t>Gabriel Murillo y Julio Viche (Grupo 9, NRC 36884)</w:t>
             </w:r>
           </w:p>
         </w:tc>
@@ -6591,8 +6974,13 @@
             </w:tcBorders>
           </w:tcPr>
           <w:p>
-            <w:r>
-              <w:t>token: valor UUID recibido en la cabecera/cuerpo del sobre SOAP de la petición.</w:t>
+            <w:proofErr w:type="gramStart"/>
+            <w:r>
+              <w:t>token</w:t>
+            </w:r>
+            <w:proofErr w:type="gramEnd"/>
+            <w:r>
+              <w:t>: valor UUID recibido en la cabecera/cuerpo del sobre SOAP de la petición.</w:t>
             </w:r>
           </w:p>
         </w:tc>
@@ -6673,7 +7061,21 @@
               <w:rPr>
                 <w:rFonts w:ascii="Arial" w:eastAsia="Arial" w:hAnsi="Arial" w:cs="Arial"/>
               </w:rPr>
-              <w:t xml:space="preserve">El servidor debe tener cargada en memoria la colección de tokens activos (al menos un inicio de sesión previo exitoso). </w:t>
+              <w:t xml:space="preserve">El servidor debe tener cargada en memoria la colección de tokens activos (al menos </w:t>
+            </w:r>
+            <w:proofErr w:type="gramStart"/>
+            <w:r>
+              <w:rPr>
+                <w:rFonts w:ascii="Arial" w:eastAsia="Arial" w:hAnsi="Arial" w:cs="Arial"/>
+              </w:rPr>
+              <w:t>un</w:t>
+            </w:r>
+            <w:proofErr w:type="gramEnd"/>
+            <w:r>
+              <w:rPr>
+                <w:rFonts w:ascii="Arial" w:eastAsia="Arial" w:hAnsi="Arial" w:cs="Arial"/>
+              </w:rPr>
+              <w:t xml:space="preserve"> inicio de sesión previo exitoso). </w:t>
             </w:r>
           </w:p>
         </w:tc>
@@ -6732,8 +7134,13 @@
           <w:p>
             <w:r>
               <w:t>Éxito: el token existe en la colección en memoria → el flujo continúa hacia CU-06 o la conversión.</w:t>
+            </w:r>
+            <w:r>
               <w:br/>
-              <w:t>Fallo: el token es nulo, vacío o no existe en memoria → SOAP Fault (código 401) con message: "Tu sesión expiró o el token no vale."</w:t>
+              <w:t xml:space="preserve">Fallo: el token </w:t>
+            </w:r>
+            <w:r>
+              <w:t>es nulo, vacío o no existe en memoria → SOAP Fault (código 401) con message: "Tu sesión expiró o el token no vale."</w:t>
             </w:r>
           </w:p>
         </w:tc>
@@ -6742,9 +7149,9 @@
     <w:p>
       <w:pPr>
         <w:sectPr>
-          <w:footerReference w:type="even" r:id="rId18"/>
-          <w:footerReference w:type="default" r:id="rId19"/>
-          <w:footerReference w:type="first" r:id="rId20"/>
+          <w:footerReference w:type="even" r:id="rId17"/>
+          <w:footerReference w:type="default" r:id="rId18"/>
+          <w:footerReference w:type="first" r:id="rId19"/>
           <w:pgSz w:w="11910" w:h="16840"/>
           <w:pgMar w:top="1440" w:right="1440" w:bottom="1440" w:left="1440" w:header="0" w:footer="996" w:gutter="0"/>
           <w:pgBorders w:offsetFrom="page">
@@ -6775,7 +7182,7 @@
       </w:tblGrid>
       <w:tr>
         <w:trPr>
-          <w:trHeight w:val="5162"/>
+          <w:cantSplit/>
         </w:trPr>
         <w:tc>
           <w:tcPr>
@@ -6797,6 +7204,7 @@
                 <w:rFonts w:ascii="Arial" w:eastAsia="Arial" w:hAnsi="Arial" w:cs="Arial"/>
                 <w:b/>
               </w:rPr>
+              <w:lastRenderedPageBreak/>
               <w:t xml:space="preserve">Gráfico: </w:t>
             </w:r>
           </w:p>
@@ -6810,19 +7218,60 @@
               <w:bottom w:val="single" w:sz="5" w:space="0" w:color="000000"/>
               <w:right w:val="single" w:sz="5" w:space="0" w:color="000000"/>
             </w:tcBorders>
-            <w:vAlign w:val="bottom"/>
-          </w:tcPr>
-          <w:p>
-            <w:pPr>
-              <w:spacing w:line="4880" w:lineRule="exact"/>
+          </w:tcPr>
+          <w:p>
+            <w:pPr>
               <w:ind w:right="50"/>
-              <w:jc w:val="right"/>
-            </w:pPr>
-            <w:r>
-              <w:rPr>
-                <w:rFonts w:ascii="Arial" w:eastAsia="Arial" w:hAnsi="Arial" w:cs="Arial"/>
-              </w:rPr>
-              <w:t xml:space="preserve"> </w:t>
+              <w:jc w:val="center"/>
+            </w:pPr>
+            <w:bookmarkStart w:id="0" w:name="_GoBack"/>
+            <w:bookmarkEnd w:id="0"/>
+            <w:r>
+              <w:rPr>
+                <w:noProof/>
+                <w:lang w:val="es-EC" w:eastAsia="es-EC"/>
+              </w:rPr>
+              <w:drawing>
+                <wp:inline distT="0" distB="0" distL="0" distR="0">
+                  <wp:extent cx="2846664" cy="3048000"/>
+                  <wp:effectExtent l="0" t="0" r="0" b="0"/>
+                  <wp:docPr id="13" name="Imagen 13" descr="Diagrama PowerDesigner CU-05: Validar Token"/>
+                  <wp:cNvGraphicFramePr>
+                    <a:graphicFrameLocks xmlns:a="http://schemas.openxmlformats.org/drawingml/2006/main" noChangeAspect="1"/>
+                  </wp:cNvGraphicFramePr>
+                  <a:graphic xmlns:a="http://schemas.openxmlformats.org/drawingml/2006/main">
+                    <a:graphicData uri="http://schemas.openxmlformats.org/drawingml/2006/picture">
+                      <pic:pic xmlns:pic="http://schemas.openxmlformats.org/drawingml/2006/picture">
+                        <pic:nvPicPr>
+                          <pic:cNvPr id="13" name=""/>
+                          <pic:cNvPicPr/>
+                        </pic:nvPicPr>
+                        <pic:blipFill>
+                          <a:blip r:embed="rId20">
+                            <a:extLst>
+                              <a:ext uri="{28A0092B-C50C-407E-A947-70E740481C1C}">
+                                <a14:useLocalDpi xmlns:a14="http://schemas.microsoft.com/office/drawing/2010/main" val="0"/>
+                              </a:ext>
+                            </a:extLst>
+                          </a:blip>
+                          <a:stretch>
+                            <a:fillRect/>
+                          </a:stretch>
+                        </pic:blipFill>
+                        <pic:spPr>
+                          <a:xfrm>
+                            <a:off x="0" y="0"/>
+                            <a:ext cx="2846664" cy="3048000"/>
+                          </a:xfrm>
+                          <a:prstGeom prst="rect">
+                            <a:avLst/>
+                          </a:prstGeom>
+                        </pic:spPr>
+                      </pic:pic>
+                    </a:graphicData>
+                  </a:graphic>
+                </wp:inline>
+              </w:drawing>
             </w:r>
           </w:p>
         </w:tc>
@@ -7046,7 +7495,10 @@
           </w:tcPr>
           <w:p>
             <w:r>
-              <w:t>El sistema busca el token en la colección de tokens activos almacenada en memoria RAM volátil (ConcurrentHashMap en ServicioAuth).</w:t>
+              <w:t>El sistema busca el token en la colección de tokens activos almacenada en memoria RAM</w:t>
+            </w:r>
+            <w:r>
+              <w:t xml:space="preserve"> volátil (ConcurrentHashMap en ServicioAuth).</w:t>
             </w:r>
           </w:p>
         </w:tc>
@@ -7144,7 +7596,18 @@
           </w:tcPr>
           <w:p>
             <w:r>
-              <w:t>• Token nulo o vacío: el sistema retorna SOAP Fault (código 401) con message: "Tu sesión expiró o el token no vale." • Token no encontrado en memoria: SOAP Fault (código 401). El extend hacia CU-01 indica que el usuario debe volver a autenticarse.</w:t>
+              <w:t xml:space="preserve">• Token nulo o vacío: el sistema retorna SOAP Fault (código 401) con message: "Tu sesión expiró o el </w:t>
+            </w:r>
+            <w:r>
+              <w:t xml:space="preserve">token no vale." • Token no encontrado en memoria: SOAP Fault (código 401). El extend hacia CU-01 indica que el usuario debe volver </w:t>
+            </w:r>
+            <w:proofErr w:type="gramStart"/>
+            <w:r>
+              <w:t>a</w:t>
+            </w:r>
+            <w:proofErr w:type="gramEnd"/>
+            <w:r>
+              <w:t xml:space="preserve"> autenticarse.</w:t>
             </w:r>
           </w:p>
         </w:tc>
@@ -7444,6 +7907,7 @@
                 <w:rFonts w:ascii="Arial" w:eastAsia="Arial" w:hAnsi="Arial" w:cs="Arial"/>
                 <w:b/>
               </w:rPr>
+              <w:lastRenderedPageBreak/>
               <w:t xml:space="preserve">Descripción: </w:t>
             </w:r>
           </w:p>
@@ -7652,7 +8116,10 @@
           </w:tcPr>
           <w:p>
             <w:r>
-              <w:t>Julio Enrique Viche Castillo (GR09)</w:t>
+              <w:t>Gabriel Murillo y Julio Viche (Grupo</w:t>
+            </w:r>
+            <w:r>
+              <w:t xml:space="preserve"> 9, NRC 36884)</w:t>
             </w:r>
           </w:p>
         </w:tc>
@@ -7779,15 +8246,30 @@
           <w:p>
             <w:r>
               <w:t>from: nombre de la unidad de origen (string)</w:t>
+            </w:r>
+            <w:r>
               <w:br/>
               <w:t>to: nombre de la unidad de destino (string)</w:t>
+            </w:r>
+            <w:r>
               <w:br/>
+            </w:r>
+            <w:r>
               <w:br/>
               <w:t>El catálogo estricto de exactamente 5 unidades por magnitud:</w:t>
+            </w:r>
+            <w:r>
               <w:br/>
-              <w:t>• Longitud: metro, centimetro, pie, yarda, milla</w:t>
+              <w:t>• Longit</w:t>
+            </w:r>
+            <w:r>
+              <w:t>ud: metro, centimetro, pie, yarda, milla</w:t>
+            </w:r>
+            <w:r>
               <w:br/>
               <w:t>• Masa: kilogramo, gramo, libra, onza, quintal</w:t>
+            </w:r>
+            <w:r>
               <w:br/>
               <w:t>• Temperatura: celsius, fahrenheit, kelvin, newton, reaumur</w:t>
             </w:r>
@@ -7897,7 +8379,10 @@
           </w:tcPr>
           <w:p>
             <w:r>
-              <w:t>• Éxito: ambas unidades son reconocidas → el flujo continúa hacia el cálculo de conversión. • Fallo por unidad de origen: SOAP Fault (código 400) con message: "Unidad de origen no reconocida." • Fallo por unidad de destino: SOAP Fault (código 400) con message: "Unidad de destino no reconocida."</w:t>
+              <w:t xml:space="preserve">• Éxito: ambas unidades son reconocidas → el flujo continúa hacia el cálculo de conversión. • Fallo por unidad de origen: SOAP Fault (código 400) </w:t>
+            </w:r>
+            <w:r>
+              <w:t>con message: "Unidad de origen no reconocida." • Fallo por unidad de destino: SOAP Fault (código 400) con message: "Unidad de destino no reconocida."</w:t>
             </w:r>
           </w:p>
         </w:tc>
@@ -7925,7 +8410,7 @@
       </w:tblGrid>
       <w:tr>
         <w:trPr>
-          <w:trHeight w:val="5162"/>
+          <w:cantSplit/>
         </w:trPr>
         <w:tc>
           <w:tcPr>
@@ -7947,6 +8432,7 @@
                 <w:rFonts w:ascii="Arial" w:eastAsia="Arial" w:hAnsi="Arial" w:cs="Arial"/>
                 <w:b/>
               </w:rPr>
+              <w:lastRenderedPageBreak/>
               <w:t xml:space="preserve">Gráfico: </w:t>
             </w:r>
           </w:p>
@@ -7960,19 +8446,58 @@
               <w:bottom w:val="single" w:sz="5" w:space="0" w:color="000000"/>
               <w:right w:val="single" w:sz="5" w:space="0" w:color="000000"/>
             </w:tcBorders>
-            <w:vAlign w:val="bottom"/>
-          </w:tcPr>
-          <w:p>
-            <w:pPr>
-              <w:spacing w:line="4880" w:lineRule="exact"/>
+          </w:tcPr>
+          <w:p>
+            <w:pPr>
               <w:ind w:right="50"/>
-              <w:jc w:val="right"/>
-            </w:pPr>
-            <w:r>
-              <w:rPr>
-                <w:rFonts w:ascii="Arial" w:eastAsia="Arial" w:hAnsi="Arial" w:cs="Arial"/>
-              </w:rPr>
-              <w:t xml:space="preserve"> </w:t>
+              <w:jc w:val="center"/>
+            </w:pPr>
+            <w:r>
+              <w:rPr>
+                <w:noProof/>
+                <w:lang w:val="es-EC" w:eastAsia="es-EC"/>
+              </w:rPr>
+              <w:drawing>
+                <wp:inline distT="0" distB="0" distL="0" distR="0">
+                  <wp:extent cx="3376930" cy="2574635"/>
+                  <wp:effectExtent l="0" t="0" r="0" b="0"/>
+                  <wp:docPr id="14" name="Imagen 14" descr="Diagrama PowerDesigner CU-06: Validar Unidades"/>
+                  <wp:cNvGraphicFramePr>
+                    <a:graphicFrameLocks xmlns:a="http://schemas.openxmlformats.org/drawingml/2006/main" noChangeAspect="1"/>
+                  </wp:cNvGraphicFramePr>
+                  <a:graphic xmlns:a="http://schemas.openxmlformats.org/drawingml/2006/main">
+                    <a:graphicData uri="http://schemas.openxmlformats.org/drawingml/2006/picture">
+                      <pic:pic xmlns:pic="http://schemas.openxmlformats.org/drawingml/2006/picture">
+                        <pic:nvPicPr>
+                          <pic:cNvPr id="14" name=""/>
+                          <pic:cNvPicPr/>
+                        </pic:nvPicPr>
+                        <pic:blipFill>
+                          <a:blip r:embed="rId21">
+                            <a:extLst>
+                              <a:ext uri="{28A0092B-C50C-407E-A947-70E740481C1C}">
+                                <a14:useLocalDpi xmlns:a14="http://schemas.microsoft.com/office/drawing/2010/main" val="0"/>
+                              </a:ext>
+                            </a:extLst>
+                          </a:blip>
+                          <a:stretch>
+                            <a:fillRect/>
+                          </a:stretch>
+                        </pic:blipFill>
+                        <pic:spPr>
+                          <a:xfrm>
+                            <a:off x="0" y="0"/>
+                            <a:ext cx="3376930" cy="2574635"/>
+                          </a:xfrm>
+                          <a:prstGeom prst="rect">
+                            <a:avLst/>
+                          </a:prstGeom>
+                        </pic:spPr>
+                      </pic:pic>
+                    </a:graphicData>
+                  </a:graphic>
+                </wp:inline>
+              </w:drawing>
             </w:r>
           </w:p>
         </w:tc>
@@ -8349,7 +8874,13 @@
           </w:tcPr>
           <w:p>
             <w:r>
-              <w:t>• Unidad de origen no reconocida: SOAP Fault (código 400) con message: "Unidad de origen no reconocida." • Unidad de destino no reconocida: SOAP Fault (código 400) con message: "Unidad de destino no reconocida." • Ambas unidades inválidas: SOAP Fault (código 400).</w:t>
+              <w:t>•</w:t>
+            </w:r>
+            <w:r>
+              <w:t xml:space="preserve"> Unidad de origen no reconocida: SOAP Fault (código 400) con message: "Unidad de origen no reconocida." • Unidad de destino no reconocida: SOAP Fault (código 400) con message: "Unidad de destino no reconocida." • Ambas unidades inválidas: SOAP Fault (códig</w:t>
+            </w:r>
+            <w:r>
+              <w:t>o 400).</w:t>
             </w:r>
           </w:p>
         </w:tc>
@@ -8474,9 +9005,9 @@
       </w:r>
     </w:p>
     <w:sectPr>
-      <w:footerReference w:type="even" r:id="rId21"/>
-      <w:footerReference w:type="default" r:id="rId22"/>
-      <w:footerReference w:type="first" r:id="rId23"/>
+      <w:footerReference w:type="even" r:id="rId22"/>
+      <w:footerReference w:type="default" r:id="rId23"/>
+      <w:footerReference w:type="first" r:id="rId24"/>
       <w:pgSz w:w="11910" w:h="16840"/>
       <w:pgMar w:top="740" w:right="1320" w:bottom="1180" w:left="1160" w:header="0" w:footer="996" w:gutter="0"/>
       <w:pgBorders w:offsetFrom="page">
@@ -8492,7 +9023,7 @@
 </file>
 
 <file path=word/endnotes.xml><?xml version="1.0" encoding="utf-8"?>
-<w:endnotes xmlns:wpc="http://schemas.microsoft.com/office/word/2010/wordprocessingCanvas" xmlns:cx="http://schemas.microsoft.com/office/drawing/2014/chartex" xmlns:cx1="http://schemas.microsoft.com/office/drawing/2015/9/8/chartex" xmlns:cx2="http://schemas.microsoft.com/office/drawing/2015/10/21/chartex" xmlns:cx3="http://schemas.microsoft.com/office/drawing/2016/5/9/chartex" xmlns:cx4="http://schemas.microsoft.com/office/drawing/2016/5/10/chartex" xmlns:cx5="http://schemas.microsoft.com/office/drawing/2016/5/11/chartex" xmlns:cx6="http://schemas.microsoft.com/office/drawing/2016/5/12/chartex" xmlns:cx7="http://schemas.microsoft.com/office/drawing/2016/5/13/chartex" xmlns:cx8="http://schemas.microsoft.com/office/drawing/2016/5/14/chartex" xmlns:mc="http://schemas.openxmlformats.org/markup-compatibility/2006" xmlns:aink="http://schemas.microsoft.com/office/drawing/2016/ink" xmlns:am3d="http://schemas.microsoft.com/office/drawing/2017/model3d" xmlns:o="urn:schemas-microsoft-com:office:office" xmlns:r="http://schemas.openxmlformats.org/officeDocument/2006/relationships" xmlns:m="http://schemas.openxmlformats.org/officeDocument/2006/math" xmlns:v="urn:schemas-microsoft-com:vml" xmlns:wp14="http://schemas.microsoft.com/office/word/2010/wordprocessingDrawing" xmlns:wp="http://schemas.openxmlformats.org/drawingml/2006/wordprocessingDrawing" xmlns:w10="urn:schemas-microsoft-com:office:word" xmlns:w="http://schemas.openxmlformats.org/wordprocessingml/2006/main" xmlns:w14="http://schemas.microsoft.com/office/word/2010/wordml" xmlns:w15="http://schemas.microsoft.com/office/word/2012/wordml" xmlns:w16cex="http://schemas.microsoft.com/office/word/2018/wordml/cex" xmlns:w16cid="http://schemas.microsoft.com/office/word/2016/wordml/cid" xmlns:w16="http://schemas.microsoft.com/office/word/2018/wordml" xmlns:w16sdtdh="http://schemas.microsoft.com/office/word/2020/wordml/sdtdatahash" xmlns:w16se="http://schemas.microsoft.com/office/word/2015/wordml/symex" xmlns:wpg="http://schemas.microsoft.com/office/word/2010/wordprocessingGroup" xmlns:wpi="http://schemas.microsoft.com/office/word/2010/wordprocessingInk" xmlns:wne="http://schemas.microsoft.com/office/word/2006/wordml" xmlns:wps="http://schemas.microsoft.com/office/word/2010/wordprocessingShape" mc:Ignorable="w14 w15 w16se w16cid w16 w16cex w16sdtdh wp14">
+<w:endnotes xmlns:wpc="http://schemas.microsoft.com/office/word/2010/wordprocessingCanvas" xmlns:mc="http://schemas.openxmlformats.org/markup-compatibility/2006" xmlns:o="urn:schemas-microsoft-com:office:office" xmlns:r="http://schemas.openxmlformats.org/officeDocument/2006/relationships" xmlns:m="http://schemas.openxmlformats.org/officeDocument/2006/math" xmlns:v="urn:schemas-microsoft-com:vml" xmlns:wp14="http://schemas.microsoft.com/office/word/2010/wordprocessingDrawing" xmlns:wp="http://schemas.openxmlformats.org/drawingml/2006/wordprocessingDrawing" xmlns:w10="urn:schemas-microsoft-com:office:word" xmlns:w="http://schemas.openxmlformats.org/wordprocessingml/2006/main" xmlns:w14="http://schemas.microsoft.com/office/word/2010/wordml" xmlns:w15="http://schemas.microsoft.com/office/word/2012/wordml" xmlns:wpg="http://schemas.microsoft.com/office/word/2010/wordprocessingGroup" xmlns:wpi="http://schemas.microsoft.com/office/word/2010/wordprocessingInk" xmlns:wne="http://schemas.microsoft.com/office/word/2006/wordml" xmlns:wps="http://schemas.microsoft.com/office/word/2010/wordprocessingShape" mc:Ignorable="w14 w15 wp14">
   <w:endnote w:type="separator" w:id="-1">
     <w:p>
       <w:pPr>
@@ -8517,7 +9048,7 @@
 </file>
 
 <file path=word/footer1.xml><?xml version="1.0" encoding="utf-8"?>
-<w:ftr xmlns:wpc="http://schemas.microsoft.com/office/word/2010/wordprocessingCanvas" xmlns:cx="http://schemas.microsoft.com/office/drawing/2014/chartex" xmlns:cx1="http://schemas.microsoft.com/office/drawing/2015/9/8/chartex" xmlns:cx2="http://schemas.microsoft.com/office/drawing/2015/10/21/chartex" xmlns:cx3="http://schemas.microsoft.com/office/drawing/2016/5/9/chartex" xmlns:cx4="http://schemas.microsoft.com/office/drawing/2016/5/10/chartex" xmlns:cx5="http://schemas.microsoft.com/office/drawing/2016/5/11/chartex" xmlns:cx6="http://schemas.microsoft.com/office/drawing/2016/5/12/chartex" xmlns:cx7="http://schemas.microsoft.com/office/drawing/2016/5/13/chartex" xmlns:cx8="http://schemas.microsoft.com/office/drawing/2016/5/14/chartex" xmlns:mc="http://schemas.openxmlformats.org/markup-compatibility/2006" xmlns:aink="http://schemas.microsoft.com/office/drawing/2016/ink" xmlns:am3d="http://schemas.microsoft.com/office/drawing/2017/model3d" xmlns:o="urn:schemas-microsoft-com:office:office" xmlns:r="http://schemas.openxmlformats.org/officeDocument/2006/relationships" xmlns:m="http://schemas.openxmlformats.org/officeDocument/2006/math" xmlns:v="urn:schemas-microsoft-com:vml" xmlns:wp14="http://schemas.microsoft.com/office/word/2010/wordprocessingDrawing" xmlns:wp="http://schemas.openxmlformats.org/drawingml/2006/wordprocessingDrawing" xmlns:w10="urn:schemas-microsoft-com:office:word" xmlns:w="http://schemas.openxmlformats.org/wordprocessingml/2006/main" xmlns:w14="http://schemas.microsoft.com/office/word/2010/wordml" xmlns:w15="http://schemas.microsoft.com/office/word/2012/wordml" xmlns:w16cex="http://schemas.microsoft.com/office/word/2018/wordml/cex" xmlns:w16cid="http://schemas.microsoft.com/office/word/2016/wordml/cid" xmlns:w16="http://schemas.microsoft.com/office/word/2018/wordml" xmlns:w16sdtdh="http://schemas.microsoft.com/office/word/2020/wordml/sdtdatahash" xmlns:w16se="http://schemas.microsoft.com/office/word/2015/wordml/symex" xmlns:wpg="http://schemas.microsoft.com/office/word/2010/wordprocessingGroup" xmlns:wpi="http://schemas.microsoft.com/office/word/2010/wordprocessingInk" xmlns:wne="http://schemas.microsoft.com/office/word/2006/wordml" xmlns:wps="http://schemas.microsoft.com/office/word/2010/wordprocessingShape" mc:Ignorable="w14 w15 w16se w16cid w16 w16cex w16sdtdh wp14">
+<w:ftr xmlns:wpc="http://schemas.microsoft.com/office/word/2010/wordprocessingCanvas" xmlns:mc="http://schemas.openxmlformats.org/markup-compatibility/2006" xmlns:o="urn:schemas-microsoft-com:office:office" xmlns:r="http://schemas.openxmlformats.org/officeDocument/2006/relationships" xmlns:m="http://schemas.openxmlformats.org/officeDocument/2006/math" xmlns:v="urn:schemas-microsoft-com:vml" xmlns:wp14="http://schemas.microsoft.com/office/word/2010/wordprocessingDrawing" xmlns:wp="http://schemas.openxmlformats.org/drawingml/2006/wordprocessingDrawing" xmlns:w10="urn:schemas-microsoft-com:office:word" xmlns:w="http://schemas.openxmlformats.org/wordprocessingml/2006/main" xmlns:w14="http://schemas.microsoft.com/office/word/2010/wordml" xmlns:w15="http://schemas.microsoft.com/office/word/2012/wordml" xmlns:wpg="http://schemas.microsoft.com/office/word/2010/wordprocessingGroup" xmlns:wpi="http://schemas.microsoft.com/office/word/2010/wordprocessingInk" xmlns:wne="http://schemas.microsoft.com/office/word/2006/wordml" xmlns:wps="http://schemas.microsoft.com/office/word/2010/wordprocessingShape" mc:Ignorable="w14 w15 wp14">
   <w:p>
     <w:pPr>
       <w:jc w:val="right"/>
@@ -8542,7 +9073,7 @@
 </file>
 
 <file path=word/footer10.xml><?xml version="1.0" encoding="utf-8"?>
-<w:ftr xmlns:wpc="http://schemas.microsoft.com/office/word/2010/wordprocessingCanvas" xmlns:cx="http://schemas.microsoft.com/office/drawing/2014/chartex" xmlns:cx1="http://schemas.microsoft.com/office/drawing/2015/9/8/chartex" xmlns:cx2="http://schemas.microsoft.com/office/drawing/2015/10/21/chartex" xmlns:cx3="http://schemas.microsoft.com/office/drawing/2016/5/9/chartex" xmlns:cx4="http://schemas.microsoft.com/office/drawing/2016/5/10/chartex" xmlns:cx5="http://schemas.microsoft.com/office/drawing/2016/5/11/chartex" xmlns:cx6="http://schemas.microsoft.com/office/drawing/2016/5/12/chartex" xmlns:cx7="http://schemas.microsoft.com/office/drawing/2016/5/13/chartex" xmlns:cx8="http://schemas.microsoft.com/office/drawing/2016/5/14/chartex" xmlns:mc="http://schemas.openxmlformats.org/markup-compatibility/2006" xmlns:aink="http://schemas.microsoft.com/office/drawing/2016/ink" xmlns:am3d="http://schemas.microsoft.com/office/drawing/2017/model3d" xmlns:o="urn:schemas-microsoft-com:office:office" xmlns:r="http://schemas.openxmlformats.org/officeDocument/2006/relationships" xmlns:m="http://schemas.openxmlformats.org/officeDocument/2006/math" xmlns:v="urn:schemas-microsoft-com:vml" xmlns:wp14="http://schemas.microsoft.com/office/word/2010/wordprocessingDrawing" xmlns:wp="http://schemas.openxmlformats.org/drawingml/2006/wordprocessingDrawing" xmlns:w10="urn:schemas-microsoft-com:office:word" xmlns:w="http://schemas.openxmlformats.org/wordprocessingml/2006/main" xmlns:w14="http://schemas.microsoft.com/office/word/2010/wordml" xmlns:w15="http://schemas.microsoft.com/office/word/2012/wordml" xmlns:w16cex="http://schemas.microsoft.com/office/word/2018/wordml/cex" xmlns:w16cid="http://schemas.microsoft.com/office/word/2016/wordml/cid" xmlns:w16="http://schemas.microsoft.com/office/word/2018/wordml" xmlns:w16sdtdh="http://schemas.microsoft.com/office/word/2020/wordml/sdtdatahash" xmlns:w16se="http://schemas.microsoft.com/office/word/2015/wordml/symex" xmlns:wpg="http://schemas.microsoft.com/office/word/2010/wordprocessingGroup" xmlns:wpi="http://schemas.microsoft.com/office/word/2010/wordprocessingInk" xmlns:wne="http://schemas.microsoft.com/office/word/2006/wordml" xmlns:wps="http://schemas.microsoft.com/office/word/2010/wordprocessingShape" mc:Ignorable="w14 w15 w16se w16cid w16 w16cex w16sdtdh wp14">
+<w:ftr xmlns:wpc="http://schemas.microsoft.com/office/word/2010/wordprocessingCanvas" xmlns:mc="http://schemas.openxmlformats.org/markup-compatibility/2006" xmlns:o="urn:schemas-microsoft-com:office:office" xmlns:r="http://schemas.openxmlformats.org/officeDocument/2006/relationships" xmlns:m="http://schemas.openxmlformats.org/officeDocument/2006/math" xmlns:v="urn:schemas-microsoft-com:vml" xmlns:wp14="http://schemas.microsoft.com/office/word/2010/wordprocessingDrawing" xmlns:wp="http://schemas.openxmlformats.org/drawingml/2006/wordprocessingDrawing" xmlns:w10="urn:schemas-microsoft-com:office:word" xmlns:w="http://schemas.openxmlformats.org/wordprocessingml/2006/main" xmlns:w14="http://schemas.microsoft.com/office/word/2010/wordml" xmlns:w15="http://schemas.microsoft.com/office/word/2012/wordml" xmlns:wpg="http://schemas.microsoft.com/office/word/2010/wordprocessingGroup" xmlns:wpi="http://schemas.microsoft.com/office/word/2010/wordprocessingInk" xmlns:wne="http://schemas.microsoft.com/office/word/2006/wordml" xmlns:wps="http://schemas.microsoft.com/office/word/2010/wordprocessingShape" mc:Ignorable="w14 w15 wp14">
   <w:p>
     <w:pPr>
       <w:jc w:val="right"/>
@@ -8557,7 +9088,10 @@
       <w:fldChar w:fldCharType="separate"/>
     </w:r>
     <w:r>
-      <w:t>1</w:t>
+      <w:rPr>
+        <w:noProof/>
+      </w:rPr>
+      <w:t>15</w:t>
     </w:r>
     <w:r>
       <w:fldChar w:fldCharType="end"/>
@@ -8567,32 +9101,7 @@
 </file>
 
 <file path=word/footer11.xml><?xml version="1.0" encoding="utf-8"?>
-<w:ftr xmlns:wpc="http://schemas.microsoft.com/office/word/2010/wordprocessingCanvas" xmlns:cx="http://schemas.microsoft.com/office/drawing/2014/chartex" xmlns:cx1="http://schemas.microsoft.com/office/drawing/2015/9/8/chartex" xmlns:cx2="http://schemas.microsoft.com/office/drawing/2015/10/21/chartex" xmlns:cx3="http://schemas.microsoft.com/office/drawing/2016/5/9/chartex" xmlns:cx4="http://schemas.microsoft.com/office/drawing/2016/5/10/chartex" xmlns:cx5="http://schemas.microsoft.com/office/drawing/2016/5/11/chartex" xmlns:cx6="http://schemas.microsoft.com/office/drawing/2016/5/12/chartex" xmlns:cx7="http://schemas.microsoft.com/office/drawing/2016/5/13/chartex" xmlns:cx8="http://schemas.microsoft.com/office/drawing/2016/5/14/chartex" xmlns:mc="http://schemas.openxmlformats.org/markup-compatibility/2006" xmlns:aink="http://schemas.microsoft.com/office/drawing/2016/ink" xmlns:am3d="http://schemas.microsoft.com/office/drawing/2017/model3d" xmlns:o="urn:schemas-microsoft-com:office:office" xmlns:r="http://schemas.openxmlformats.org/officeDocument/2006/relationships" xmlns:m="http://schemas.openxmlformats.org/officeDocument/2006/math" xmlns:v="urn:schemas-microsoft-com:vml" xmlns:wp14="http://schemas.microsoft.com/office/word/2010/wordprocessingDrawing" xmlns:wp="http://schemas.openxmlformats.org/drawingml/2006/wordprocessingDrawing" xmlns:w10="urn:schemas-microsoft-com:office:word" xmlns:w="http://schemas.openxmlformats.org/wordprocessingml/2006/main" xmlns:w14="http://schemas.microsoft.com/office/word/2010/wordml" xmlns:w15="http://schemas.microsoft.com/office/word/2012/wordml" xmlns:w16cex="http://schemas.microsoft.com/office/word/2018/wordml/cex" xmlns:w16cid="http://schemas.microsoft.com/office/word/2016/wordml/cid" xmlns:w16="http://schemas.microsoft.com/office/word/2018/wordml" xmlns:w16sdtdh="http://schemas.microsoft.com/office/word/2020/wordml/sdtdatahash" xmlns:w16se="http://schemas.microsoft.com/office/word/2015/wordml/symex" xmlns:wpg="http://schemas.microsoft.com/office/word/2010/wordprocessingGroup" xmlns:wpi="http://schemas.microsoft.com/office/word/2010/wordprocessingInk" xmlns:wne="http://schemas.microsoft.com/office/word/2006/wordml" xmlns:wps="http://schemas.microsoft.com/office/word/2010/wordprocessingShape" mc:Ignorable="w14 w15 w16se w16cid w16 w16cex w16sdtdh wp14">
-  <w:p>
-    <w:pPr>
-      <w:jc w:val="right"/>
-    </w:pPr>
-    <w:r>
-      <w:fldChar w:fldCharType="begin"/>
-    </w:r>
-    <w:r>
-      <w:instrText xml:space="preserve"> PAGE </w:instrText>
-    </w:r>
-    <w:r>
-      <w:fldChar w:fldCharType="separate"/>
-    </w:r>
-    <w:r>
-      <w:t>1</w:t>
-    </w:r>
-    <w:r>
-      <w:fldChar w:fldCharType="end"/>
-    </w:r>
-  </w:p>
-</w:ftr>
-</file>
-
-<file path=word/footer12.xml><?xml version="1.0" encoding="utf-8"?>
-<w:ftr xmlns:wpc="http://schemas.microsoft.com/office/word/2010/wordprocessingCanvas" xmlns:cx="http://schemas.microsoft.com/office/drawing/2014/chartex" xmlns:cx1="http://schemas.microsoft.com/office/drawing/2015/9/8/chartex" xmlns:cx2="http://schemas.microsoft.com/office/drawing/2015/10/21/chartex" xmlns:cx3="http://schemas.microsoft.com/office/drawing/2016/5/9/chartex" xmlns:cx4="http://schemas.microsoft.com/office/drawing/2016/5/10/chartex" xmlns:cx5="http://schemas.microsoft.com/office/drawing/2016/5/11/chartex" xmlns:cx6="http://schemas.microsoft.com/office/drawing/2016/5/12/chartex" xmlns:cx7="http://schemas.microsoft.com/office/drawing/2016/5/13/chartex" xmlns:cx8="http://schemas.microsoft.com/office/drawing/2016/5/14/chartex" xmlns:mc="http://schemas.openxmlformats.org/markup-compatibility/2006" xmlns:aink="http://schemas.microsoft.com/office/drawing/2016/ink" xmlns:am3d="http://schemas.microsoft.com/office/drawing/2017/model3d" xmlns:o="urn:schemas-microsoft-com:office:office" xmlns:r="http://schemas.openxmlformats.org/officeDocument/2006/relationships" xmlns:m="http://schemas.openxmlformats.org/officeDocument/2006/math" xmlns:v="urn:schemas-microsoft-com:vml" xmlns:wp14="http://schemas.microsoft.com/office/word/2010/wordprocessingDrawing" xmlns:wp="http://schemas.openxmlformats.org/drawingml/2006/wordprocessingDrawing" xmlns:w10="urn:schemas-microsoft-com:office:word" xmlns:w="http://schemas.openxmlformats.org/wordprocessingml/2006/main" xmlns:w14="http://schemas.microsoft.com/office/word/2010/wordml" xmlns:w15="http://schemas.microsoft.com/office/word/2012/wordml" xmlns:w16cex="http://schemas.microsoft.com/office/word/2018/wordml/cex" xmlns:w16cid="http://schemas.microsoft.com/office/word/2016/wordml/cid" xmlns:w16="http://schemas.microsoft.com/office/word/2018/wordml" xmlns:w16sdtdh="http://schemas.microsoft.com/office/word/2020/wordml/sdtdatahash" xmlns:w16se="http://schemas.microsoft.com/office/word/2015/wordml/symex" xmlns:wpg="http://schemas.microsoft.com/office/word/2010/wordprocessingGroup" xmlns:wpi="http://schemas.microsoft.com/office/word/2010/wordprocessingInk" xmlns:wne="http://schemas.microsoft.com/office/word/2006/wordml" xmlns:wps="http://schemas.microsoft.com/office/word/2010/wordprocessingShape" mc:Ignorable="w14 w15 w16se w16cid w16 w16cex w16sdtdh wp14">
+<w:ftr xmlns:wpc="http://schemas.microsoft.com/office/word/2010/wordprocessingCanvas" xmlns:mc="http://schemas.openxmlformats.org/markup-compatibility/2006" xmlns:o="urn:schemas-microsoft-com:office:office" xmlns:r="http://schemas.openxmlformats.org/officeDocument/2006/relationships" xmlns:m="http://schemas.openxmlformats.org/officeDocument/2006/math" xmlns:v="urn:schemas-microsoft-com:vml" xmlns:wp14="http://schemas.microsoft.com/office/word/2010/wordprocessingDrawing" xmlns:wp="http://schemas.openxmlformats.org/drawingml/2006/wordprocessingDrawing" xmlns:w10="urn:schemas-microsoft-com:office:word" xmlns:w="http://schemas.openxmlformats.org/wordprocessingml/2006/main" xmlns:w14="http://schemas.microsoft.com/office/word/2010/wordml" xmlns:w15="http://schemas.microsoft.com/office/word/2012/wordml" xmlns:wpg="http://schemas.microsoft.com/office/word/2010/wordprocessingGroup" xmlns:wpi="http://schemas.microsoft.com/office/word/2010/wordprocessingInk" xmlns:wne="http://schemas.microsoft.com/office/word/2006/wordml" xmlns:wps="http://schemas.microsoft.com/office/word/2010/wordprocessingShape" mc:Ignorable="w14 w15 wp14">
   <w:p>
     <w:pPr>
       <w:jc w:val="right"/>
@@ -8617,7 +9126,35 @@
 </file>
 
 <file path=word/footer2.xml><?xml version="1.0" encoding="utf-8"?>
-<w:ftr xmlns:wpc="http://schemas.microsoft.com/office/word/2010/wordprocessingCanvas" xmlns:cx="http://schemas.microsoft.com/office/drawing/2014/chartex" xmlns:cx1="http://schemas.microsoft.com/office/drawing/2015/9/8/chartex" xmlns:cx2="http://schemas.microsoft.com/office/drawing/2015/10/21/chartex" xmlns:cx3="http://schemas.microsoft.com/office/drawing/2016/5/9/chartex" xmlns:cx4="http://schemas.microsoft.com/office/drawing/2016/5/10/chartex" xmlns:cx5="http://schemas.microsoft.com/office/drawing/2016/5/11/chartex" xmlns:cx6="http://schemas.microsoft.com/office/drawing/2016/5/12/chartex" xmlns:cx7="http://schemas.microsoft.com/office/drawing/2016/5/13/chartex" xmlns:cx8="http://schemas.microsoft.com/office/drawing/2016/5/14/chartex" xmlns:mc="http://schemas.openxmlformats.org/markup-compatibility/2006" xmlns:aink="http://schemas.microsoft.com/office/drawing/2016/ink" xmlns:am3d="http://schemas.microsoft.com/office/drawing/2017/model3d" xmlns:o="urn:schemas-microsoft-com:office:office" xmlns:r="http://schemas.openxmlformats.org/officeDocument/2006/relationships" xmlns:m="http://schemas.openxmlformats.org/officeDocument/2006/math" xmlns:v="urn:schemas-microsoft-com:vml" xmlns:wp14="http://schemas.microsoft.com/office/word/2010/wordprocessingDrawing" xmlns:wp="http://schemas.openxmlformats.org/drawingml/2006/wordprocessingDrawing" xmlns:w10="urn:schemas-microsoft-com:office:word" xmlns:w="http://schemas.openxmlformats.org/wordprocessingml/2006/main" xmlns:w14="http://schemas.microsoft.com/office/word/2010/wordml" xmlns:w15="http://schemas.microsoft.com/office/word/2012/wordml" xmlns:w16cex="http://schemas.microsoft.com/office/word/2018/wordml/cex" xmlns:w16cid="http://schemas.microsoft.com/office/word/2016/wordml/cid" xmlns:w16="http://schemas.microsoft.com/office/word/2018/wordml" xmlns:w16sdtdh="http://schemas.microsoft.com/office/word/2020/wordml/sdtdatahash" xmlns:w16se="http://schemas.microsoft.com/office/word/2015/wordml/symex" xmlns:wpg="http://schemas.microsoft.com/office/word/2010/wordprocessingGroup" xmlns:wpi="http://schemas.microsoft.com/office/word/2010/wordprocessingInk" xmlns:wne="http://schemas.microsoft.com/office/word/2006/wordml" xmlns:wps="http://schemas.microsoft.com/office/word/2010/wordprocessingShape" mc:Ignorable="w14 w15 w16se w16cid w16 w16cex w16sdtdh wp14">
+<w:ftr xmlns:wpc="http://schemas.microsoft.com/office/word/2010/wordprocessingCanvas" xmlns:mc="http://schemas.openxmlformats.org/markup-compatibility/2006" xmlns:o="urn:schemas-microsoft-com:office:office" xmlns:r="http://schemas.openxmlformats.org/officeDocument/2006/relationships" xmlns:m="http://schemas.openxmlformats.org/officeDocument/2006/math" xmlns:v="urn:schemas-microsoft-com:vml" xmlns:wp14="http://schemas.microsoft.com/office/word/2010/wordprocessingDrawing" xmlns:wp="http://schemas.openxmlformats.org/drawingml/2006/wordprocessingDrawing" xmlns:w10="urn:schemas-microsoft-com:office:word" xmlns:w="http://schemas.openxmlformats.org/wordprocessingml/2006/main" xmlns:w14="http://schemas.microsoft.com/office/word/2010/wordml" xmlns:w15="http://schemas.microsoft.com/office/word/2012/wordml" xmlns:wpg="http://schemas.microsoft.com/office/word/2010/wordprocessingGroup" xmlns:wpi="http://schemas.microsoft.com/office/word/2010/wordprocessingInk" xmlns:wne="http://schemas.microsoft.com/office/word/2006/wordml" xmlns:wps="http://schemas.microsoft.com/office/word/2010/wordprocessingShape" mc:Ignorable="w14 w15 wp14">
+  <w:p>
+    <w:pPr>
+      <w:jc w:val="right"/>
+    </w:pPr>
+    <w:r>
+      <w:fldChar w:fldCharType="begin"/>
+    </w:r>
+    <w:r>
+      <w:instrText xml:space="preserve"> PAGE </w:instrText>
+    </w:r>
+    <w:r>
+      <w:fldChar w:fldCharType="separate"/>
+    </w:r>
+    <w:r>
+      <w:rPr>
+        <w:noProof/>
+      </w:rPr>
+      <w:t>1</w:t>
+    </w:r>
+    <w:r>
+      <w:fldChar w:fldCharType="end"/>
+    </w:r>
+  </w:p>
+</w:ftr>
+</file>
+
+<file path=word/footer3.xml><?xml version="1.0" encoding="utf-8"?>
+<w:ftr xmlns:wpc="http://schemas.microsoft.com/office/word/2010/wordprocessingCanvas" xmlns:mc="http://schemas.openxmlformats.org/markup-compatibility/2006" xmlns:o="urn:schemas-microsoft-com:office:office" xmlns:r="http://schemas.openxmlformats.org/officeDocument/2006/relationships" xmlns:m="http://schemas.openxmlformats.org/officeDocument/2006/math" xmlns:v="urn:schemas-microsoft-com:vml" xmlns:wp14="http://schemas.microsoft.com/office/word/2010/wordprocessingDrawing" xmlns:wp="http://schemas.openxmlformats.org/drawingml/2006/wordprocessingDrawing" xmlns:w10="urn:schemas-microsoft-com:office:word" xmlns:w="http://schemas.openxmlformats.org/wordprocessingml/2006/main" xmlns:w14="http://schemas.microsoft.com/office/word/2010/wordml" xmlns:w15="http://schemas.microsoft.com/office/word/2012/wordml" xmlns:wpg="http://schemas.microsoft.com/office/word/2010/wordprocessingGroup" xmlns:wpi="http://schemas.microsoft.com/office/word/2010/wordprocessingInk" xmlns:wne="http://schemas.microsoft.com/office/word/2006/wordml" xmlns:wps="http://schemas.microsoft.com/office/word/2010/wordprocessingShape" mc:Ignorable="w14 w15 wp14">
   <w:p>
     <w:pPr>
       <w:jc w:val="right"/>
@@ -8641,18 +9178,8 @@
 </w:ftr>
 </file>
 
-<file path=word/footer3.xml><?xml version="1.0" encoding="utf-8"?>
-<w:ftr xmlns:wpc="http://schemas.microsoft.com/office/word/2010/wordprocessingCanvas" xmlns:cx="http://schemas.microsoft.com/office/drawing/2014/chartex" xmlns:cx1="http://schemas.microsoft.com/office/drawing/2015/9/8/chartex" xmlns:cx2="http://schemas.microsoft.com/office/drawing/2015/10/21/chartex" xmlns:cx3="http://schemas.microsoft.com/office/drawing/2016/5/9/chartex" xmlns:cx4="http://schemas.microsoft.com/office/drawing/2016/5/10/chartex" xmlns:cx5="http://schemas.microsoft.com/office/drawing/2016/5/11/chartex" xmlns:cx6="http://schemas.microsoft.com/office/drawing/2016/5/12/chartex" xmlns:cx7="http://schemas.microsoft.com/office/drawing/2016/5/13/chartex" xmlns:cx8="http://schemas.microsoft.com/office/drawing/2016/5/14/chartex" xmlns:mc="http://schemas.openxmlformats.org/markup-compatibility/2006" xmlns:aink="http://schemas.microsoft.com/office/drawing/2016/ink" xmlns:am3d="http://schemas.microsoft.com/office/drawing/2017/model3d" xmlns:o="urn:schemas-microsoft-com:office:office" xmlns:r="http://schemas.openxmlformats.org/officeDocument/2006/relationships" xmlns:m="http://schemas.openxmlformats.org/officeDocument/2006/math" xmlns:v="urn:schemas-microsoft-com:vml" xmlns:wp14="http://schemas.microsoft.com/office/word/2010/wordprocessingDrawing" xmlns:wp="http://schemas.openxmlformats.org/drawingml/2006/wordprocessingDrawing" xmlns:w10="urn:schemas-microsoft-com:office:word" xmlns:w="http://schemas.openxmlformats.org/wordprocessingml/2006/main" xmlns:w14="http://schemas.microsoft.com/office/word/2010/wordml" xmlns:w15="http://schemas.microsoft.com/office/word/2012/wordml" xmlns:w16cex="http://schemas.microsoft.com/office/word/2018/wordml/cex" xmlns:w16cid="http://schemas.microsoft.com/office/word/2016/wordml/cid" xmlns:w16="http://schemas.microsoft.com/office/word/2018/wordml" xmlns:w16sdtdh="http://schemas.microsoft.com/office/word/2020/wordml/sdtdatahash" xmlns:w16se="http://schemas.microsoft.com/office/word/2015/wordml/symex" xmlns:wpg="http://schemas.microsoft.com/office/word/2010/wordprocessingGroup" xmlns:wpi="http://schemas.microsoft.com/office/word/2010/wordprocessingInk" xmlns:wne="http://schemas.microsoft.com/office/word/2006/wordml" xmlns:wps="http://schemas.microsoft.com/office/word/2010/wordprocessingShape" mc:Ignorable="w14 w15 w16se w16cid w16 w16cex w16sdtdh wp14">
-  <w:p>
-    <w:pPr>
-      <w:pStyle w:val="Piedepgina"/>
-    </w:pPr>
-  </w:p>
-</w:ftr>
-</file>
-
 <file path=word/footer4.xml><?xml version="1.0" encoding="utf-8"?>
-<w:ftr xmlns:wpc="http://schemas.microsoft.com/office/word/2010/wordprocessingCanvas" xmlns:cx="http://schemas.microsoft.com/office/drawing/2014/chartex" xmlns:cx1="http://schemas.microsoft.com/office/drawing/2015/9/8/chartex" xmlns:cx2="http://schemas.microsoft.com/office/drawing/2015/10/21/chartex" xmlns:cx3="http://schemas.microsoft.com/office/drawing/2016/5/9/chartex" xmlns:cx4="http://schemas.microsoft.com/office/drawing/2016/5/10/chartex" xmlns:cx5="http://schemas.microsoft.com/office/drawing/2016/5/11/chartex" xmlns:cx6="http://schemas.microsoft.com/office/drawing/2016/5/12/chartex" xmlns:cx7="http://schemas.microsoft.com/office/drawing/2016/5/13/chartex" xmlns:cx8="http://schemas.microsoft.com/office/drawing/2016/5/14/chartex" xmlns:mc="http://schemas.openxmlformats.org/markup-compatibility/2006" xmlns:aink="http://schemas.microsoft.com/office/drawing/2016/ink" xmlns:am3d="http://schemas.microsoft.com/office/drawing/2017/model3d" xmlns:o="urn:schemas-microsoft-com:office:office" xmlns:r="http://schemas.openxmlformats.org/officeDocument/2006/relationships" xmlns:m="http://schemas.openxmlformats.org/officeDocument/2006/math" xmlns:v="urn:schemas-microsoft-com:vml" xmlns:wp14="http://schemas.microsoft.com/office/word/2010/wordprocessingDrawing" xmlns:wp="http://schemas.openxmlformats.org/drawingml/2006/wordprocessingDrawing" xmlns:w10="urn:schemas-microsoft-com:office:word" xmlns:w="http://schemas.openxmlformats.org/wordprocessingml/2006/main" xmlns:w14="http://schemas.microsoft.com/office/word/2010/wordml" xmlns:w15="http://schemas.microsoft.com/office/word/2012/wordml" xmlns:w16cex="http://schemas.microsoft.com/office/word/2018/wordml/cex" xmlns:w16cid="http://schemas.microsoft.com/office/word/2016/wordml/cid" xmlns:w16="http://schemas.microsoft.com/office/word/2018/wordml" xmlns:w16sdtdh="http://schemas.microsoft.com/office/word/2020/wordml/sdtdatahash" xmlns:w16se="http://schemas.microsoft.com/office/word/2015/wordml/symex" xmlns:wpg="http://schemas.microsoft.com/office/word/2010/wordprocessingGroup" xmlns:wpi="http://schemas.microsoft.com/office/word/2010/wordprocessingInk" xmlns:wne="http://schemas.microsoft.com/office/word/2006/wordml" xmlns:wps="http://schemas.microsoft.com/office/word/2010/wordprocessingShape" mc:Ignorable="w14 w15 w16se w16cid w16 w16cex w16sdtdh wp14">
+<w:ftr xmlns:wpc="http://schemas.microsoft.com/office/word/2010/wordprocessingCanvas" xmlns:mc="http://schemas.openxmlformats.org/markup-compatibility/2006" xmlns:o="urn:schemas-microsoft-com:office:office" xmlns:r="http://schemas.openxmlformats.org/officeDocument/2006/relationships" xmlns:m="http://schemas.openxmlformats.org/officeDocument/2006/math" xmlns:v="urn:schemas-microsoft-com:vml" xmlns:wp14="http://schemas.microsoft.com/office/word/2010/wordprocessingDrawing" xmlns:wp="http://schemas.openxmlformats.org/drawingml/2006/wordprocessingDrawing" xmlns:w10="urn:schemas-microsoft-com:office:word" xmlns:w="http://schemas.openxmlformats.org/wordprocessingml/2006/main" xmlns:w14="http://schemas.microsoft.com/office/word/2010/wordml" xmlns:w15="http://schemas.microsoft.com/office/word/2012/wordml" xmlns:wpg="http://schemas.microsoft.com/office/word/2010/wordprocessingGroup" xmlns:wpi="http://schemas.microsoft.com/office/word/2010/wordprocessingInk" xmlns:wne="http://schemas.microsoft.com/office/word/2006/wordml" xmlns:wps="http://schemas.microsoft.com/office/word/2010/wordprocessingShape" mc:Ignorable="w14 w15 wp14">
   <w:p>
     <w:pPr>
       <w:jc w:val="right"/>
@@ -8667,7 +9194,10 @@
       <w:fldChar w:fldCharType="separate"/>
     </w:r>
     <w:r>
-      <w:t>1</w:t>
+      <w:rPr>
+        <w:noProof/>
+      </w:rPr>
+      <w:t>9</w:t>
     </w:r>
     <w:r>
       <w:fldChar w:fldCharType="end"/>
@@ -8677,7 +9207,7 @@
 </file>
 
 <file path=word/footer5.xml><?xml version="1.0" encoding="utf-8"?>
-<w:ftr xmlns:wpc="http://schemas.microsoft.com/office/word/2010/wordprocessingCanvas" xmlns:cx="http://schemas.microsoft.com/office/drawing/2014/chartex" xmlns:cx1="http://schemas.microsoft.com/office/drawing/2015/9/8/chartex" xmlns:cx2="http://schemas.microsoft.com/office/drawing/2015/10/21/chartex" xmlns:cx3="http://schemas.microsoft.com/office/drawing/2016/5/9/chartex" xmlns:cx4="http://schemas.microsoft.com/office/drawing/2016/5/10/chartex" xmlns:cx5="http://schemas.microsoft.com/office/drawing/2016/5/11/chartex" xmlns:cx6="http://schemas.microsoft.com/office/drawing/2016/5/12/chartex" xmlns:cx7="http://schemas.microsoft.com/office/drawing/2016/5/13/chartex" xmlns:cx8="http://schemas.microsoft.com/office/drawing/2016/5/14/chartex" xmlns:mc="http://schemas.openxmlformats.org/markup-compatibility/2006" xmlns:aink="http://schemas.microsoft.com/office/drawing/2016/ink" xmlns:am3d="http://schemas.microsoft.com/office/drawing/2017/model3d" xmlns:o="urn:schemas-microsoft-com:office:office" xmlns:r="http://schemas.openxmlformats.org/officeDocument/2006/relationships" xmlns:m="http://schemas.openxmlformats.org/officeDocument/2006/math" xmlns:v="urn:schemas-microsoft-com:vml" xmlns:wp14="http://schemas.microsoft.com/office/word/2010/wordprocessingDrawing" xmlns:wp="http://schemas.openxmlformats.org/drawingml/2006/wordprocessingDrawing" xmlns:w10="urn:schemas-microsoft-com:office:word" xmlns:w="http://schemas.openxmlformats.org/wordprocessingml/2006/main" xmlns:w14="http://schemas.microsoft.com/office/word/2010/wordml" xmlns:w15="http://schemas.microsoft.com/office/word/2012/wordml" xmlns:w16cex="http://schemas.microsoft.com/office/word/2018/wordml/cex" xmlns:w16cid="http://schemas.microsoft.com/office/word/2016/wordml/cid" xmlns:w16="http://schemas.microsoft.com/office/word/2018/wordml" xmlns:w16sdtdh="http://schemas.microsoft.com/office/word/2020/wordml/sdtdatahash" xmlns:w16se="http://schemas.microsoft.com/office/word/2015/wordml/symex" xmlns:wpg="http://schemas.microsoft.com/office/word/2010/wordprocessingGroup" xmlns:wpi="http://schemas.microsoft.com/office/word/2010/wordprocessingInk" xmlns:wne="http://schemas.microsoft.com/office/word/2006/wordml" xmlns:wps="http://schemas.microsoft.com/office/word/2010/wordprocessingShape" mc:Ignorable="w14 w15 w16se w16cid w16 w16cex w16sdtdh wp14">
+<w:ftr xmlns:wpc="http://schemas.microsoft.com/office/word/2010/wordprocessingCanvas" xmlns:mc="http://schemas.openxmlformats.org/markup-compatibility/2006" xmlns:o="urn:schemas-microsoft-com:office:office" xmlns:r="http://schemas.openxmlformats.org/officeDocument/2006/relationships" xmlns:m="http://schemas.openxmlformats.org/officeDocument/2006/math" xmlns:v="urn:schemas-microsoft-com:vml" xmlns:wp14="http://schemas.microsoft.com/office/word/2010/wordprocessingDrawing" xmlns:wp="http://schemas.openxmlformats.org/drawingml/2006/wordprocessingDrawing" xmlns:w10="urn:schemas-microsoft-com:office:word" xmlns:w="http://schemas.openxmlformats.org/wordprocessingml/2006/main" xmlns:w14="http://schemas.microsoft.com/office/word/2010/wordml" xmlns:w15="http://schemas.microsoft.com/office/word/2012/wordml" xmlns:wpg="http://schemas.microsoft.com/office/word/2010/wordprocessingGroup" xmlns:wpi="http://schemas.microsoft.com/office/word/2010/wordprocessingInk" xmlns:wne="http://schemas.microsoft.com/office/word/2006/wordml" xmlns:wps="http://schemas.microsoft.com/office/word/2010/wordprocessingShape" mc:Ignorable="w14 w15 wp14">
   <w:p>
     <w:pPr>
       <w:jc w:val="right"/>
@@ -8702,7 +9232,7 @@
 </file>
 
 <file path=word/footer6.xml><?xml version="1.0" encoding="utf-8"?>
-<w:ftr xmlns:wpc="http://schemas.microsoft.com/office/word/2010/wordprocessingCanvas" xmlns:cx="http://schemas.microsoft.com/office/drawing/2014/chartex" xmlns:cx1="http://schemas.microsoft.com/office/drawing/2015/9/8/chartex" xmlns:cx2="http://schemas.microsoft.com/office/drawing/2015/10/21/chartex" xmlns:cx3="http://schemas.microsoft.com/office/drawing/2016/5/9/chartex" xmlns:cx4="http://schemas.microsoft.com/office/drawing/2016/5/10/chartex" xmlns:cx5="http://schemas.microsoft.com/office/drawing/2016/5/11/chartex" xmlns:cx6="http://schemas.microsoft.com/office/drawing/2016/5/12/chartex" xmlns:cx7="http://schemas.microsoft.com/office/drawing/2016/5/13/chartex" xmlns:cx8="http://schemas.microsoft.com/office/drawing/2016/5/14/chartex" xmlns:mc="http://schemas.openxmlformats.org/markup-compatibility/2006" xmlns:aink="http://schemas.microsoft.com/office/drawing/2016/ink" xmlns:am3d="http://schemas.microsoft.com/office/drawing/2017/model3d" xmlns:o="urn:schemas-microsoft-com:office:office" xmlns:r="http://schemas.openxmlformats.org/officeDocument/2006/relationships" xmlns:m="http://schemas.openxmlformats.org/officeDocument/2006/math" xmlns:v="urn:schemas-microsoft-com:vml" xmlns:wp14="http://schemas.microsoft.com/office/word/2010/wordprocessingDrawing" xmlns:wp="http://schemas.openxmlformats.org/drawingml/2006/wordprocessingDrawing" xmlns:w10="urn:schemas-microsoft-com:office:word" xmlns:w="http://schemas.openxmlformats.org/wordprocessingml/2006/main" xmlns:w14="http://schemas.microsoft.com/office/word/2010/wordml" xmlns:w15="http://schemas.microsoft.com/office/word/2012/wordml" xmlns:w16cex="http://schemas.microsoft.com/office/word/2018/wordml/cex" xmlns:w16cid="http://schemas.microsoft.com/office/word/2016/wordml/cid" xmlns:w16="http://schemas.microsoft.com/office/word/2018/wordml" xmlns:w16sdtdh="http://schemas.microsoft.com/office/word/2020/wordml/sdtdatahash" xmlns:w16se="http://schemas.microsoft.com/office/word/2015/wordml/symex" xmlns:wpg="http://schemas.microsoft.com/office/word/2010/wordprocessingGroup" xmlns:wpi="http://schemas.microsoft.com/office/word/2010/wordprocessingInk" xmlns:wne="http://schemas.microsoft.com/office/word/2006/wordml" xmlns:wps="http://schemas.microsoft.com/office/word/2010/wordprocessingShape" mc:Ignorable="w14 w15 w16se w16cid w16 w16cex w16sdtdh wp14">
+<w:ftr xmlns:wpc="http://schemas.microsoft.com/office/word/2010/wordprocessingCanvas" xmlns:mc="http://schemas.openxmlformats.org/markup-compatibility/2006" xmlns:o="urn:schemas-microsoft-com:office:office" xmlns:r="http://schemas.openxmlformats.org/officeDocument/2006/relationships" xmlns:m="http://schemas.openxmlformats.org/officeDocument/2006/math" xmlns:v="urn:schemas-microsoft-com:vml" xmlns:wp14="http://schemas.microsoft.com/office/word/2010/wordprocessingDrawing" xmlns:wp="http://schemas.openxmlformats.org/drawingml/2006/wordprocessingDrawing" xmlns:w10="urn:schemas-microsoft-com:office:word" xmlns:w="http://schemas.openxmlformats.org/wordprocessingml/2006/main" xmlns:w14="http://schemas.microsoft.com/office/word/2010/wordml" xmlns:w15="http://schemas.microsoft.com/office/word/2012/wordml" xmlns:wpg="http://schemas.microsoft.com/office/word/2010/wordprocessingGroup" xmlns:wpi="http://schemas.microsoft.com/office/word/2010/wordprocessingInk" xmlns:wne="http://schemas.microsoft.com/office/word/2006/wordml" xmlns:wps="http://schemas.microsoft.com/office/word/2010/wordprocessingShape" mc:Ignorable="w14 w15 wp14">
   <w:p>
     <w:pPr>
       <w:jc w:val="right"/>
@@ -8727,7 +9257,7 @@
 </file>
 
 <file path=word/footer7.xml><?xml version="1.0" encoding="utf-8"?>
-<w:ftr xmlns:wpc="http://schemas.microsoft.com/office/word/2010/wordprocessingCanvas" xmlns:cx="http://schemas.microsoft.com/office/drawing/2014/chartex" xmlns:cx1="http://schemas.microsoft.com/office/drawing/2015/9/8/chartex" xmlns:cx2="http://schemas.microsoft.com/office/drawing/2015/10/21/chartex" xmlns:cx3="http://schemas.microsoft.com/office/drawing/2016/5/9/chartex" xmlns:cx4="http://schemas.microsoft.com/office/drawing/2016/5/10/chartex" xmlns:cx5="http://schemas.microsoft.com/office/drawing/2016/5/11/chartex" xmlns:cx6="http://schemas.microsoft.com/office/drawing/2016/5/12/chartex" xmlns:cx7="http://schemas.microsoft.com/office/drawing/2016/5/13/chartex" xmlns:cx8="http://schemas.microsoft.com/office/drawing/2016/5/14/chartex" xmlns:mc="http://schemas.openxmlformats.org/markup-compatibility/2006" xmlns:aink="http://schemas.microsoft.com/office/drawing/2016/ink" xmlns:am3d="http://schemas.microsoft.com/office/drawing/2017/model3d" xmlns:o="urn:schemas-microsoft-com:office:office" xmlns:r="http://schemas.openxmlformats.org/officeDocument/2006/relationships" xmlns:m="http://schemas.openxmlformats.org/officeDocument/2006/math" xmlns:v="urn:schemas-microsoft-com:vml" xmlns:wp14="http://schemas.microsoft.com/office/word/2010/wordprocessingDrawing" xmlns:wp="http://schemas.openxmlformats.org/drawingml/2006/wordprocessingDrawing" xmlns:w10="urn:schemas-microsoft-com:office:word" xmlns:w="http://schemas.openxmlformats.org/wordprocessingml/2006/main" xmlns:w14="http://schemas.microsoft.com/office/word/2010/wordml" xmlns:w15="http://schemas.microsoft.com/office/word/2012/wordml" xmlns:w16cex="http://schemas.microsoft.com/office/word/2018/wordml/cex" xmlns:w16cid="http://schemas.microsoft.com/office/word/2016/wordml/cid" xmlns:w16="http://schemas.microsoft.com/office/word/2018/wordml" xmlns:w16sdtdh="http://schemas.microsoft.com/office/word/2020/wordml/sdtdatahash" xmlns:w16se="http://schemas.microsoft.com/office/word/2015/wordml/symex" xmlns:wpg="http://schemas.microsoft.com/office/word/2010/wordprocessingGroup" xmlns:wpi="http://schemas.microsoft.com/office/word/2010/wordprocessingInk" xmlns:wne="http://schemas.microsoft.com/office/word/2006/wordml" xmlns:wps="http://schemas.microsoft.com/office/word/2010/wordprocessingShape" mc:Ignorable="w14 w15 w16se w16cid w16 w16cex w16sdtdh wp14">
+<w:ftr xmlns:wpc="http://schemas.microsoft.com/office/word/2010/wordprocessingCanvas" xmlns:mc="http://schemas.openxmlformats.org/markup-compatibility/2006" xmlns:o="urn:schemas-microsoft-com:office:office" xmlns:r="http://schemas.openxmlformats.org/officeDocument/2006/relationships" xmlns:m="http://schemas.openxmlformats.org/officeDocument/2006/math" xmlns:v="urn:schemas-microsoft-com:vml" xmlns:wp14="http://schemas.microsoft.com/office/word/2010/wordprocessingDrawing" xmlns:wp="http://schemas.openxmlformats.org/drawingml/2006/wordprocessingDrawing" xmlns:w10="urn:schemas-microsoft-com:office:word" xmlns:w="http://schemas.openxmlformats.org/wordprocessingml/2006/main" xmlns:w14="http://schemas.microsoft.com/office/word/2010/wordml" xmlns:w15="http://schemas.microsoft.com/office/word/2012/wordml" xmlns:wpg="http://schemas.microsoft.com/office/word/2010/wordprocessingGroup" xmlns:wpi="http://schemas.microsoft.com/office/word/2010/wordprocessingInk" xmlns:wne="http://schemas.microsoft.com/office/word/2006/wordml" xmlns:wps="http://schemas.microsoft.com/office/word/2010/wordprocessingShape" mc:Ignorable="w14 w15 wp14">
   <w:p>
     <w:pPr>
       <w:jc w:val="right"/>
@@ -8742,7 +9272,10 @@
       <w:fldChar w:fldCharType="separate"/>
     </w:r>
     <w:r>
-      <w:t>1</w:t>
+      <w:rPr>
+        <w:noProof/>
+      </w:rPr>
+      <w:t>12</w:t>
     </w:r>
     <w:r>
       <w:fldChar w:fldCharType="end"/>
@@ -8752,7 +9285,7 @@
 </file>
 
 <file path=word/footer8.xml><?xml version="1.0" encoding="utf-8"?>
-<w:ftr xmlns:wpc="http://schemas.microsoft.com/office/word/2010/wordprocessingCanvas" xmlns:cx="http://schemas.microsoft.com/office/drawing/2014/chartex" xmlns:cx1="http://schemas.microsoft.com/office/drawing/2015/9/8/chartex" xmlns:cx2="http://schemas.microsoft.com/office/drawing/2015/10/21/chartex" xmlns:cx3="http://schemas.microsoft.com/office/drawing/2016/5/9/chartex" xmlns:cx4="http://schemas.microsoft.com/office/drawing/2016/5/10/chartex" xmlns:cx5="http://schemas.microsoft.com/office/drawing/2016/5/11/chartex" xmlns:cx6="http://schemas.microsoft.com/office/drawing/2016/5/12/chartex" xmlns:cx7="http://schemas.microsoft.com/office/drawing/2016/5/13/chartex" xmlns:cx8="http://schemas.microsoft.com/office/drawing/2016/5/14/chartex" xmlns:mc="http://schemas.openxmlformats.org/markup-compatibility/2006" xmlns:aink="http://schemas.microsoft.com/office/drawing/2016/ink" xmlns:am3d="http://schemas.microsoft.com/office/drawing/2017/model3d" xmlns:o="urn:schemas-microsoft-com:office:office" xmlns:r="http://schemas.openxmlformats.org/officeDocument/2006/relationships" xmlns:m="http://schemas.openxmlformats.org/officeDocument/2006/math" xmlns:v="urn:schemas-microsoft-com:vml" xmlns:wp14="http://schemas.microsoft.com/office/word/2010/wordprocessingDrawing" xmlns:wp="http://schemas.openxmlformats.org/drawingml/2006/wordprocessingDrawing" xmlns:w10="urn:schemas-microsoft-com:office:word" xmlns:w="http://schemas.openxmlformats.org/wordprocessingml/2006/main" xmlns:w14="http://schemas.microsoft.com/office/word/2010/wordml" xmlns:w15="http://schemas.microsoft.com/office/word/2012/wordml" xmlns:w16cex="http://schemas.microsoft.com/office/word/2018/wordml/cex" xmlns:w16cid="http://schemas.microsoft.com/office/word/2016/wordml/cid" xmlns:w16="http://schemas.microsoft.com/office/word/2018/wordml" xmlns:w16sdtdh="http://schemas.microsoft.com/office/word/2020/wordml/sdtdatahash" xmlns:w16se="http://schemas.microsoft.com/office/word/2015/wordml/symex" xmlns:wpg="http://schemas.microsoft.com/office/word/2010/wordprocessingGroup" xmlns:wpi="http://schemas.microsoft.com/office/word/2010/wordprocessingInk" xmlns:wne="http://schemas.microsoft.com/office/word/2006/wordml" xmlns:wps="http://schemas.microsoft.com/office/word/2010/wordprocessingShape" mc:Ignorable="w14 w15 w16se w16cid w16 w16cex w16sdtdh wp14">
+<w:ftr xmlns:wpc="http://schemas.microsoft.com/office/word/2010/wordprocessingCanvas" xmlns:mc="http://schemas.openxmlformats.org/markup-compatibility/2006" xmlns:o="urn:schemas-microsoft-com:office:office" xmlns:r="http://schemas.openxmlformats.org/officeDocument/2006/relationships" xmlns:m="http://schemas.openxmlformats.org/officeDocument/2006/math" xmlns:v="urn:schemas-microsoft-com:vml" xmlns:wp14="http://schemas.microsoft.com/office/word/2010/wordprocessingDrawing" xmlns:wp="http://schemas.openxmlformats.org/drawingml/2006/wordprocessingDrawing" xmlns:w10="urn:schemas-microsoft-com:office:word" xmlns:w="http://schemas.openxmlformats.org/wordprocessingml/2006/main" xmlns:w14="http://schemas.microsoft.com/office/word/2010/wordml" xmlns:w15="http://schemas.microsoft.com/office/word/2012/wordml" xmlns:wpg="http://schemas.microsoft.com/office/word/2010/wordprocessingGroup" xmlns:wpi="http://schemas.microsoft.com/office/word/2010/wordprocessingInk" xmlns:wne="http://schemas.microsoft.com/office/word/2006/wordml" xmlns:wps="http://schemas.microsoft.com/office/word/2010/wordprocessingShape" mc:Ignorable="w14 w15 wp14">
   <w:p>
     <w:pPr>
       <w:jc w:val="right"/>
@@ -8777,7 +9310,7 @@
 </file>
 
 <file path=word/footer9.xml><?xml version="1.0" encoding="utf-8"?>
-<w:ftr xmlns:wpc="http://schemas.microsoft.com/office/word/2010/wordprocessingCanvas" xmlns:cx="http://schemas.microsoft.com/office/drawing/2014/chartex" xmlns:cx1="http://schemas.microsoft.com/office/drawing/2015/9/8/chartex" xmlns:cx2="http://schemas.microsoft.com/office/drawing/2015/10/21/chartex" xmlns:cx3="http://schemas.microsoft.com/office/drawing/2016/5/9/chartex" xmlns:cx4="http://schemas.microsoft.com/office/drawing/2016/5/10/chartex" xmlns:cx5="http://schemas.microsoft.com/office/drawing/2016/5/11/chartex" xmlns:cx6="http://schemas.microsoft.com/office/drawing/2016/5/12/chartex" xmlns:cx7="http://schemas.microsoft.com/office/drawing/2016/5/13/chartex" xmlns:cx8="http://schemas.microsoft.com/office/drawing/2016/5/14/chartex" xmlns:mc="http://schemas.openxmlformats.org/markup-compatibility/2006" xmlns:aink="http://schemas.microsoft.com/office/drawing/2016/ink" xmlns:am3d="http://schemas.microsoft.com/office/drawing/2017/model3d" xmlns:o="urn:schemas-microsoft-com:office:office" xmlns:r="http://schemas.openxmlformats.org/officeDocument/2006/relationships" xmlns:m="http://schemas.openxmlformats.org/officeDocument/2006/math" xmlns:v="urn:schemas-microsoft-com:vml" xmlns:wp14="http://schemas.microsoft.com/office/word/2010/wordprocessingDrawing" xmlns:wp="http://schemas.openxmlformats.org/drawingml/2006/wordprocessingDrawing" xmlns:w10="urn:schemas-microsoft-com:office:word" xmlns:w="http://schemas.openxmlformats.org/wordprocessingml/2006/main" xmlns:w14="http://schemas.microsoft.com/office/word/2010/wordml" xmlns:w15="http://schemas.microsoft.com/office/word/2012/wordml" xmlns:w16cex="http://schemas.microsoft.com/office/word/2018/wordml/cex" xmlns:w16cid="http://schemas.microsoft.com/office/word/2016/wordml/cid" xmlns:w16="http://schemas.microsoft.com/office/word/2018/wordml" xmlns:w16sdtdh="http://schemas.microsoft.com/office/word/2020/wordml/sdtdatahash" xmlns:w16se="http://schemas.microsoft.com/office/word/2015/wordml/symex" xmlns:wpg="http://schemas.microsoft.com/office/word/2010/wordprocessingGroup" xmlns:wpi="http://schemas.microsoft.com/office/word/2010/wordprocessingInk" xmlns:wne="http://schemas.microsoft.com/office/word/2006/wordml" xmlns:wps="http://schemas.microsoft.com/office/word/2010/wordprocessingShape" mc:Ignorable="w14 w15 w16se w16cid w16 w16cex w16sdtdh wp14">
+<w:ftr xmlns:wpc="http://schemas.microsoft.com/office/word/2010/wordprocessingCanvas" xmlns:mc="http://schemas.openxmlformats.org/markup-compatibility/2006" xmlns:o="urn:schemas-microsoft-com:office:office" xmlns:r="http://schemas.openxmlformats.org/officeDocument/2006/relationships" xmlns:m="http://schemas.openxmlformats.org/officeDocument/2006/math" xmlns:v="urn:schemas-microsoft-com:vml" xmlns:wp14="http://schemas.microsoft.com/office/word/2010/wordprocessingDrawing" xmlns:wp="http://schemas.openxmlformats.org/drawingml/2006/wordprocessingDrawing" xmlns:w10="urn:schemas-microsoft-com:office:word" xmlns:w="http://schemas.openxmlformats.org/wordprocessingml/2006/main" xmlns:w14="http://schemas.microsoft.com/office/word/2010/wordml" xmlns:w15="http://schemas.microsoft.com/office/word/2012/wordml" xmlns:wpg="http://schemas.microsoft.com/office/word/2010/wordprocessingGroup" xmlns:wpi="http://schemas.microsoft.com/office/word/2010/wordprocessingInk" xmlns:wne="http://schemas.microsoft.com/office/word/2006/wordml" xmlns:wps="http://schemas.microsoft.com/office/word/2010/wordprocessingShape" mc:Ignorable="w14 w15 wp14">
   <w:p>
     <w:pPr>
       <w:jc w:val="right"/>
@@ -8802,7 +9335,7 @@
 </file>
 
 <file path=word/footnotes.xml><?xml version="1.0" encoding="utf-8"?>
-<w:footnotes xmlns:wpc="http://schemas.microsoft.com/office/word/2010/wordprocessingCanvas" xmlns:cx="http://schemas.microsoft.com/office/drawing/2014/chartex" xmlns:cx1="http://schemas.microsoft.com/office/drawing/2015/9/8/chartex" xmlns:cx2="http://schemas.microsoft.com/office/drawing/2015/10/21/chartex" xmlns:cx3="http://schemas.microsoft.com/office/drawing/2016/5/9/chartex" xmlns:cx4="http://schemas.microsoft.com/office/drawing/2016/5/10/chartex" xmlns:cx5="http://schemas.microsoft.com/office/drawing/2016/5/11/chartex" xmlns:cx6="http://schemas.microsoft.com/office/drawing/2016/5/12/chartex" xmlns:cx7="http://schemas.microsoft.com/office/drawing/2016/5/13/chartex" xmlns:cx8="http://schemas.microsoft.com/office/drawing/2016/5/14/chartex" xmlns:mc="http://schemas.openxmlformats.org/markup-compatibility/2006" xmlns:aink="http://schemas.microsoft.com/office/drawing/2016/ink" xmlns:am3d="http://schemas.microsoft.com/office/drawing/2017/model3d" xmlns:o="urn:schemas-microsoft-com:office:office" xmlns:r="http://schemas.openxmlformats.org/officeDocument/2006/relationships" xmlns:m="http://schemas.openxmlformats.org/officeDocument/2006/math" xmlns:v="urn:schemas-microsoft-com:vml" xmlns:wp14="http://schemas.microsoft.com/office/word/2010/wordprocessingDrawing" xmlns:wp="http://schemas.openxmlformats.org/drawingml/2006/wordprocessingDrawing" xmlns:w10="urn:schemas-microsoft-com:office:word" xmlns:w="http://schemas.openxmlformats.org/wordprocessingml/2006/main" xmlns:w14="http://schemas.microsoft.com/office/word/2010/wordml" xmlns:w15="http://schemas.microsoft.com/office/word/2012/wordml" xmlns:w16cex="http://schemas.microsoft.com/office/word/2018/wordml/cex" xmlns:w16cid="http://schemas.microsoft.com/office/word/2016/wordml/cid" xmlns:w16="http://schemas.microsoft.com/office/word/2018/wordml" xmlns:w16sdtdh="http://schemas.microsoft.com/office/word/2020/wordml/sdtdatahash" xmlns:w16se="http://schemas.microsoft.com/office/word/2015/wordml/symex" xmlns:wpg="http://schemas.microsoft.com/office/word/2010/wordprocessingGroup" xmlns:wpi="http://schemas.microsoft.com/office/word/2010/wordprocessingInk" xmlns:wne="http://schemas.microsoft.com/office/word/2006/wordml" xmlns:wps="http://schemas.microsoft.com/office/word/2010/wordprocessingShape" mc:Ignorable="w14 w15 w16se w16cid w16 w16cex w16sdtdh wp14">
+<w:footnotes xmlns:wpc="http://schemas.microsoft.com/office/word/2010/wordprocessingCanvas" xmlns:mc="http://schemas.openxmlformats.org/markup-compatibility/2006" xmlns:o="urn:schemas-microsoft-com:office:office" xmlns:r="http://schemas.openxmlformats.org/officeDocument/2006/relationships" xmlns:m="http://schemas.openxmlformats.org/officeDocument/2006/math" xmlns:v="urn:schemas-microsoft-com:vml" xmlns:wp14="http://schemas.microsoft.com/office/word/2010/wordprocessingDrawing" xmlns:wp="http://schemas.openxmlformats.org/drawingml/2006/wordprocessingDrawing" xmlns:w10="urn:schemas-microsoft-com:office:word" xmlns:w="http://schemas.openxmlformats.org/wordprocessingml/2006/main" xmlns:w14="http://schemas.microsoft.com/office/word/2010/wordml" xmlns:w15="http://schemas.microsoft.com/office/word/2012/wordml" xmlns:wpg="http://schemas.microsoft.com/office/word/2010/wordprocessingGroup" xmlns:wpi="http://schemas.microsoft.com/office/word/2010/wordprocessingInk" xmlns:wne="http://schemas.microsoft.com/office/word/2006/wordml" xmlns:wps="http://schemas.microsoft.com/office/word/2010/wordprocessingShape" mc:Ignorable="w14 w15 wp14">
   <w:footnote w:type="separator" w:id="-1">
     <w:p>
       <w:pPr>
@@ -8826,38 +9359,8 @@
 </w:footnotes>
 </file>
 
-<file path=word/header1.xml><?xml version="1.0" encoding="utf-8"?>
-<w:hdr xmlns:wpc="http://schemas.microsoft.com/office/word/2010/wordprocessingCanvas" xmlns:cx="http://schemas.microsoft.com/office/drawing/2014/chartex" xmlns:cx1="http://schemas.microsoft.com/office/drawing/2015/9/8/chartex" xmlns:cx2="http://schemas.microsoft.com/office/drawing/2015/10/21/chartex" xmlns:cx3="http://schemas.microsoft.com/office/drawing/2016/5/9/chartex" xmlns:cx4="http://schemas.microsoft.com/office/drawing/2016/5/10/chartex" xmlns:cx5="http://schemas.microsoft.com/office/drawing/2016/5/11/chartex" xmlns:cx6="http://schemas.microsoft.com/office/drawing/2016/5/12/chartex" xmlns:cx7="http://schemas.microsoft.com/office/drawing/2016/5/13/chartex" xmlns:cx8="http://schemas.microsoft.com/office/drawing/2016/5/14/chartex" xmlns:mc="http://schemas.openxmlformats.org/markup-compatibility/2006" xmlns:aink="http://schemas.microsoft.com/office/drawing/2016/ink" xmlns:am3d="http://schemas.microsoft.com/office/drawing/2017/model3d" xmlns:o="urn:schemas-microsoft-com:office:office" xmlns:r="http://schemas.openxmlformats.org/officeDocument/2006/relationships" xmlns:m="http://schemas.openxmlformats.org/officeDocument/2006/math" xmlns:v="urn:schemas-microsoft-com:vml" xmlns:wp14="http://schemas.microsoft.com/office/word/2010/wordprocessingDrawing" xmlns:wp="http://schemas.openxmlformats.org/drawingml/2006/wordprocessingDrawing" xmlns:w10="urn:schemas-microsoft-com:office:word" xmlns:w="http://schemas.openxmlformats.org/wordprocessingml/2006/main" xmlns:w14="http://schemas.microsoft.com/office/word/2010/wordml" xmlns:w15="http://schemas.microsoft.com/office/word/2012/wordml" xmlns:w16cex="http://schemas.microsoft.com/office/word/2018/wordml/cex" xmlns:w16cid="http://schemas.microsoft.com/office/word/2016/wordml/cid" xmlns:w16="http://schemas.microsoft.com/office/word/2018/wordml" xmlns:w16sdtdh="http://schemas.microsoft.com/office/word/2020/wordml/sdtdatahash" xmlns:w16se="http://schemas.microsoft.com/office/word/2015/wordml/symex" xmlns:wpg="http://schemas.microsoft.com/office/word/2010/wordprocessingGroup" xmlns:wpi="http://schemas.microsoft.com/office/word/2010/wordprocessingInk" xmlns:wne="http://schemas.microsoft.com/office/word/2006/wordml" xmlns:wps="http://schemas.microsoft.com/office/word/2010/wordprocessingShape" mc:Ignorable="w14 w15 w16se w16cid w16 w16cex w16sdtdh wp14">
-  <w:p>
-    <w:pPr>
-      <w:pStyle w:val="Encabezado"/>
-    </w:pPr>
-  </w:p>
-</w:hdr>
-</file>
-
-<file path=word/header2.xml><?xml version="1.0" encoding="utf-8"?>
-<w:hdr xmlns:wpc="http://schemas.microsoft.com/office/word/2010/wordprocessingCanvas" xmlns:cx="http://schemas.microsoft.com/office/drawing/2014/chartex" xmlns:cx1="http://schemas.microsoft.com/office/drawing/2015/9/8/chartex" xmlns:cx2="http://schemas.microsoft.com/office/drawing/2015/10/21/chartex" xmlns:cx3="http://schemas.microsoft.com/office/drawing/2016/5/9/chartex" xmlns:cx4="http://schemas.microsoft.com/office/drawing/2016/5/10/chartex" xmlns:cx5="http://schemas.microsoft.com/office/drawing/2016/5/11/chartex" xmlns:cx6="http://schemas.microsoft.com/office/drawing/2016/5/12/chartex" xmlns:cx7="http://schemas.microsoft.com/office/drawing/2016/5/13/chartex" xmlns:cx8="http://schemas.microsoft.com/office/drawing/2016/5/14/chartex" xmlns:mc="http://schemas.openxmlformats.org/markup-compatibility/2006" xmlns:aink="http://schemas.microsoft.com/office/drawing/2016/ink" xmlns:am3d="http://schemas.microsoft.com/office/drawing/2017/model3d" xmlns:o="urn:schemas-microsoft-com:office:office" xmlns:r="http://schemas.openxmlformats.org/officeDocument/2006/relationships" xmlns:m="http://schemas.openxmlformats.org/officeDocument/2006/math" xmlns:v="urn:schemas-microsoft-com:vml" xmlns:wp14="http://schemas.microsoft.com/office/word/2010/wordprocessingDrawing" xmlns:wp="http://schemas.openxmlformats.org/drawingml/2006/wordprocessingDrawing" xmlns:w10="urn:schemas-microsoft-com:office:word" xmlns:w="http://schemas.openxmlformats.org/wordprocessingml/2006/main" xmlns:w14="http://schemas.microsoft.com/office/word/2010/wordml" xmlns:w15="http://schemas.microsoft.com/office/word/2012/wordml" xmlns:w16cex="http://schemas.microsoft.com/office/word/2018/wordml/cex" xmlns:w16cid="http://schemas.microsoft.com/office/word/2016/wordml/cid" xmlns:w16="http://schemas.microsoft.com/office/word/2018/wordml" xmlns:w16sdtdh="http://schemas.microsoft.com/office/word/2020/wordml/sdtdatahash" xmlns:w16se="http://schemas.microsoft.com/office/word/2015/wordml/symex" xmlns:wpg="http://schemas.microsoft.com/office/word/2010/wordprocessingGroup" xmlns:wpi="http://schemas.microsoft.com/office/word/2010/wordprocessingInk" xmlns:wne="http://schemas.microsoft.com/office/word/2006/wordml" xmlns:wps="http://schemas.microsoft.com/office/word/2010/wordprocessingShape" mc:Ignorable="w14 w15 w16se w16cid w16 w16cex w16sdtdh wp14">
-  <w:p>
-    <w:pPr>
-      <w:pStyle w:val="Encabezado"/>
-    </w:pPr>
-  </w:p>
-</w:hdr>
-</file>
-
-<file path=word/header3.xml><?xml version="1.0" encoding="utf-8"?>
-<w:hdr xmlns:wpc="http://schemas.microsoft.com/office/word/2010/wordprocessingCanvas" xmlns:cx="http://schemas.microsoft.com/office/drawing/2014/chartex" xmlns:cx1="http://schemas.microsoft.com/office/drawing/2015/9/8/chartex" xmlns:cx2="http://schemas.microsoft.com/office/drawing/2015/10/21/chartex" xmlns:cx3="http://schemas.microsoft.com/office/drawing/2016/5/9/chartex" xmlns:cx4="http://schemas.microsoft.com/office/drawing/2016/5/10/chartex" xmlns:cx5="http://schemas.microsoft.com/office/drawing/2016/5/11/chartex" xmlns:cx6="http://schemas.microsoft.com/office/drawing/2016/5/12/chartex" xmlns:cx7="http://schemas.microsoft.com/office/drawing/2016/5/13/chartex" xmlns:cx8="http://schemas.microsoft.com/office/drawing/2016/5/14/chartex" xmlns:mc="http://schemas.openxmlformats.org/markup-compatibility/2006" xmlns:aink="http://schemas.microsoft.com/office/drawing/2016/ink" xmlns:am3d="http://schemas.microsoft.com/office/drawing/2017/model3d" xmlns:o="urn:schemas-microsoft-com:office:office" xmlns:r="http://schemas.openxmlformats.org/officeDocument/2006/relationships" xmlns:m="http://schemas.openxmlformats.org/officeDocument/2006/math" xmlns:v="urn:schemas-microsoft-com:vml" xmlns:wp14="http://schemas.microsoft.com/office/word/2010/wordprocessingDrawing" xmlns:wp="http://schemas.openxmlformats.org/drawingml/2006/wordprocessingDrawing" xmlns:w10="urn:schemas-microsoft-com:office:word" xmlns:w="http://schemas.openxmlformats.org/wordprocessingml/2006/main" xmlns:w14="http://schemas.microsoft.com/office/word/2010/wordml" xmlns:w15="http://schemas.microsoft.com/office/word/2012/wordml" xmlns:w16cex="http://schemas.microsoft.com/office/word/2018/wordml/cex" xmlns:w16cid="http://schemas.microsoft.com/office/word/2016/wordml/cid" xmlns:w16="http://schemas.microsoft.com/office/word/2018/wordml" xmlns:w16sdtdh="http://schemas.microsoft.com/office/word/2020/wordml/sdtdatahash" xmlns:w16se="http://schemas.microsoft.com/office/word/2015/wordml/symex" xmlns:wpg="http://schemas.microsoft.com/office/word/2010/wordprocessingGroup" xmlns:wpi="http://schemas.microsoft.com/office/word/2010/wordprocessingInk" xmlns:wne="http://schemas.microsoft.com/office/word/2006/wordml" xmlns:wps="http://schemas.microsoft.com/office/word/2010/wordprocessingShape" mc:Ignorable="w14 w15 w16se w16cid w16 w16cex w16sdtdh wp14">
-  <w:p>
-    <w:pPr>
-      <w:pStyle w:val="Encabezado"/>
-    </w:pPr>
-  </w:p>
-</w:hdr>
-</file>
-
 <file path=word/numbering.xml><?xml version="1.0" encoding="utf-8"?>
-<w:numbering xmlns:wpc="http://schemas.microsoft.com/office/word/2010/wordprocessingCanvas" xmlns:cx="http://schemas.microsoft.com/office/drawing/2014/chartex" xmlns:cx1="http://schemas.microsoft.com/office/drawing/2015/9/8/chartex" xmlns:cx2="http://schemas.microsoft.com/office/drawing/2015/10/21/chartex" xmlns:cx3="http://schemas.microsoft.com/office/drawing/2016/5/9/chartex" xmlns:cx4="http://schemas.microsoft.com/office/drawing/2016/5/10/chartex" xmlns:cx5="http://schemas.microsoft.com/office/drawing/2016/5/11/chartex" xmlns:cx6="http://schemas.microsoft.com/office/drawing/2016/5/12/chartex" xmlns:cx7="http://schemas.microsoft.com/office/drawing/2016/5/13/chartex" xmlns:cx8="http://schemas.microsoft.com/office/drawing/2016/5/14/chartex" xmlns:mc="http://schemas.openxmlformats.org/markup-compatibility/2006" xmlns:aink="http://schemas.microsoft.com/office/drawing/2016/ink" xmlns:am3d="http://schemas.microsoft.com/office/drawing/2017/model3d" xmlns:o="urn:schemas-microsoft-com:office:office" xmlns:r="http://schemas.openxmlformats.org/officeDocument/2006/relationships" xmlns:m="http://schemas.openxmlformats.org/officeDocument/2006/math" xmlns:v="urn:schemas-microsoft-com:vml" xmlns:wp14="http://schemas.microsoft.com/office/word/2010/wordprocessingDrawing" xmlns:wp="http://schemas.openxmlformats.org/drawingml/2006/wordprocessingDrawing" xmlns:w10="urn:schemas-microsoft-com:office:word" xmlns:w="http://schemas.openxmlformats.org/wordprocessingml/2006/main" xmlns:w14="http://schemas.microsoft.com/office/word/2010/wordml" xmlns:w15="http://schemas.microsoft.com/office/word/2012/wordml" xmlns:w16cex="http://schemas.microsoft.com/office/word/2018/wordml/cex" xmlns:w16cid="http://schemas.microsoft.com/office/word/2016/wordml/cid" xmlns:w16="http://schemas.microsoft.com/office/word/2018/wordml" xmlns:w16sdtdh="http://schemas.microsoft.com/office/word/2020/wordml/sdtdatahash" xmlns:w16se="http://schemas.microsoft.com/office/word/2015/wordml/symex" xmlns:wpg="http://schemas.microsoft.com/office/word/2010/wordprocessingGroup" xmlns:wpi="http://schemas.microsoft.com/office/word/2010/wordprocessingInk" xmlns:wne="http://schemas.microsoft.com/office/word/2006/wordml" xmlns:wps="http://schemas.microsoft.com/office/word/2010/wordprocessingShape" mc:Ignorable="w14 w15 w16se w16cid w16 w16cex w16sdtdh wp14">
+<w:numbering xmlns:wpc="http://schemas.microsoft.com/office/word/2010/wordprocessingCanvas" xmlns:mc="http://schemas.openxmlformats.org/markup-compatibility/2006" xmlns:o="urn:schemas-microsoft-com:office:office" xmlns:r="http://schemas.openxmlformats.org/officeDocument/2006/relationships" xmlns:m="http://schemas.openxmlformats.org/officeDocument/2006/math" xmlns:v="urn:schemas-microsoft-com:vml" xmlns:wp14="http://schemas.microsoft.com/office/word/2010/wordprocessingDrawing" xmlns:wp="http://schemas.openxmlformats.org/drawingml/2006/wordprocessingDrawing" xmlns:w10="urn:schemas-microsoft-com:office:word" xmlns:w="http://schemas.openxmlformats.org/wordprocessingml/2006/main" xmlns:w14="http://schemas.microsoft.com/office/word/2010/wordml" xmlns:w15="http://schemas.microsoft.com/office/word/2012/wordml" xmlns:wpg="http://schemas.microsoft.com/office/word/2010/wordprocessingGroup" xmlns:wpi="http://schemas.microsoft.com/office/word/2010/wordprocessingInk" xmlns:wne="http://schemas.microsoft.com/office/word/2006/wordml" xmlns:wps="http://schemas.microsoft.com/office/word/2010/wordprocessingShape" mc:Ignorable="w14 w15 wp14">
   <w:abstractNum w:abstractNumId="0" w15:restartNumberingAfterBreak="0">
     <w:nsid w:val="060D456D"/>
     <w:multiLevelType w:val="hybridMultilevel"/>
@@ -11012,7 +11515,7 @@
 </file>
 
 <file path=word/styles.xml><?xml version="1.0" encoding="utf-8"?>
-<w:styles xmlns:mc="http://schemas.openxmlformats.org/markup-compatibility/2006" xmlns:r="http://schemas.openxmlformats.org/officeDocument/2006/relationships" xmlns:w="http://schemas.openxmlformats.org/wordprocessingml/2006/main" xmlns:w14="http://schemas.microsoft.com/office/word/2010/wordml" xmlns:w15="http://schemas.microsoft.com/office/word/2012/wordml" xmlns:w16cex="http://schemas.microsoft.com/office/word/2018/wordml/cex" xmlns:w16cid="http://schemas.microsoft.com/office/word/2016/wordml/cid" xmlns:w16="http://schemas.microsoft.com/office/word/2018/wordml" xmlns:w16sdtdh="http://schemas.microsoft.com/office/word/2020/wordml/sdtdatahash" xmlns:w16se="http://schemas.microsoft.com/office/word/2015/wordml/symex" mc:Ignorable="w14 w15 w16se w16cid w16 w16cex w16sdtdh">
+<w:styles xmlns:mc="http://schemas.openxmlformats.org/markup-compatibility/2006" xmlns:r="http://schemas.openxmlformats.org/officeDocument/2006/relationships" xmlns:w="http://schemas.openxmlformats.org/wordprocessingml/2006/main" xmlns:w14="http://schemas.microsoft.com/office/word/2010/wordml" xmlns:w15="http://schemas.microsoft.com/office/word/2012/wordml" mc:Ignorable="w14 w15">
   <w:docDefaults>
     <w:rPrDefault>
       <w:rPr>
@@ -11028,7 +11531,7 @@
       </w:pPr>
     </w:pPrDefault>
   </w:docDefaults>
-  <w:latentStyles w:defLockedState="0" w:defUIPriority="99" w:defSemiHidden="0" w:defUnhideWhenUsed="0" w:defQFormat="0" w:count="376">
+  <w:latentStyles w:defLockedState="0" w:defUIPriority="99" w:defSemiHidden="0" w:defUnhideWhenUsed="0" w:defQFormat="0" w:count="371">
     <w:lsdException w:name="Normal" w:uiPriority="0" w:qFormat="1"/>
     <w:lsdException w:name="heading 1" w:uiPriority="9" w:qFormat="1"/>
     <w:lsdException w:name="heading 2" w:semiHidden="1" w:uiPriority="9" w:unhideWhenUsed="1" w:qFormat="1"/>
@@ -11400,11 +11903,6 @@
     <w:lsdException w:name="List Table 5 Dark Accent 6" w:uiPriority="50"/>
     <w:lsdException w:name="List Table 6 Colorful Accent 6" w:uiPriority="51"/>
     <w:lsdException w:name="List Table 7 Colorful Accent 6" w:uiPriority="52"/>
-    <w:lsdException w:name="Mention" w:semiHidden="1" w:unhideWhenUsed="1"/>
-    <w:lsdException w:name="Smart Hyperlink" w:semiHidden="1" w:unhideWhenUsed="1"/>
-    <w:lsdException w:name="Hashtag" w:semiHidden="1" w:unhideWhenUsed="1"/>
-    <w:lsdException w:name="Unresolved Mention" w:semiHidden="1" w:unhideWhenUsed="1"/>
-    <w:lsdException w:name="Smart Link" w:semiHidden="1" w:unhideWhenUsed="1"/>
   </w:latentStyles>
   <w:style w:type="paragraph" w:default="1" w:styleId="Normal">
     <w:name w:val="Normal"/>

</xml_diff>